<commit_message>
Atualiza o documento de próximos passos com novas perguntas e ações relacionadas ao módulo financeiro, incluindo faturamento, despesas e lucro. Adiciona estrutura para simulações e comparações financeiras, além de integrar lógica de reposição e histórico de perguntas no chat. Melhora a apresentação e a clareza das informações, visando aprimorar a experiência do usuário ao consultar dados financeiros e logísticos.
</commit_message>
<xml_diff>
--- a/DOCUMENTOS/PITCH/Roteiro Duaxis - 05.09.docx
+++ b/DOCUMENTOS/PITCH/Roteiro Duaxis - 05.09.docx
@@ -71,7 +71,51 @@
           <w:sz w:val="20"/>
           <w:lang w:val="pt-BR"/>
         </w:rPr>
-        <w:t>Alinhado ao MVP real (Urban Style, 08/2023–07/2026)</w:t>
+        <w:t>Alinhado ao MVP real (</w:t>
+      </w:r>
+      <w:proofErr w:type="spellStart"/>
+      <w:r>
+        <w:rPr>
+          <w:rFonts w:ascii="Calibri" w:eastAsia="Calibri" w:hAnsi="Calibri"/>
+          <w:i/>
+          <w:color w:val="9B1C1C"/>
+          <w:sz w:val="20"/>
+          <w:lang w:val="pt-BR"/>
+        </w:rPr>
+        <w:t>Urban</w:t>
+      </w:r>
+      <w:proofErr w:type="spellEnd"/>
+      <w:r>
+        <w:rPr>
+          <w:rFonts w:ascii="Calibri" w:eastAsia="Calibri" w:hAnsi="Calibri"/>
+          <w:i/>
+          <w:color w:val="9B1C1C"/>
+          <w:sz w:val="20"/>
+          <w:lang w:val="pt-BR"/>
+        </w:rPr>
+        <w:t xml:space="preserve"> </w:t>
+      </w:r>
+      <w:proofErr w:type="spellStart"/>
+      <w:r>
+        <w:rPr>
+          <w:rFonts w:ascii="Calibri" w:eastAsia="Calibri" w:hAnsi="Calibri"/>
+          <w:i/>
+          <w:color w:val="9B1C1C"/>
+          <w:sz w:val="20"/>
+          <w:lang w:val="pt-BR"/>
+        </w:rPr>
+        <w:t>Style</w:t>
+      </w:r>
+      <w:proofErr w:type="spellEnd"/>
+      <w:r>
+        <w:rPr>
+          <w:rFonts w:ascii="Calibri" w:eastAsia="Calibri" w:hAnsi="Calibri"/>
+          <w:i/>
+          <w:color w:val="9B1C1C"/>
+          <w:sz w:val="20"/>
+          <w:lang w:val="pt-BR"/>
+        </w:rPr>
+        <w:t>, 08/2023–07/2026)</w:t>
       </w:r>
     </w:p>
     <w:p>
@@ -106,7 +150,47 @@
           <w:color w:val="4A5568"/>
           <w:lang w:val="pt-BR"/>
         </w:rPr>
-        <w:t>Texto em itálico = fala. Negrito nas falas = ênfase. Não ler os títulos em voz alta. Treinar com cronômetro. Perguntas da demo completas (mês + indicador). A trava do mundo da Urban Style é 31/07/2026.</w:t>
+        <w:t xml:space="preserve">Texto em itálico = fala. Negrito nas falas = ênfase. Não ler os títulos em voz alta. Treinar com cronômetro. Perguntas da demo completas (mês + indicador). A trava do mundo da </w:t>
+      </w:r>
+      <w:proofErr w:type="spellStart"/>
+      <w:r>
+        <w:rPr>
+          <w:rFonts w:ascii="Calibri" w:eastAsia="Calibri" w:hAnsi="Calibri"/>
+          <w:i/>
+          <w:color w:val="4A5568"/>
+          <w:lang w:val="pt-BR"/>
+        </w:rPr>
+        <w:t>Urban</w:t>
+      </w:r>
+      <w:proofErr w:type="spellEnd"/>
+      <w:r>
+        <w:rPr>
+          <w:rFonts w:ascii="Calibri" w:eastAsia="Calibri" w:hAnsi="Calibri"/>
+          <w:i/>
+          <w:color w:val="4A5568"/>
+          <w:lang w:val="pt-BR"/>
+        </w:rPr>
+        <w:t xml:space="preserve"> </w:t>
+      </w:r>
+      <w:proofErr w:type="spellStart"/>
+      <w:r>
+        <w:rPr>
+          <w:rFonts w:ascii="Calibri" w:eastAsia="Calibri" w:hAnsi="Calibri"/>
+          <w:i/>
+          <w:color w:val="4A5568"/>
+          <w:lang w:val="pt-BR"/>
+        </w:rPr>
+        <w:t>Style</w:t>
+      </w:r>
+      <w:proofErr w:type="spellEnd"/>
+      <w:r>
+        <w:rPr>
+          <w:rFonts w:ascii="Calibri" w:eastAsia="Calibri" w:hAnsi="Calibri"/>
+          <w:i/>
+          <w:color w:val="4A5568"/>
+          <w:lang w:val="pt-BR"/>
+        </w:rPr>
+        <w:t xml:space="preserve"> é 31/07/2026.</w:t>
       </w:r>
     </w:p>
     <w:p>
@@ -128,6 +212,7 @@
       <w:pPr>
         <w:spacing w:before="320" w:after="160"/>
       </w:pPr>
+      <w:proofErr w:type="spellStart"/>
       <w:r>
         <w:rPr>
           <w:rFonts w:ascii="Calibri" w:eastAsia="Calibri" w:hAnsi="Calibri"/>
@@ -135,7 +220,17 @@
           <w:color w:val="1E3A5F"/>
           <w:sz w:val="28"/>
         </w:rPr>
-        <w:t>Distribuição do tempo</w:t>
+        <w:t>Distribuição</w:t>
+      </w:r>
+      <w:proofErr w:type="spellEnd"/>
+      <w:r>
+        <w:rPr>
+          <w:rFonts w:ascii="Calibri" w:eastAsia="Calibri" w:hAnsi="Calibri"/>
+          <w:b/>
+          <w:color w:val="1E3A5F"/>
+          <w:sz w:val="28"/>
+        </w:rPr>
+        <w:t xml:space="preserve"> do tempo</w:t>
       </w:r>
     </w:p>
     <w:tbl>
@@ -156,6 +251,7 @@
             <w:shd w:val="clear" w:color="auto" w:fill="1E3A5F"/>
           </w:tcPr>
           <w:p>
+            <w:proofErr w:type="spellStart"/>
             <w:r>
               <w:rPr>
                 <w:rFonts w:ascii="Calibri" w:hAnsi="Calibri"/>
@@ -165,6 +261,7 @@
               </w:rPr>
               <w:t>Participante</w:t>
             </w:r>
+            <w:proofErr w:type="spellEnd"/>
           </w:p>
         </w:tc>
         <w:tc>
@@ -173,6 +270,7 @@
             <w:shd w:val="clear" w:color="auto" w:fill="1E3A5F"/>
           </w:tcPr>
           <w:p>
+            <w:proofErr w:type="spellStart"/>
             <w:r>
               <w:rPr>
                 <w:rFonts w:ascii="Calibri" w:hAnsi="Calibri"/>
@@ -182,6 +280,7 @@
               </w:rPr>
               <w:t>Parte</w:t>
             </w:r>
+            <w:proofErr w:type="spellEnd"/>
           </w:p>
         </w:tc>
         <w:tc>
@@ -222,13 +321,31 @@
             <w:tcW w:w="3249" w:type="dxa"/>
           </w:tcPr>
           <w:p>
+            <w:proofErr w:type="spellStart"/>
             <w:r>
               <w:rPr>
                 <w:rFonts w:ascii="Calibri" w:hAnsi="Calibri"/>
                 <w:sz w:val="20"/>
               </w:rPr>
-              <w:t>Gancho + problema</w:t>
+              <w:t>Gancho</w:t>
             </w:r>
+            <w:proofErr w:type="spellEnd"/>
+            <w:r>
+              <w:rPr>
+                <w:rFonts w:ascii="Calibri" w:hAnsi="Calibri"/>
+                <w:sz w:val="20"/>
+              </w:rPr>
+              <w:t xml:space="preserve"> + </w:t>
+            </w:r>
+            <w:proofErr w:type="spellStart"/>
+            <w:r>
+              <w:rPr>
+                <w:rFonts w:ascii="Calibri" w:hAnsi="Calibri"/>
+                <w:sz w:val="20"/>
+              </w:rPr>
+              <w:t>problema</w:t>
+            </w:r>
+            <w:proofErr w:type="spellEnd"/>
           </w:p>
         </w:tc>
         <w:tc>
@@ -271,8 +388,17 @@
                 <w:rFonts w:ascii="Calibri" w:hAnsi="Calibri"/>
                 <w:sz w:val="20"/>
               </w:rPr>
-              <w:t>Público + solução</w:t>
+              <w:t xml:space="preserve">Público + </w:t>
             </w:r>
+            <w:proofErr w:type="spellStart"/>
+            <w:r>
+              <w:rPr>
+                <w:rFonts w:ascii="Calibri" w:hAnsi="Calibri"/>
+                <w:sz w:val="20"/>
+              </w:rPr>
+              <w:t>solução</w:t>
+            </w:r>
+            <w:proofErr w:type="spellEnd"/>
           </w:p>
         </w:tc>
         <w:tc>
@@ -315,8 +441,17 @@
                 <w:rFonts w:ascii="Calibri" w:hAnsi="Calibri"/>
                 <w:sz w:val="20"/>
               </w:rPr>
-              <w:t>Dados + tecnologia</w:t>
+              <w:t xml:space="preserve">Dados + </w:t>
             </w:r>
+            <w:proofErr w:type="spellStart"/>
+            <w:r>
+              <w:rPr>
+                <w:rFonts w:ascii="Calibri" w:hAnsi="Calibri"/>
+                <w:sz w:val="20"/>
+              </w:rPr>
+              <w:t>tecnologia</w:t>
+            </w:r>
+            <w:proofErr w:type="spellEnd"/>
           </w:p>
         </w:tc>
         <w:tc>
@@ -354,13 +489,31 @@
             <w:tcW w:w="3249" w:type="dxa"/>
           </w:tcPr>
           <w:p>
+            <w:proofErr w:type="spellStart"/>
             <w:r>
               <w:rPr>
                 <w:rFonts w:ascii="Calibri" w:hAnsi="Calibri"/>
                 <w:sz w:val="20"/>
               </w:rPr>
-              <w:t>Demonstração + diferencial</w:t>
+              <w:t>Demonstração</w:t>
             </w:r>
+            <w:proofErr w:type="spellEnd"/>
+            <w:r>
+              <w:rPr>
+                <w:rFonts w:ascii="Calibri" w:hAnsi="Calibri"/>
+                <w:sz w:val="20"/>
+              </w:rPr>
+              <w:t xml:space="preserve"> + </w:t>
+            </w:r>
+            <w:proofErr w:type="spellStart"/>
+            <w:r>
+              <w:rPr>
+                <w:rFonts w:ascii="Calibri" w:hAnsi="Calibri"/>
+                <w:sz w:val="20"/>
+              </w:rPr>
+              <w:t>diferencial</w:t>
+            </w:r>
+            <w:proofErr w:type="spellEnd"/>
           </w:p>
         </w:tc>
         <w:tc>
@@ -398,13 +551,47 @@
             <w:tcW w:w="3249" w:type="dxa"/>
           </w:tcPr>
           <w:p>
+            <w:proofErr w:type="spellStart"/>
             <w:r>
               <w:rPr>
                 <w:rFonts w:ascii="Calibri" w:hAnsi="Calibri"/>
                 <w:sz w:val="20"/>
               </w:rPr>
-              <w:t>Próximos passos + fechamento</w:t>
+              <w:t>Próximos</w:t>
             </w:r>
+            <w:proofErr w:type="spellEnd"/>
+            <w:r>
+              <w:rPr>
+                <w:rFonts w:ascii="Calibri" w:hAnsi="Calibri"/>
+                <w:sz w:val="20"/>
+              </w:rPr>
+              <w:t xml:space="preserve"> </w:t>
+            </w:r>
+            <w:proofErr w:type="spellStart"/>
+            <w:r>
+              <w:rPr>
+                <w:rFonts w:ascii="Calibri" w:hAnsi="Calibri"/>
+                <w:sz w:val="20"/>
+              </w:rPr>
+              <w:t>passos</w:t>
+            </w:r>
+            <w:proofErr w:type="spellEnd"/>
+            <w:r>
+              <w:rPr>
+                <w:rFonts w:ascii="Calibri" w:hAnsi="Calibri"/>
+                <w:sz w:val="20"/>
+              </w:rPr>
+              <w:t xml:space="preserve"> + </w:t>
+            </w:r>
+            <w:proofErr w:type="spellStart"/>
+            <w:r>
+              <w:rPr>
+                <w:rFonts w:ascii="Calibri" w:hAnsi="Calibri"/>
+                <w:sz w:val="20"/>
+              </w:rPr>
+              <w:t>fechamento</w:t>
+            </w:r>
+            <w:proofErr w:type="spellEnd"/>
           </w:p>
         </w:tc>
         <w:tc>
@@ -427,6 +614,7 @@
       <w:pPr>
         <w:spacing w:before="320" w:after="160"/>
       </w:pPr>
+      <w:proofErr w:type="spellStart"/>
       <w:r>
         <w:rPr>
           <w:rFonts w:ascii="Calibri" w:eastAsia="Calibri" w:hAnsi="Calibri"/>
@@ -434,8 +622,49 @@
           <w:color w:val="1E3A5F"/>
           <w:sz w:val="32"/>
         </w:rPr>
-        <w:t>Participante 1 — Gancho + problema</w:t>
-      </w:r>
+        <w:t>Participante</w:t>
+      </w:r>
+      <w:proofErr w:type="spellEnd"/>
+      <w:r>
+        <w:rPr>
+          <w:rFonts w:ascii="Calibri" w:eastAsia="Calibri" w:hAnsi="Calibri"/>
+          <w:b/>
+          <w:color w:val="1E3A5F"/>
+          <w:sz w:val="32"/>
+        </w:rPr>
+        <w:t xml:space="preserve"> 1 — </w:t>
+      </w:r>
+      <w:proofErr w:type="spellStart"/>
+      <w:r>
+        <w:rPr>
+          <w:rFonts w:ascii="Calibri" w:eastAsia="Calibri" w:hAnsi="Calibri"/>
+          <w:b/>
+          <w:color w:val="1E3A5F"/>
+          <w:sz w:val="32"/>
+        </w:rPr>
+        <w:t>Gancho</w:t>
+      </w:r>
+      <w:proofErr w:type="spellEnd"/>
+      <w:r>
+        <w:rPr>
+          <w:rFonts w:ascii="Calibri" w:eastAsia="Calibri" w:hAnsi="Calibri"/>
+          <w:b/>
+          <w:color w:val="1E3A5F"/>
+          <w:sz w:val="32"/>
+        </w:rPr>
+        <w:t xml:space="preserve"> + </w:t>
+      </w:r>
+      <w:proofErr w:type="spellStart"/>
+      <w:r>
+        <w:rPr>
+          <w:rFonts w:ascii="Calibri" w:eastAsia="Calibri" w:hAnsi="Calibri"/>
+          <w:b/>
+          <w:color w:val="1E3A5F"/>
+          <w:sz w:val="32"/>
+        </w:rPr>
+        <w:t>problema</w:t>
+      </w:r>
+      <w:proofErr w:type="spellEnd"/>
     </w:p>
     <w:p>
       <w:pPr>
@@ -602,7 +831,27 @@
           <w:color w:val="4A5568"/>
           <w:lang w:val="pt-BR"/>
         </w:rPr>
-        <w:t>E essa é a realidade de muitas PMEs, O problema não é necessariamente a falta de dados,</w:t>
+        <w:t xml:space="preserve">E essa é a realidade de muitas </w:t>
+      </w:r>
+      <w:proofErr w:type="spellStart"/>
+      <w:r>
+        <w:rPr>
+          <w:rFonts w:ascii="Calibri" w:eastAsia="Calibri" w:hAnsi="Calibri"/>
+          <w:i/>
+          <w:color w:val="4A5568"/>
+          <w:lang w:val="pt-BR"/>
+        </w:rPr>
+        <w:t>PMEs</w:t>
+      </w:r>
+      <w:proofErr w:type="spellEnd"/>
+      <w:r>
+        <w:rPr>
+          <w:rFonts w:ascii="Calibri" w:eastAsia="Calibri" w:hAnsi="Calibri"/>
+          <w:i/>
+          <w:color w:val="4A5568"/>
+          <w:lang w:val="pt-BR"/>
+        </w:rPr>
+        <w:t>, O problema não é necessariamente a falta de dados,</w:t>
       </w:r>
       <w:r>
         <w:rPr>
@@ -1578,6 +1827,7 @@
         </w:rPr>
         <w:t xml:space="preserve"> a </w:t>
       </w:r>
+      <w:proofErr w:type="spellStart"/>
       <w:r>
         <w:rPr>
           <w:rFonts w:ascii="Calibri" w:eastAsia="Calibri" w:hAnsi="Calibri"/>
@@ -1586,8 +1836,31 @@
           <w:color w:val="4A5568"/>
           <w:lang w:val="pt-BR"/>
         </w:rPr>
-        <w:t>Urban Style</w:t>
-      </w:r>
+        <w:t>Urban</w:t>
+      </w:r>
+      <w:proofErr w:type="spellEnd"/>
+      <w:r>
+        <w:rPr>
+          <w:rFonts w:ascii="Calibri" w:eastAsia="Calibri" w:hAnsi="Calibri"/>
+          <w:b/>
+          <w:i/>
+          <w:color w:val="4A5568"/>
+          <w:lang w:val="pt-BR"/>
+        </w:rPr>
+        <w:t xml:space="preserve"> </w:t>
+      </w:r>
+      <w:proofErr w:type="spellStart"/>
+      <w:r>
+        <w:rPr>
+          <w:rFonts w:ascii="Calibri" w:eastAsia="Calibri" w:hAnsi="Calibri"/>
+          <w:b/>
+          <w:i/>
+          <w:color w:val="4A5568"/>
+          <w:lang w:val="pt-BR"/>
+        </w:rPr>
+        <w:t>Style</w:t>
+      </w:r>
+      <w:proofErr w:type="spellEnd"/>
       <w:r>
         <w:rPr>
           <w:rFonts w:ascii="Calibri" w:eastAsia="Calibri" w:hAnsi="Calibri"/>
@@ -1946,7 +2219,27 @@
           <w:color w:val="4A5568"/>
           <w:lang w:val="en"/>
         </w:rPr>
-        <w:t>campos obrigatórios;</w:t>
+        <w:t xml:space="preserve">campos </w:t>
+      </w:r>
+      <w:proofErr w:type="spellStart"/>
+      <w:r>
+        <w:rPr>
+          <w:rFonts w:ascii="Calibri" w:eastAsia="Calibri" w:hAnsi="Calibri"/>
+          <w:i/>
+          <w:color w:val="4A5568"/>
+          <w:lang w:val="en"/>
+        </w:rPr>
+        <w:t>obrigatórios</w:t>
+      </w:r>
+      <w:proofErr w:type="spellEnd"/>
+      <w:r>
+        <w:rPr>
+          <w:rFonts w:ascii="Calibri" w:eastAsia="Calibri" w:hAnsi="Calibri"/>
+          <w:i/>
+          <w:color w:val="4A5568"/>
+          <w:lang w:val="en"/>
+        </w:rPr>
+        <w:t>;</w:t>
       </w:r>
     </w:p>
     <w:p>
@@ -1963,6 +2256,7 @@
           <w:lang w:val="en"/>
         </w:rPr>
       </w:pPr>
+      <w:proofErr w:type="spellStart"/>
       <w:r>
         <w:rPr>
           <w:rFonts w:ascii="Calibri" w:eastAsia="Calibri" w:hAnsi="Calibri"/>
@@ -1970,7 +2264,17 @@
           <w:color w:val="4A5568"/>
           <w:lang w:val="en"/>
         </w:rPr>
-        <w:t>formatos;</w:t>
+        <w:t>formatos</w:t>
+      </w:r>
+      <w:proofErr w:type="spellEnd"/>
+      <w:r>
+        <w:rPr>
+          <w:rFonts w:ascii="Calibri" w:eastAsia="Calibri" w:hAnsi="Calibri"/>
+          <w:i/>
+          <w:color w:val="4A5568"/>
+          <w:lang w:val="en"/>
+        </w:rPr>
+        <w:t>;</w:t>
       </w:r>
     </w:p>
     <w:p>
@@ -1987,6 +2291,7 @@
           <w:lang w:val="en"/>
         </w:rPr>
       </w:pPr>
+      <w:proofErr w:type="spellStart"/>
       <w:r>
         <w:rPr>
           <w:rFonts w:ascii="Calibri" w:eastAsia="Calibri" w:hAnsi="Calibri"/>
@@ -1994,7 +2299,17 @@
           <w:color w:val="4A5568"/>
           <w:lang w:val="en"/>
         </w:rPr>
-        <w:t>duplicidades;</w:t>
+        <w:t>duplicidades</w:t>
+      </w:r>
+      <w:proofErr w:type="spellEnd"/>
+      <w:r>
+        <w:rPr>
+          <w:rFonts w:ascii="Calibri" w:eastAsia="Calibri" w:hAnsi="Calibri"/>
+          <w:i/>
+          <w:color w:val="4A5568"/>
+          <w:lang w:val="en"/>
+        </w:rPr>
+        <w:t>;</w:t>
       </w:r>
     </w:p>
     <w:p>
@@ -2011,6 +2326,7 @@
           <w:lang w:val="en"/>
         </w:rPr>
       </w:pPr>
+      <w:proofErr w:type="spellStart"/>
       <w:r>
         <w:rPr>
           <w:rFonts w:ascii="Calibri" w:eastAsia="Calibri" w:hAnsi="Calibri"/>
@@ -2018,7 +2334,17 @@
           <w:color w:val="4A5568"/>
           <w:lang w:val="en"/>
         </w:rPr>
-        <w:t>inconsistências;</w:t>
+        <w:t>inconsistências</w:t>
+      </w:r>
+      <w:proofErr w:type="spellEnd"/>
+      <w:r>
+        <w:rPr>
+          <w:rFonts w:ascii="Calibri" w:eastAsia="Calibri" w:hAnsi="Calibri"/>
+          <w:i/>
+          <w:color w:val="4A5568"/>
+          <w:lang w:val="en"/>
+        </w:rPr>
+        <w:t>;</w:t>
       </w:r>
     </w:p>
     <w:p>
@@ -2035,6 +2361,7 @@
           <w:lang w:val="en"/>
         </w:rPr>
       </w:pPr>
+      <w:proofErr w:type="spellStart"/>
       <w:r>
         <w:rPr>
           <w:rFonts w:ascii="Calibri" w:eastAsia="Calibri" w:hAnsi="Calibri"/>
@@ -2042,7 +2369,37 @@
           <w:color w:val="4A5568"/>
           <w:lang w:val="en"/>
         </w:rPr>
-        <w:t>atualização das informações.</w:t>
+        <w:t>atualização</w:t>
+      </w:r>
+      <w:proofErr w:type="spellEnd"/>
+      <w:r>
+        <w:rPr>
+          <w:rFonts w:ascii="Calibri" w:eastAsia="Calibri" w:hAnsi="Calibri"/>
+          <w:i/>
+          <w:color w:val="4A5568"/>
+          <w:lang w:val="en"/>
+        </w:rPr>
+        <w:t xml:space="preserve"> das </w:t>
+      </w:r>
+      <w:proofErr w:type="spellStart"/>
+      <w:r>
+        <w:rPr>
+          <w:rFonts w:ascii="Calibri" w:eastAsia="Calibri" w:hAnsi="Calibri"/>
+          <w:i/>
+          <w:color w:val="4A5568"/>
+          <w:lang w:val="en"/>
+        </w:rPr>
+        <w:t>informações</w:t>
+      </w:r>
+      <w:proofErr w:type="spellEnd"/>
+      <w:r>
+        <w:rPr>
+          <w:rFonts w:ascii="Calibri" w:eastAsia="Calibri" w:hAnsi="Calibri"/>
+          <w:i/>
+          <w:color w:val="4A5568"/>
+          <w:lang w:val="en"/>
+        </w:rPr>
+        <w:t>.</w:t>
       </w:r>
     </w:p>
     <w:p>
@@ -2315,7 +2672,7 @@
           <w:color w:val="1E3A5F"/>
           <w:lang w:val="pt-BR"/>
         </w:rPr>
-        <w:t>Este é o painel do gestor — o lugar de olhar o mês sem montar relatório. A data está em 31 de julho de 2026, o último mês fechado desta demonstração.</w:t>
+        <w:t>Este é o painel do gestor. A data está em 31 de julho de 2026, o último mês fechado desta demonstração.</w:t>
       </w:r>
     </w:p>
     <w:p>
@@ -2357,39 +2714,8 @@
           <w:color w:val="1E3A5F"/>
           <w:lang w:val="pt-BR"/>
         </w:rPr>
-        <w:t>Aqui já aparecem faturamento, lucro depois das despesas, despesas, contas a receber, clientes e estoque — o mesmo tipo de visão que muita PME busca num BI. A diferença é: isso não substitui o copiloto. O painel mostra o que aconteceu; a pergunta “por quê?” e “o que repor?” vem na conversa.</w:t>
-      </w:r>
-    </w:p>
-    <w:p>
-      <w:pPr>
-        <w:spacing w:after="160" w:line="360" w:lineRule="auto"/>
-        <w:rPr>
-          <w:rFonts w:ascii="Calibri" w:eastAsia="Calibri" w:hAnsi="Calibri"/>
-          <w:b/>
-          <w:color w:val="1E3A5F"/>
-          <w:lang w:val="pt-BR"/>
-        </w:rPr>
-      </w:pPr>
-      <w:r>
-        <w:rPr>
-          <w:rFonts w:ascii="Calibri" w:eastAsia="Calibri" w:hAnsi="Calibri"/>
-          <w:b/>
-          <w:color w:val="1E3A5F"/>
-          <w:lang w:val="pt-BR"/>
-        </w:rPr>
-        <w:t>[apontar rápido o gráfico Faturamento, sem clicar]</w:t>
-      </w:r>
-    </w:p>
-    <w:p>
-      <w:pPr>
-        <w:spacing w:after="160" w:line="360" w:lineRule="auto"/>
-        <w:rPr>
-          <w:rFonts w:ascii="Calibri" w:eastAsia="Calibri" w:hAnsi="Calibri"/>
-          <w:bCs/>
-          <w:color w:val="1E3A5F"/>
-          <w:lang w:val="pt-BR"/>
-        </w:rPr>
-      </w:pPr>
+        <w:t xml:space="preserve">Aqui já aparecem </w:t>
+      </w:r>
       <w:r>
         <w:rPr>
           <w:rFonts w:ascii="Calibri" w:eastAsia="Calibri" w:hAnsi="Calibri"/>
@@ -2399,7 +2725,18 @@
           <w:color w:val="1E3A5F"/>
           <w:lang w:val="pt-BR"/>
         </w:rPr>
-        <w:t>Embaixo, a série no tempo. Não vamos filtrar agora — o tempo está no copiloto.</w:t>
+        <w:t>alguns indicadores e abaixo alguns gráficos,</w:t>
+      </w:r>
+      <w:r>
+        <w:rPr>
+          <w:rFonts w:ascii="Calibri" w:eastAsia="Calibri" w:hAnsi="Calibri"/>
+          <w:bCs/>
+          <w:i/>
+          <w:iCs/>
+          <w:color w:val="1E3A5F"/>
+          <w:lang w:val="pt-BR"/>
+        </w:rPr>
+        <w:t xml:space="preserve"> o mesmo tipo de visão que muita PME busca num BI.</w:t>
       </w:r>
     </w:p>
     <w:p>
@@ -2463,39 +2800,9 @@
           <w:color w:val="1E3A5F"/>
           <w:lang w:val="pt-BR"/>
         </w:rPr>
-        <w:t>Aqui o gestor vê de onde o DUAXIS está lendo. Nesta versão, a Urban Style já alimenta o sistema com duas áreas: Financeiro e Logística — as duas como conectadas.</w:t>
-      </w:r>
-    </w:p>
-    <w:p>
-      <w:pPr>
-        <w:spacing w:after="160" w:line="360" w:lineRule="auto"/>
-        <w:rPr>
-          <w:rFonts w:ascii="Calibri" w:eastAsia="Calibri" w:hAnsi="Calibri"/>
-          <w:b/>
-          <w:color w:val="1E3A5F"/>
-          <w:lang w:val="pt-BR"/>
-        </w:rPr>
-      </w:pPr>
-      <w:r>
-        <w:rPr>
-          <w:rFonts w:ascii="Calibri" w:eastAsia="Calibri" w:hAnsi="Calibri"/>
-          <w:b/>
-          <w:color w:val="1E3A5F"/>
-          <w:lang w:val="pt-BR"/>
-        </w:rPr>
-        <w:t>[apontar o selo Conectado e o horário; depois a barra Qualidade dos dados]</w:t>
-      </w:r>
-    </w:p>
-    <w:p>
-      <w:pPr>
-        <w:spacing w:after="160" w:line="360" w:lineRule="auto"/>
-        <w:rPr>
-          <w:rFonts w:ascii="Calibri" w:eastAsia="Calibri" w:hAnsi="Calibri"/>
-          <w:bCs/>
-          <w:color w:val="1E3A5F"/>
-          <w:lang w:val="pt-BR"/>
-        </w:rPr>
-      </w:pPr>
+        <w:t xml:space="preserve">Aqui o gestor </w:t>
+      </w:r>
+      <w:proofErr w:type="spellStart"/>
       <w:r>
         <w:rPr>
           <w:rFonts w:ascii="Calibri" w:eastAsia="Calibri" w:hAnsi="Calibri"/>
@@ -2505,40 +2812,9 @@
           <w:color w:val="1E3A5F"/>
           <w:lang w:val="pt-BR"/>
         </w:rPr>
-        <w:lastRenderedPageBreak/>
-        <w:t>Cada fonte mostra última atualização e um índice de qualidade. É nesta tela que, no produto, entram os sistemas da empresa. Hoje a demonstração usa a base da Urban Style; o próximo passo é cada conexão real aparecer exatamente aqui.</w:t>
-      </w:r>
-    </w:p>
-    <w:p>
-      <w:pPr>
-        <w:spacing w:after="160" w:line="360" w:lineRule="auto"/>
-        <w:rPr>
-          <w:rFonts w:ascii="Calibri" w:eastAsia="Calibri" w:hAnsi="Calibri"/>
-          <w:b/>
-          <w:color w:val="1E3A5F"/>
-          <w:lang w:val="pt-BR"/>
-        </w:rPr>
-      </w:pPr>
-      <w:r>
-        <w:rPr>
-          <w:rFonts w:ascii="Calibri" w:eastAsia="Calibri" w:hAnsi="Calibri"/>
-          <w:b/>
-          <w:color w:val="1E3A5F"/>
-          <w:lang w:val="pt-BR"/>
-        </w:rPr>
-        <w:t>[não rolar para “9 fontes”; não clicar em Validar]</w:t>
-      </w:r>
-    </w:p>
-    <w:p>
-      <w:pPr>
-        <w:spacing w:after="160" w:line="360" w:lineRule="auto"/>
-        <w:rPr>
-          <w:rFonts w:ascii="Calibri" w:eastAsia="Calibri" w:hAnsi="Calibri"/>
-          <w:bCs/>
-          <w:color w:val="1E3A5F"/>
-          <w:lang w:val="pt-BR"/>
-        </w:rPr>
-      </w:pPr>
+        <w:t>vê</w:t>
+      </w:r>
+      <w:proofErr w:type="spellEnd"/>
       <w:r>
         <w:rPr>
           <w:rFonts w:ascii="Calibri" w:eastAsia="Calibri" w:hAnsi="Calibri"/>
@@ -2548,7 +2824,55 @@
           <w:color w:val="1E3A5F"/>
           <w:lang w:val="pt-BR"/>
         </w:rPr>
-        <w:t>Não vou disparar uma nova validação agora. A conferência que o gestor usa no dia a dia está em cada resposta do copiloto.</w:t>
+        <w:t xml:space="preserve"> de onde o DUAXIS está lendo. Nesta versão, a </w:t>
+      </w:r>
+      <w:proofErr w:type="spellStart"/>
+      <w:r>
+        <w:rPr>
+          <w:rFonts w:ascii="Calibri" w:eastAsia="Calibri" w:hAnsi="Calibri"/>
+          <w:bCs/>
+          <w:i/>
+          <w:iCs/>
+          <w:color w:val="1E3A5F"/>
+          <w:lang w:val="pt-BR"/>
+        </w:rPr>
+        <w:t>Urban</w:t>
+      </w:r>
+      <w:proofErr w:type="spellEnd"/>
+      <w:r>
+        <w:rPr>
+          <w:rFonts w:ascii="Calibri" w:eastAsia="Calibri" w:hAnsi="Calibri"/>
+          <w:bCs/>
+          <w:i/>
+          <w:iCs/>
+          <w:color w:val="1E3A5F"/>
+          <w:lang w:val="pt-BR"/>
+        </w:rPr>
+        <w:t xml:space="preserve"> </w:t>
+      </w:r>
+      <w:proofErr w:type="spellStart"/>
+      <w:r>
+        <w:rPr>
+          <w:rFonts w:ascii="Calibri" w:eastAsia="Calibri" w:hAnsi="Calibri"/>
+          <w:bCs/>
+          <w:i/>
+          <w:iCs/>
+          <w:color w:val="1E3A5F"/>
+          <w:lang w:val="pt-BR"/>
+        </w:rPr>
+        <w:t>Style</w:t>
+      </w:r>
+      <w:proofErr w:type="spellEnd"/>
+      <w:r>
+        <w:rPr>
+          <w:rFonts w:ascii="Calibri" w:eastAsia="Calibri" w:hAnsi="Calibri"/>
+          <w:bCs/>
+          <w:i/>
+          <w:iCs/>
+          <w:color w:val="1E3A5F"/>
+          <w:lang w:val="pt-BR"/>
+        </w:rPr>
+        <w:t xml:space="preserve"> já alimenta o sistema com duas áreas: Financeiro e Logística — as duas como conectadas.</w:t>
       </w:r>
     </w:p>
     <w:p>
@@ -2682,6 +3006,15 @@
           <w:lang w:val="pt-BR"/>
         </w:rPr>
         <w:br/>
+      </w:r>
+      <w:r>
+        <w:rPr>
+          <w:rFonts w:ascii="Calibri" w:eastAsia="Calibri" w:hAnsi="Calibri"/>
+          <w:b/>
+          <w:color w:val="1E3A5F"/>
+          <w:lang w:val="pt-BR"/>
+        </w:rPr>
+        <w:lastRenderedPageBreak/>
         <w:t> [quando aparecer: apontar o valor, depois o bloco CONFIABILIDADE DA ANÁLISE]</w:t>
       </w:r>
       <w:r>
@@ -2970,7 +3303,6 @@
           <w:sz w:val="26"/>
           <w:lang w:val="pt-BR"/>
         </w:rPr>
-        <w:lastRenderedPageBreak/>
         <w:t>Diferencial</w:t>
       </w:r>
       <w:r>
@@ -3255,6 +3587,7 @@
           <w:color w:val="4A5568"/>
           <w:lang w:val="pt-BR"/>
         </w:rPr>
+        <w:lastRenderedPageBreak/>
         <w:t>Transição: “</w:t>
       </w:r>
       <w:r>
@@ -3308,7 +3641,27 @@
           <w:color w:val="4A5568"/>
           <w:lang w:val="pt-BR"/>
         </w:rPr>
-        <w:t>Não improvisar número. Ter print ou PDF da mesma pergunta. Dizer que a demo depende do backend no ar e seguir para os próximos passos.</w:t>
+        <w:t xml:space="preserve">Não improvisar número. Ter print ou PDF da mesma pergunta. Dizer que a demo depende do </w:t>
+      </w:r>
+      <w:proofErr w:type="spellStart"/>
+      <w:r>
+        <w:rPr>
+          <w:rFonts w:ascii="Calibri" w:eastAsia="Calibri" w:hAnsi="Calibri"/>
+          <w:i/>
+          <w:color w:val="4A5568"/>
+          <w:lang w:val="pt-BR"/>
+        </w:rPr>
+        <w:t>backend</w:t>
+      </w:r>
+      <w:proofErr w:type="spellEnd"/>
+      <w:r>
+        <w:rPr>
+          <w:rFonts w:ascii="Calibri" w:eastAsia="Calibri" w:hAnsi="Calibri"/>
+          <w:i/>
+          <w:color w:val="4A5568"/>
+          <w:lang w:val="pt-BR"/>
+        </w:rPr>
+        <w:t xml:space="preserve"> no ar e seguir para os próximos passos.</w:t>
       </w:r>
     </w:p>
     <w:p>
@@ -3369,12 +3722,21 @@
         </w:rPr>
         <w:t xml:space="preserve">Slides: </w:t>
       </w:r>
-      <w:r>
-        <w:rPr>
-          <w:rFonts w:ascii="Calibri" w:eastAsia="Calibri" w:hAnsi="Calibri"/>
-          <w:lang w:val="pt-BR"/>
-        </w:rPr>
-        <w:t>roadmap curto + slogan</w:t>
+      <w:proofErr w:type="spellStart"/>
+      <w:r>
+        <w:rPr>
+          <w:rFonts w:ascii="Calibri" w:eastAsia="Calibri" w:hAnsi="Calibri"/>
+          <w:lang w:val="pt-BR"/>
+        </w:rPr>
+        <w:t>roadmap</w:t>
+      </w:r>
+      <w:proofErr w:type="spellEnd"/>
+      <w:r>
+        <w:rPr>
+          <w:rFonts w:ascii="Calibri" w:eastAsia="Calibri" w:hAnsi="Calibri"/>
+          <w:lang w:val="pt-BR"/>
+        </w:rPr>
+        <w:t xml:space="preserve"> curto + slogan</w:t>
       </w:r>
     </w:p>
     <w:p>
@@ -3501,7 +3863,6 @@
           <w:color w:val="4A5568"/>
           <w:lang w:val="pt-BR"/>
         </w:rPr>
-        <w:lastRenderedPageBreak/>
         <w:t xml:space="preserve">O objetivo é transformar essa prova de conceito em um </w:t>
       </w:r>
       <w:r>
@@ -3792,6 +4153,7 @@
                 <w:color w:val="4A5568"/>
                 <w:lang w:val="pt-BR"/>
               </w:rPr>
+              <w:lastRenderedPageBreak/>
               <w:t>Cruzamento manual</w:t>
             </w:r>
           </w:p>
@@ -5078,6 +5440,7 @@
   <w:style w:type="character" w:default="1" w:styleId="Fontepargpadro">
     <w:name w:val="Default Paragraph Font"/>
     <w:uiPriority w:val="1"/>
+    <w:semiHidden/>
     <w:unhideWhenUsed/>
   </w:style>
   <w:style w:type="table" w:default="1" w:styleId="Tabelanormal">

</xml_diff>

<commit_message>
Atualiza o roteiro de apresentação do DUAXIS, simplificando a estrutura das falas e melhorando a clareza das informações. Remove instruções desnecessárias e reorganiza o conteúdo para facilitar a compreensão durante a apresentação. Além disso, ajusta a formatação de ícones no frontend para garantir consistência visual e aprimorar a experiência do usuário ao interagir com o histórico de conversas.
</commit_message>
<xml_diff>
--- a/DOCUMENTOS/PITCH/Roteiro Duaxis - 05.09.docx
+++ b/DOCUMENTOS/PITCH/Roteiro Duaxis - 05.09.docx
@@ -4,6 +4,7 @@
   <w:body>
     <w:p>
       <w:pPr>
+        <w:spacing w:after="0" w:line="360" w:lineRule="auto"/>
         <w:jc w:val="center"/>
         <w:rPr>
           <w:lang w:val="pt-BR"/>
@@ -22,6 +23,7 @@
     </w:p>
     <w:p>
       <w:pPr>
+        <w:spacing w:after="0" w:line="360" w:lineRule="auto"/>
         <w:jc w:val="center"/>
         <w:rPr>
           <w:lang w:val="pt-BR"/>
@@ -40,7 +42,7 @@
     </w:p>
     <w:p>
       <w:pPr>
-        <w:spacing w:after="80"/>
+        <w:spacing w:after="0" w:line="360" w:lineRule="auto"/>
         <w:jc w:val="center"/>
         <w:rPr>
           <w:lang w:val="pt-BR"/>
@@ -53,11 +55,52 @@
           <w:color w:val="4A5568"/>
           <w:lang w:val="pt-BR"/>
         </w:rPr>
-        <w:t>5 participantes  ·  9 a 11 minutos  ·  banca acadêmica</w:t>
+        <w:t xml:space="preserve">5 </w:t>
+      </w:r>
+      <w:proofErr w:type="gramStart"/>
+      <w:r>
+        <w:rPr>
+          <w:rFonts w:ascii="Calibri" w:eastAsia="Calibri" w:hAnsi="Calibri"/>
+          <w:i/>
+          <w:color w:val="4A5568"/>
+          <w:lang w:val="pt-BR"/>
+        </w:rPr>
+        <w:t>participantes  ·</w:t>
+      </w:r>
+      <w:proofErr w:type="gramEnd"/>
+      <w:r>
+        <w:rPr>
+          <w:rFonts w:ascii="Calibri" w:eastAsia="Calibri" w:hAnsi="Calibri"/>
+          <w:i/>
+          <w:color w:val="4A5568"/>
+          <w:lang w:val="pt-BR"/>
+        </w:rPr>
+        <w:t xml:space="preserve">  9 a 11 </w:t>
+      </w:r>
+      <w:proofErr w:type="gramStart"/>
+      <w:r>
+        <w:rPr>
+          <w:rFonts w:ascii="Calibri" w:eastAsia="Calibri" w:hAnsi="Calibri"/>
+          <w:i/>
+          <w:color w:val="4A5568"/>
+          <w:lang w:val="pt-BR"/>
+        </w:rPr>
+        <w:t>minutos  ·</w:t>
+      </w:r>
+      <w:proofErr w:type="gramEnd"/>
+      <w:r>
+        <w:rPr>
+          <w:rFonts w:ascii="Calibri" w:eastAsia="Calibri" w:hAnsi="Calibri"/>
+          <w:i/>
+          <w:color w:val="4A5568"/>
+          <w:lang w:val="pt-BR"/>
+        </w:rPr>
+        <w:t xml:space="preserve">  banca acadêmica</w:t>
       </w:r>
     </w:p>
     <w:p>
       <w:pPr>
+        <w:spacing w:after="0" w:line="360" w:lineRule="auto"/>
         <w:jc w:val="center"/>
         <w:rPr>
           <w:lang w:val="pt-BR"/>
@@ -120,7 +163,7 @@
     </w:p>
     <w:p>
       <w:pPr>
-        <w:spacing w:before="320" w:after="160"/>
+        <w:spacing w:before="320" w:after="0" w:line="360" w:lineRule="auto"/>
         <w:rPr>
           <w:lang w:val="pt-BR"/>
         </w:rPr>
@@ -138,19 +181,19 @@
     </w:p>
     <w:p>
       <w:pPr>
-        <w:spacing w:after="160" w:line="360" w:lineRule="auto"/>
-        <w:rPr>
-          <w:lang w:val="pt-BR"/>
-        </w:rPr>
-      </w:pPr>
-      <w:r>
-        <w:rPr>
-          <w:rFonts w:ascii="Calibri" w:eastAsia="Calibri" w:hAnsi="Calibri"/>
-          <w:i/>
-          <w:color w:val="4A5568"/>
-          <w:lang w:val="pt-BR"/>
-        </w:rPr>
-        <w:t xml:space="preserve">Texto em itálico = fala. Negrito nas falas = ênfase. Não ler os títulos em voz alta. Treinar com cronômetro. Perguntas da demo completas (mês + indicador). A trava do mundo da </w:t>
+        <w:spacing w:after="0" w:line="360" w:lineRule="auto"/>
+        <w:rPr>
+          <w:lang w:val="pt-BR"/>
+        </w:rPr>
+      </w:pPr>
+      <w:r>
+        <w:rPr>
+          <w:rFonts w:ascii="Calibri" w:eastAsia="Calibri" w:hAnsi="Calibri"/>
+          <w:i/>
+          <w:color w:val="4A5568"/>
+          <w:lang w:val="pt-BR"/>
+        </w:rPr>
+        <w:t xml:space="preserve">Texto em itálico = fala. Negrito nas falas = ênfase. A trava do mundo da </w:t>
       </w:r>
       <w:proofErr w:type="spellStart"/>
       <w:r>
@@ -195,22 +238,7 @@
     </w:p>
     <w:p>
       <w:pPr>
-        <w:spacing w:after="160" w:line="360" w:lineRule="auto"/>
-        <w:rPr>
-          <w:lang w:val="pt-BR"/>
-        </w:rPr>
-      </w:pPr>
-      <w:r>
-        <w:rPr>
-          <w:rFonts w:ascii="Calibri" w:eastAsia="Calibri" w:hAnsi="Calibri"/>
-          <w:lang w:val="pt-BR"/>
-        </w:rPr>
-        <w:t>Arco: gancho → problema → público → solução → como funciona → demonstração → diferencial → próximos passos → fechamento.</w:t>
-      </w:r>
-    </w:p>
-    <w:p>
-      <w:pPr>
-        <w:spacing w:before="320" w:after="160"/>
+        <w:spacing w:before="320" w:after="0" w:line="360" w:lineRule="auto"/>
       </w:pPr>
       <w:proofErr w:type="spellStart"/>
       <w:r>
@@ -251,6 +279,9 @@
             <w:shd w:val="clear" w:color="auto" w:fill="1E3A5F"/>
           </w:tcPr>
           <w:p>
+            <w:pPr>
+              <w:spacing w:line="360" w:lineRule="auto"/>
+            </w:pPr>
             <w:proofErr w:type="spellStart"/>
             <w:r>
               <w:rPr>
@@ -270,6 +301,9 @@
             <w:shd w:val="clear" w:color="auto" w:fill="1E3A5F"/>
           </w:tcPr>
           <w:p>
+            <w:pPr>
+              <w:spacing w:line="360" w:lineRule="auto"/>
+            </w:pPr>
             <w:proofErr w:type="spellStart"/>
             <w:r>
               <w:rPr>
@@ -289,6 +323,9 @@
             <w:shd w:val="clear" w:color="auto" w:fill="1E3A5F"/>
           </w:tcPr>
           <w:p>
+            <w:pPr>
+              <w:spacing w:line="360" w:lineRule="auto"/>
+            </w:pPr>
             <w:r>
               <w:rPr>
                 <w:rFonts w:ascii="Calibri" w:hAnsi="Calibri"/>
@@ -307,6 +344,9 @@
             <w:tcW w:w="3249" w:type="dxa"/>
           </w:tcPr>
           <w:p>
+            <w:pPr>
+              <w:spacing w:line="360" w:lineRule="auto"/>
+            </w:pPr>
             <w:r>
               <w:rPr>
                 <w:rFonts w:ascii="Calibri" w:hAnsi="Calibri"/>
@@ -321,6 +361,9 @@
             <w:tcW w:w="3249" w:type="dxa"/>
           </w:tcPr>
           <w:p>
+            <w:pPr>
+              <w:spacing w:line="360" w:lineRule="auto"/>
+            </w:pPr>
             <w:proofErr w:type="spellStart"/>
             <w:r>
               <w:rPr>
@@ -353,6 +396,9 @@
             <w:tcW w:w="3249" w:type="dxa"/>
           </w:tcPr>
           <w:p>
+            <w:pPr>
+              <w:spacing w:line="360" w:lineRule="auto"/>
+            </w:pPr>
             <w:r>
               <w:rPr>
                 <w:rFonts w:ascii="Calibri" w:hAnsi="Calibri"/>
@@ -369,6 +415,9 @@
             <w:tcW w:w="3249" w:type="dxa"/>
           </w:tcPr>
           <w:p>
+            <w:pPr>
+              <w:spacing w:line="360" w:lineRule="auto"/>
+            </w:pPr>
             <w:r>
               <w:rPr>
                 <w:rFonts w:ascii="Calibri" w:hAnsi="Calibri"/>
@@ -383,6 +432,9 @@
             <w:tcW w:w="3249" w:type="dxa"/>
           </w:tcPr>
           <w:p>
+            <w:pPr>
+              <w:spacing w:line="360" w:lineRule="auto"/>
+            </w:pPr>
             <w:r>
               <w:rPr>
                 <w:rFonts w:ascii="Calibri" w:hAnsi="Calibri"/>
@@ -406,6 +458,9 @@
             <w:tcW w:w="3249" w:type="dxa"/>
           </w:tcPr>
           <w:p>
+            <w:pPr>
+              <w:spacing w:line="360" w:lineRule="auto"/>
+            </w:pPr>
             <w:r>
               <w:rPr>
                 <w:rFonts w:ascii="Calibri" w:hAnsi="Calibri"/>
@@ -422,6 +477,9 @@
             <w:tcW w:w="3249" w:type="dxa"/>
           </w:tcPr>
           <w:p>
+            <w:pPr>
+              <w:spacing w:line="360" w:lineRule="auto"/>
+            </w:pPr>
             <w:r>
               <w:rPr>
                 <w:rFonts w:ascii="Calibri" w:hAnsi="Calibri"/>
@@ -436,6 +494,9 @@
             <w:tcW w:w="3249" w:type="dxa"/>
           </w:tcPr>
           <w:p>
+            <w:pPr>
+              <w:spacing w:line="360" w:lineRule="auto"/>
+            </w:pPr>
             <w:r>
               <w:rPr>
                 <w:rFonts w:ascii="Calibri" w:hAnsi="Calibri"/>
@@ -459,6 +520,9 @@
             <w:tcW w:w="3249" w:type="dxa"/>
           </w:tcPr>
           <w:p>
+            <w:pPr>
+              <w:spacing w:line="360" w:lineRule="auto"/>
+            </w:pPr>
             <w:r>
               <w:rPr>
                 <w:rFonts w:ascii="Calibri" w:hAnsi="Calibri"/>
@@ -475,6 +539,9 @@
             <w:tcW w:w="3249" w:type="dxa"/>
           </w:tcPr>
           <w:p>
+            <w:pPr>
+              <w:spacing w:line="360" w:lineRule="auto"/>
+            </w:pPr>
             <w:r>
               <w:rPr>
                 <w:rFonts w:ascii="Calibri" w:hAnsi="Calibri"/>
@@ -489,6 +556,9 @@
             <w:tcW w:w="3249" w:type="dxa"/>
           </w:tcPr>
           <w:p>
+            <w:pPr>
+              <w:spacing w:line="360" w:lineRule="auto"/>
+            </w:pPr>
             <w:proofErr w:type="spellStart"/>
             <w:r>
               <w:rPr>
@@ -521,6 +591,9 @@
             <w:tcW w:w="3249" w:type="dxa"/>
           </w:tcPr>
           <w:p>
+            <w:pPr>
+              <w:spacing w:line="360" w:lineRule="auto"/>
+            </w:pPr>
             <w:r>
               <w:rPr>
                 <w:rFonts w:ascii="Calibri" w:hAnsi="Calibri"/>
@@ -537,6 +610,9 @@
             <w:tcW w:w="3249" w:type="dxa"/>
           </w:tcPr>
           <w:p>
+            <w:pPr>
+              <w:spacing w:line="360" w:lineRule="auto"/>
+            </w:pPr>
             <w:r>
               <w:rPr>
                 <w:rFonts w:ascii="Calibri" w:hAnsi="Calibri"/>
@@ -551,6 +627,9 @@
             <w:tcW w:w="3249" w:type="dxa"/>
           </w:tcPr>
           <w:p>
+            <w:pPr>
+              <w:spacing w:line="360" w:lineRule="auto"/>
+            </w:pPr>
             <w:proofErr w:type="spellStart"/>
             <w:r>
               <w:rPr>
@@ -599,6 +678,9 @@
             <w:tcW w:w="3249" w:type="dxa"/>
           </w:tcPr>
           <w:p>
+            <w:pPr>
+              <w:spacing w:line="360" w:lineRule="auto"/>
+            </w:pPr>
             <w:r>
               <w:rPr>
                 <w:rFonts w:ascii="Calibri" w:hAnsi="Calibri"/>
@@ -612,7 +694,7 @@
     </w:tbl>
     <w:p>
       <w:pPr>
-        <w:spacing w:before="320" w:after="160"/>
+        <w:spacing w:before="320" w:after="0" w:line="360" w:lineRule="auto"/>
       </w:pPr>
       <w:proofErr w:type="spellStart"/>
       <w:r>
@@ -668,7 +750,7 @@
     </w:p>
     <w:p>
       <w:pPr>
-        <w:spacing w:after="80"/>
+        <w:spacing w:after="0" w:line="360" w:lineRule="auto"/>
         <w:rPr>
           <w:lang w:val="pt-BR"/>
         </w:rPr>
@@ -692,7 +774,7 @@
     </w:p>
     <w:p>
       <w:pPr>
-        <w:spacing w:after="80"/>
+        <w:spacing w:after="0" w:line="360" w:lineRule="auto"/>
         <w:rPr>
           <w:lang w:val="pt-BR"/>
         </w:rPr>
@@ -716,7 +798,7 @@
     </w:p>
     <w:p>
       <w:pPr>
-        <w:spacing w:before="240" w:after="120"/>
+        <w:spacing w:before="240" w:after="0" w:line="360" w:lineRule="auto"/>
         <w:rPr>
           <w:lang w:val="pt-BR"/>
         </w:rPr>
@@ -729,24 +811,141 @@
           <w:sz w:val="26"/>
           <w:lang w:val="pt-BR"/>
         </w:rPr>
-        <w:t>Fala</w:t>
+        <w:t xml:space="preserve">Gancho: </w:t>
+      </w:r>
+      <w:r>
+        <w:rPr>
+          <w:rFonts w:ascii="Calibri" w:eastAsia="Calibri" w:hAnsi="Calibri"/>
+          <w:i/>
+          <w:color w:val="4A5568"/>
+          <w:lang w:val="pt-BR"/>
+        </w:rPr>
+        <w:t xml:space="preserve">Imagine que o mês termina e você recebe uma notícia: </w:t>
+      </w:r>
+      <w:r>
+        <w:rPr>
+          <w:rFonts w:ascii="Calibri" w:eastAsia="Calibri" w:hAnsi="Calibri"/>
+          <w:b/>
+          <w:bCs/>
+          <w:i/>
+          <w:color w:val="4A5568"/>
+          <w:lang w:val="pt-BR"/>
+        </w:rPr>
+        <w:t>o faturamento da sua empresa caiu 18%.</w:t>
+      </w:r>
+      <w:r>
+        <w:rPr>
+          <w:rFonts w:ascii="Calibri" w:eastAsia="Calibri" w:hAnsi="Calibri"/>
+          <w:i/>
+          <w:color w:val="4A5568"/>
+          <w:lang w:val="pt-BR"/>
+        </w:rPr>
+        <w:t xml:space="preserve"> O instinto empreendedor fala mais alto e você precisa agir rápido. Mas, para </w:t>
+      </w:r>
+      <w:r>
+        <w:rPr>
+          <w:rFonts w:ascii="Calibri" w:eastAsia="Calibri" w:hAnsi="Calibri"/>
+          <w:i/>
+          <w:color w:val="4A5568"/>
+          <w:lang w:val="pt-BR"/>
+        </w:rPr>
+        <w:t>entender</w:t>
+      </w:r>
+      <w:r>
+        <w:rPr>
+          <w:rFonts w:ascii="Calibri" w:eastAsia="Calibri" w:hAnsi="Calibri"/>
+          <w:i/>
+          <w:color w:val="4A5568"/>
+          <w:lang w:val="pt-BR"/>
+        </w:rPr>
+        <w:t xml:space="preserve"> o que aconteceu, é necessário entrar em diferentes sistemas, consultar planilhas e cruzar todas essas informações. Enquanto </w:t>
+      </w:r>
+      <w:r>
+        <w:rPr>
+          <w:rFonts w:ascii="Calibri" w:eastAsia="Calibri" w:hAnsi="Calibri"/>
+          <w:i/>
+          <w:color w:val="4A5568"/>
+          <w:lang w:val="pt-BR"/>
+        </w:rPr>
+        <w:t>você</w:t>
+      </w:r>
+      <w:r>
+        <w:rPr>
+          <w:rFonts w:ascii="Calibri" w:eastAsia="Calibri" w:hAnsi="Calibri"/>
+          <w:i/>
+          <w:color w:val="4A5568"/>
+          <w:lang w:val="pt-BR"/>
+        </w:rPr>
+        <w:t xml:space="preserve"> procura, o tempo da decisão passa.</w:t>
       </w:r>
     </w:p>
     <w:p>
       <w:pPr>
-        <w:spacing w:after="160" w:line="360" w:lineRule="auto"/>
-        <w:rPr>
-          <w:lang w:val="pt-BR"/>
-        </w:rPr>
-      </w:pPr>
-      <w:r>
-        <w:rPr>
-          <w:rFonts w:ascii="Calibri" w:eastAsia="Calibri" w:hAnsi="Calibri"/>
-          <w:i/>
-          <w:color w:val="4A5568"/>
-          <w:lang w:val="pt-BR"/>
-        </w:rPr>
-        <w:t xml:space="preserve">Imagine que o mês termina e você recebe uma notícia: </w:t>
+        <w:spacing w:after="0" w:line="360" w:lineRule="auto"/>
+        <w:rPr>
+          <w:rFonts w:ascii="Calibri" w:eastAsia="Calibri" w:hAnsi="Calibri"/>
+          <w:i/>
+          <w:color w:val="4A5568"/>
+          <w:lang w:val="pt-BR"/>
+        </w:rPr>
+      </w:pPr>
+      <w:r>
+        <w:rPr>
+          <w:rFonts w:ascii="Calibri" w:eastAsia="Calibri" w:hAnsi="Calibri"/>
+          <w:b/>
+          <w:color w:val="1E3A5F"/>
+          <w:sz w:val="26"/>
+          <w:lang w:val="pt-BR"/>
+        </w:rPr>
+        <w:t>Problema</w:t>
+      </w:r>
+      <w:r>
+        <w:rPr>
+          <w:rFonts w:ascii="Calibri" w:eastAsia="Calibri" w:hAnsi="Calibri"/>
+          <w:b/>
+          <w:color w:val="1E3A5F"/>
+          <w:sz w:val="26"/>
+          <w:lang w:val="pt-BR"/>
+        </w:rPr>
+        <w:t>:</w:t>
+      </w:r>
+      <w:r>
+        <w:rPr>
+          <w:rFonts w:ascii="Calibri" w:eastAsia="Calibri" w:hAnsi="Calibri"/>
+          <w:i/>
+          <w:color w:val="4A5568"/>
+          <w:lang w:val="pt-BR"/>
+        </w:rPr>
+        <w:t xml:space="preserve"> </w:t>
+      </w:r>
+      <w:r>
+        <w:rPr>
+          <w:rFonts w:ascii="Calibri" w:eastAsia="Calibri" w:hAnsi="Calibri"/>
+          <w:i/>
+          <w:color w:val="4A5568"/>
+          <w:lang w:val="pt-BR"/>
+        </w:rPr>
+        <w:t xml:space="preserve">E essa é a realidade de muitas </w:t>
+      </w:r>
+      <w:proofErr w:type="spellStart"/>
+      <w:r>
+        <w:rPr>
+          <w:rFonts w:ascii="Calibri" w:eastAsia="Calibri" w:hAnsi="Calibri"/>
+          <w:i/>
+          <w:color w:val="4A5568"/>
+          <w:lang w:val="pt-BR"/>
+        </w:rPr>
+        <w:t>PMEs</w:t>
+      </w:r>
+      <w:proofErr w:type="spellEnd"/>
+      <w:r>
+        <w:rPr>
+          <w:rFonts w:ascii="Calibri" w:eastAsia="Calibri" w:hAnsi="Calibri"/>
+          <w:i/>
+          <w:color w:val="4A5568"/>
+          <w:lang w:val="pt-BR"/>
+        </w:rPr>
+        <w:t>, O problema não é necessariamente a falta de dados,</w:t>
       </w:r>
       <w:r>
         <w:rPr>
@@ -757,101 +956,239 @@
           <w:color w:val="4A5568"/>
           <w:lang w:val="pt-BR"/>
         </w:rPr>
-        <w:t>o faturamento da sua empresa caiu 18%.</w:t>
-      </w:r>
-      <w:r>
-        <w:rPr>
-          <w:rFonts w:ascii="Calibri" w:eastAsia="Calibri" w:hAnsi="Calibri"/>
-          <w:i/>
-          <w:color w:val="4A5568"/>
-          <w:lang w:val="pt-BR"/>
-        </w:rPr>
-        <w:t xml:space="preserve"> O instinto empreendedor fala mais alto e você precisa agir rápido. Mas, para </w:t>
-      </w:r>
-      <w:r>
-        <w:rPr>
-          <w:rFonts w:ascii="Calibri" w:eastAsia="Calibri" w:hAnsi="Calibri"/>
-          <w:i/>
-          <w:color w:val="4A5568"/>
-          <w:lang w:val="pt-BR"/>
-        </w:rPr>
-        <w:t>entender</w:t>
-      </w:r>
-      <w:r>
-        <w:rPr>
-          <w:rFonts w:ascii="Calibri" w:eastAsia="Calibri" w:hAnsi="Calibri"/>
-          <w:i/>
-          <w:color w:val="4A5568"/>
-          <w:lang w:val="pt-BR"/>
-        </w:rPr>
-        <w:t xml:space="preserve"> o que aconteceu, é necessário entrar em diferentes sistemas, consultar planilhas e cruzar todas essas informações. Enquanto </w:t>
-      </w:r>
-      <w:r>
-        <w:rPr>
-          <w:rFonts w:ascii="Calibri" w:eastAsia="Calibri" w:hAnsi="Calibri"/>
-          <w:i/>
-          <w:color w:val="4A5568"/>
-          <w:lang w:val="pt-BR"/>
-        </w:rPr>
-        <w:t>você</w:t>
-      </w:r>
-      <w:r>
-        <w:rPr>
-          <w:rFonts w:ascii="Calibri" w:eastAsia="Calibri" w:hAnsi="Calibri"/>
-          <w:i/>
-          <w:color w:val="4A5568"/>
-          <w:lang w:val="pt-BR"/>
-        </w:rPr>
-        <w:t xml:space="preserve"> procura, o tempo da decisão passa.</w:t>
+        <w:t xml:space="preserve"> eles</w:t>
+      </w:r>
+      <w:r>
+        <w:rPr>
+          <w:rFonts w:ascii="Calibri" w:eastAsia="Calibri" w:hAnsi="Calibri"/>
+          <w:i/>
+          <w:color w:val="4A5568"/>
+          <w:lang w:val="pt-BR"/>
+        </w:rPr>
+        <w:t xml:space="preserve"> </w:t>
+      </w:r>
+      <w:r>
+        <w:rPr>
+          <w:rFonts w:ascii="Calibri" w:eastAsia="Calibri" w:hAnsi="Calibri"/>
+          <w:b/>
+          <w:i/>
+          <w:color w:val="4A5568"/>
+          <w:lang w:val="pt-BR"/>
+        </w:rPr>
+        <w:t>existem</w:t>
+      </w:r>
+      <w:r>
+        <w:rPr>
+          <w:rFonts w:ascii="Calibri" w:eastAsia="Calibri" w:hAnsi="Calibri"/>
+          <w:i/>
+          <w:color w:val="4A5568"/>
+          <w:lang w:val="pt-BR"/>
+        </w:rPr>
+        <w:t xml:space="preserve"> — vendas, estoque, compras, financeiro</w:t>
+      </w:r>
+      <w:r>
+        <w:rPr>
+          <w:rFonts w:ascii="Calibri" w:eastAsia="Calibri" w:hAnsi="Calibri"/>
+          <w:i/>
+          <w:color w:val="4A5568"/>
+          <w:lang w:val="pt-BR"/>
+        </w:rPr>
+        <w:t>, RH</w:t>
+      </w:r>
+      <w:r>
+        <w:rPr>
+          <w:rFonts w:ascii="Calibri" w:eastAsia="Calibri" w:hAnsi="Calibri"/>
+          <w:i/>
+          <w:color w:val="4A5568"/>
+          <w:lang w:val="pt-BR"/>
+        </w:rPr>
+        <w:t xml:space="preserve"> — mas estão </w:t>
+      </w:r>
+      <w:r>
+        <w:rPr>
+          <w:rFonts w:ascii="Calibri" w:eastAsia="Calibri" w:hAnsi="Calibri"/>
+          <w:b/>
+          <w:i/>
+          <w:color w:val="4A5568"/>
+          <w:lang w:val="pt-BR"/>
+        </w:rPr>
+        <w:t>espalhados</w:t>
+      </w:r>
+      <w:r>
+        <w:rPr>
+          <w:rFonts w:ascii="Calibri" w:eastAsia="Calibri" w:hAnsi="Calibri"/>
+          <w:i/>
+          <w:color w:val="4A5568"/>
+          <w:lang w:val="pt-BR"/>
+        </w:rPr>
+        <w:t>. O gargalo não é “não ter número”. É o caminho longo até transformar número em decisão.</w:t>
       </w:r>
     </w:p>
     <w:p>
       <w:pPr>
-        <w:spacing w:after="160" w:line="360" w:lineRule="auto"/>
-        <w:rPr>
-          <w:rFonts w:ascii="Calibri" w:eastAsia="Calibri" w:hAnsi="Calibri"/>
-          <w:i/>
-          <w:color w:val="4A5568"/>
-          <w:lang w:val="pt-BR"/>
-        </w:rPr>
-      </w:pPr>
-      <w:r>
-        <w:rPr>
-          <w:rFonts w:ascii="Calibri" w:eastAsia="Calibri" w:hAnsi="Calibri"/>
-          <w:i/>
-          <w:color w:val="4A5568"/>
-          <w:lang w:val="pt-BR"/>
-        </w:rPr>
-        <w:t xml:space="preserve">Problema: </w:t>
-      </w:r>
-      <w:r>
-        <w:rPr>
-          <w:rFonts w:ascii="Calibri" w:eastAsia="Calibri" w:hAnsi="Calibri"/>
-          <w:i/>
-          <w:color w:val="4A5568"/>
-          <w:lang w:val="pt-BR"/>
-        </w:rPr>
-        <w:t xml:space="preserve">E essa é a realidade de muitas </w:t>
-      </w:r>
-      <w:proofErr w:type="spellStart"/>
-      <w:r>
-        <w:rPr>
-          <w:rFonts w:ascii="Calibri" w:eastAsia="Calibri" w:hAnsi="Calibri"/>
-          <w:i/>
-          <w:color w:val="4A5568"/>
-          <w:lang w:val="pt-BR"/>
-        </w:rPr>
-        <w:t>PMEs</w:t>
-      </w:r>
-      <w:proofErr w:type="spellEnd"/>
-      <w:r>
-        <w:rPr>
-          <w:rFonts w:ascii="Calibri" w:eastAsia="Calibri" w:hAnsi="Calibri"/>
-          <w:i/>
-          <w:color w:val="4A5568"/>
-          <w:lang w:val="pt-BR"/>
-        </w:rPr>
-        <w:t>, O problema não é necessariamente a falta de dados,</w:t>
+        <w:spacing w:after="0" w:line="360" w:lineRule="auto"/>
+        <w:rPr>
+          <w:rFonts w:ascii="Calibri" w:eastAsia="Calibri" w:hAnsi="Calibri"/>
+          <w:bCs/>
+          <w:i/>
+          <w:color w:val="4A5568"/>
+          <w:lang w:val="pt-BR"/>
+        </w:rPr>
+      </w:pPr>
+      <w:r>
+        <w:rPr>
+          <w:rFonts w:ascii="Calibri" w:eastAsia="Calibri" w:hAnsi="Calibri"/>
+          <w:bCs/>
+          <w:i/>
+          <w:color w:val="4A5568"/>
+          <w:lang w:val="pt-BR"/>
+        </w:rPr>
+        <w:t>E esse cenário também aparece nos dados do Sebrae:</w:t>
+      </w:r>
+      <w:r>
+        <w:rPr>
+          <w:rFonts w:ascii="Calibri" w:eastAsia="Calibri" w:hAnsi="Calibri"/>
+          <w:bCs/>
+          <w:i/>
+          <w:color w:val="4A5568"/>
+          <w:lang w:val="pt-BR"/>
+        </w:rPr>
+        <w:t xml:space="preserve"> uma pesquisa de</w:t>
+      </w:r>
+      <w:r>
+        <w:rPr>
+          <w:rFonts w:ascii="Calibri" w:eastAsia="Calibri" w:hAnsi="Calibri"/>
+          <w:bCs/>
+          <w:i/>
+          <w:color w:val="4A5568"/>
+          <w:lang w:val="pt-BR"/>
+        </w:rPr>
+        <w:t xml:space="preserve"> 2025,</w:t>
+      </w:r>
+      <w:r>
+        <w:rPr>
+          <w:rFonts w:ascii="Calibri" w:eastAsia="Calibri" w:hAnsi="Calibri"/>
+          <w:bCs/>
+          <w:i/>
+          <w:color w:val="4A5568"/>
+          <w:lang w:val="pt-BR"/>
+        </w:rPr>
+        <w:t xml:space="preserve"> aponta que</w:t>
+      </w:r>
+      <w:r>
+        <w:rPr>
+          <w:rFonts w:ascii="Calibri" w:eastAsia="Calibri" w:hAnsi="Calibri"/>
+          <w:bCs/>
+          <w:i/>
+          <w:color w:val="4A5568"/>
+          <w:lang w:val="pt-BR"/>
+        </w:rPr>
+        <w:t xml:space="preserve"> 47% dos pequenos negócios </w:t>
+      </w:r>
+      <w:r>
+        <w:rPr>
+          <w:rFonts w:ascii="Calibri" w:eastAsia="Calibri" w:hAnsi="Calibri"/>
+          <w:bCs/>
+          <w:i/>
+          <w:color w:val="4A5568"/>
+          <w:lang w:val="pt-BR"/>
+        </w:rPr>
+        <w:t xml:space="preserve">já usam software de gestão. Ou seja: já há ferramenta e dado; falta um copiloto que interprete sem substituir </w:t>
+      </w:r>
+      <w:r>
+        <w:rPr>
+          <w:rFonts w:ascii="Calibri" w:eastAsia="Calibri" w:hAnsi="Calibri"/>
+          <w:bCs/>
+          <w:i/>
+          <w:color w:val="4A5568"/>
+          <w:lang w:val="pt-BR"/>
+        </w:rPr>
+        <w:t>os sistema</w:t>
+      </w:r>
+      <w:r>
+        <w:rPr>
+          <w:rFonts w:ascii="Calibri" w:eastAsia="Calibri" w:hAnsi="Calibri"/>
+          <w:bCs/>
+          <w:i/>
+          <w:color w:val="4A5568"/>
+          <w:lang w:val="pt-BR"/>
+        </w:rPr>
+        <w:t>s</w:t>
+      </w:r>
+      <w:r>
+        <w:rPr>
+          <w:rFonts w:ascii="Calibri" w:eastAsia="Calibri" w:hAnsi="Calibri"/>
+          <w:bCs/>
+          <w:i/>
+          <w:color w:val="4A5568"/>
+          <w:lang w:val="pt-BR"/>
+        </w:rPr>
+        <w:t xml:space="preserve"> de gestão que a empresa já usa</w:t>
+      </w:r>
+      <w:r>
+        <w:rPr>
+          <w:rFonts w:ascii="Calibri" w:eastAsia="Calibri" w:hAnsi="Calibri"/>
+          <w:bCs/>
+          <w:i/>
+          <w:color w:val="4A5568"/>
+          <w:lang w:val="pt-BR"/>
+        </w:rPr>
+        <w:t>.</w:t>
+      </w:r>
+    </w:p>
+    <w:p>
+      <w:pPr>
+        <w:spacing w:after="0" w:line="360" w:lineRule="auto"/>
+        <w:rPr>
+          <w:rFonts w:ascii="Calibri" w:eastAsia="Calibri" w:hAnsi="Calibri"/>
+          <w:i/>
+          <w:color w:val="4A5568"/>
+          <w:lang w:val="pt-BR"/>
+        </w:rPr>
+      </w:pPr>
+      <w:r>
+        <w:rPr>
+          <w:rFonts w:ascii="Calibri" w:eastAsia="Calibri" w:hAnsi="Calibri"/>
+          <w:i/>
+          <w:color w:val="4A5568"/>
+          <w:lang w:val="pt-BR"/>
+        </w:rPr>
+        <w:t>É justamente essa distância entre os dados disponíveis e a decisão do gestor que o DUAXIS busca reduzir</w:t>
+      </w:r>
+      <w:r>
+        <w:rPr>
+          <w:rFonts w:ascii="Calibri" w:eastAsia="Calibri" w:hAnsi="Calibri"/>
+          <w:i/>
+          <w:color w:val="4A5568"/>
+          <w:lang w:val="pt-BR"/>
+        </w:rPr>
+        <w:t>.</w:t>
+      </w:r>
+      <w:r>
+        <w:rPr>
+          <w:rFonts w:ascii="Calibri" w:eastAsia="Calibri" w:hAnsi="Calibri"/>
+          <w:i/>
+          <w:color w:val="4A5568"/>
+          <w:lang w:val="pt-BR"/>
+        </w:rPr>
+        <w:t xml:space="preserve"> </w:t>
+      </w:r>
+    </w:p>
+    <w:p>
+      <w:pPr>
+        <w:spacing w:after="0" w:line="360" w:lineRule="auto"/>
+        <w:rPr>
+          <w:lang w:val="pt-BR"/>
+        </w:rPr>
+      </w:pPr>
+      <w:r>
+        <w:rPr>
+          <w:rFonts w:ascii="Calibri" w:eastAsia="Calibri" w:hAnsi="Calibri"/>
+          <w:i/>
+          <w:color w:val="4A5568"/>
+          <w:lang w:val="pt-BR"/>
+        </w:rPr>
+        <w:t>Transição: “</w:t>
       </w:r>
       <w:r>
         <w:rPr>
@@ -862,265 +1199,21 @@
           <w:color w:val="4A5568"/>
           <w:lang w:val="pt-BR"/>
         </w:rPr>
-        <w:t xml:space="preserve"> eles</w:t>
-      </w:r>
-      <w:r>
-        <w:rPr>
-          <w:rFonts w:ascii="Calibri" w:eastAsia="Calibri" w:hAnsi="Calibri"/>
-          <w:i/>
-          <w:color w:val="4A5568"/>
-          <w:lang w:val="pt-BR"/>
-        </w:rPr>
-        <w:t xml:space="preserve"> </w:t>
-      </w:r>
-      <w:r>
-        <w:rPr>
-          <w:rFonts w:ascii="Calibri" w:eastAsia="Calibri" w:hAnsi="Calibri"/>
-          <w:b/>
-          <w:i/>
-          <w:color w:val="4A5568"/>
-          <w:lang w:val="pt-BR"/>
-        </w:rPr>
-        <w:t>existem</w:t>
-      </w:r>
-      <w:r>
-        <w:rPr>
-          <w:rFonts w:ascii="Calibri" w:eastAsia="Calibri" w:hAnsi="Calibri"/>
-          <w:i/>
-          <w:color w:val="4A5568"/>
-          <w:lang w:val="pt-BR"/>
-        </w:rPr>
-        <w:t xml:space="preserve"> — vendas, estoque, compras, financeiro</w:t>
-      </w:r>
-      <w:r>
-        <w:rPr>
-          <w:rFonts w:ascii="Calibri" w:eastAsia="Calibri" w:hAnsi="Calibri"/>
-          <w:i/>
-          <w:color w:val="4A5568"/>
-          <w:lang w:val="pt-BR"/>
-        </w:rPr>
-        <w:t>, RH</w:t>
-      </w:r>
-      <w:r>
-        <w:rPr>
-          <w:rFonts w:ascii="Calibri" w:eastAsia="Calibri" w:hAnsi="Calibri"/>
-          <w:i/>
-          <w:color w:val="4A5568"/>
-          <w:lang w:val="pt-BR"/>
-        </w:rPr>
-        <w:t xml:space="preserve"> — mas estão </w:t>
-      </w:r>
-      <w:r>
-        <w:rPr>
-          <w:rFonts w:ascii="Calibri" w:eastAsia="Calibri" w:hAnsi="Calibri"/>
-          <w:b/>
-          <w:i/>
-          <w:color w:val="4A5568"/>
-          <w:lang w:val="pt-BR"/>
-        </w:rPr>
-        <w:t>espalhados</w:t>
-      </w:r>
-      <w:r>
-        <w:rPr>
-          <w:rFonts w:ascii="Calibri" w:eastAsia="Calibri" w:hAnsi="Calibri"/>
-          <w:i/>
-          <w:color w:val="4A5568"/>
-          <w:lang w:val="pt-BR"/>
-        </w:rPr>
-        <w:t>. O gargalo não é “não ter número”. É o caminho longo até transformar número em decisão.</w:t>
+        <w:t>Mas quem exatamente enfrenta esse problema e como o DUAXIS entra nessa realidade?</w:t>
+      </w:r>
+      <w:r>
+        <w:rPr>
+          <w:rFonts w:ascii="Calibri" w:eastAsia="Calibri" w:hAnsi="Calibri"/>
+          <w:i/>
+          <w:color w:val="4A5568"/>
+          <w:lang w:val="pt-BR"/>
+        </w:rPr>
+        <w:t>”</w:t>
       </w:r>
     </w:p>
     <w:p>
       <w:pPr>
-        <w:spacing w:after="160" w:line="360" w:lineRule="auto"/>
-        <w:rPr>
-          <w:rFonts w:ascii="Calibri" w:eastAsia="Calibri" w:hAnsi="Calibri"/>
-          <w:bCs/>
-          <w:i/>
-          <w:color w:val="4A5568"/>
-          <w:lang w:val="pt-BR"/>
-        </w:rPr>
-      </w:pPr>
-      <w:r>
-        <w:rPr>
-          <w:rFonts w:ascii="Calibri" w:eastAsia="Calibri" w:hAnsi="Calibri"/>
-          <w:bCs/>
-          <w:i/>
-          <w:color w:val="4A5568"/>
-          <w:lang w:val="pt-BR"/>
-        </w:rPr>
-        <w:lastRenderedPageBreak/>
-        <w:t>E esse cenário também aparece nos dados do Sebrae:</w:t>
-      </w:r>
-      <w:r>
-        <w:rPr>
-          <w:rFonts w:ascii="Calibri" w:eastAsia="Calibri" w:hAnsi="Calibri"/>
-          <w:bCs/>
-          <w:i/>
-          <w:color w:val="4A5568"/>
-          <w:lang w:val="pt-BR"/>
-        </w:rPr>
-        <w:t xml:space="preserve"> uma pesquisa de</w:t>
-      </w:r>
-      <w:r>
-        <w:rPr>
-          <w:rFonts w:ascii="Calibri" w:eastAsia="Calibri" w:hAnsi="Calibri"/>
-          <w:bCs/>
-          <w:i/>
-          <w:color w:val="4A5568"/>
-          <w:lang w:val="pt-BR"/>
-        </w:rPr>
-        <w:t xml:space="preserve"> 2025,</w:t>
-      </w:r>
-      <w:r>
-        <w:rPr>
-          <w:rFonts w:ascii="Calibri" w:eastAsia="Calibri" w:hAnsi="Calibri"/>
-          <w:bCs/>
-          <w:i/>
-          <w:color w:val="4A5568"/>
-          <w:lang w:val="pt-BR"/>
-        </w:rPr>
-        <w:t xml:space="preserve"> aponta que</w:t>
-      </w:r>
-      <w:r>
-        <w:rPr>
-          <w:rFonts w:ascii="Calibri" w:eastAsia="Calibri" w:hAnsi="Calibri"/>
-          <w:bCs/>
-          <w:i/>
-          <w:color w:val="4A5568"/>
-          <w:lang w:val="pt-BR"/>
-        </w:rPr>
-        <w:t xml:space="preserve"> 47% dos pequenos negócios </w:t>
-      </w:r>
-      <w:r>
-        <w:rPr>
-          <w:rFonts w:ascii="Calibri" w:eastAsia="Calibri" w:hAnsi="Calibri"/>
-          <w:bCs/>
-          <w:i/>
-          <w:color w:val="4A5568"/>
-          <w:lang w:val="pt-BR"/>
-        </w:rPr>
-        <w:t xml:space="preserve">já usam software de gestão. Ou seja: já há ferramenta e dado; falta um copiloto que interprete sem substituir </w:t>
-      </w:r>
-      <w:r>
-        <w:rPr>
-          <w:rFonts w:ascii="Calibri" w:eastAsia="Calibri" w:hAnsi="Calibri"/>
-          <w:bCs/>
-          <w:i/>
-          <w:color w:val="4A5568"/>
-          <w:lang w:val="pt-BR"/>
-        </w:rPr>
-        <w:t>os sistema</w:t>
-      </w:r>
-      <w:r>
-        <w:rPr>
-          <w:rFonts w:ascii="Calibri" w:eastAsia="Calibri" w:hAnsi="Calibri"/>
-          <w:bCs/>
-          <w:i/>
-          <w:color w:val="4A5568"/>
-          <w:lang w:val="pt-BR"/>
-        </w:rPr>
-        <w:t>s</w:t>
-      </w:r>
-      <w:r>
-        <w:rPr>
-          <w:rFonts w:ascii="Calibri" w:eastAsia="Calibri" w:hAnsi="Calibri"/>
-          <w:bCs/>
-          <w:i/>
-          <w:color w:val="4A5568"/>
-          <w:lang w:val="pt-BR"/>
-        </w:rPr>
-        <w:t xml:space="preserve"> de gestão que a empresa já usa</w:t>
-      </w:r>
-      <w:r>
-        <w:rPr>
-          <w:rFonts w:ascii="Calibri" w:eastAsia="Calibri" w:hAnsi="Calibri"/>
-          <w:bCs/>
-          <w:i/>
-          <w:color w:val="4A5568"/>
-          <w:lang w:val="pt-BR"/>
-        </w:rPr>
-        <w:t>.</w:t>
-      </w:r>
-    </w:p>
-    <w:p>
-      <w:pPr>
-        <w:spacing w:after="160" w:line="360" w:lineRule="auto"/>
-        <w:rPr>
-          <w:rFonts w:ascii="Calibri" w:eastAsia="Calibri" w:hAnsi="Calibri"/>
-          <w:i/>
-          <w:color w:val="4A5568"/>
-          <w:lang w:val="pt-BR"/>
-        </w:rPr>
-      </w:pPr>
-      <w:r>
-        <w:rPr>
-          <w:rFonts w:ascii="Calibri" w:eastAsia="Calibri" w:hAnsi="Calibri"/>
-          <w:i/>
-          <w:color w:val="4A5568"/>
-          <w:lang w:val="pt-BR"/>
-        </w:rPr>
-        <w:t>É justamente essa distância entre os dados disponíveis e a decisão do gestor que o DUAXIS busca reduzir</w:t>
-      </w:r>
-      <w:r>
-        <w:rPr>
-          <w:rFonts w:ascii="Calibri" w:eastAsia="Calibri" w:hAnsi="Calibri"/>
-          <w:i/>
-          <w:color w:val="4A5568"/>
-          <w:lang w:val="pt-BR"/>
-        </w:rPr>
-        <w:t>.</w:t>
-      </w:r>
-      <w:r>
-        <w:rPr>
-          <w:rFonts w:ascii="Calibri" w:eastAsia="Calibri" w:hAnsi="Calibri"/>
-          <w:i/>
-          <w:color w:val="4A5568"/>
-          <w:lang w:val="pt-BR"/>
-        </w:rPr>
-        <w:t xml:space="preserve"> </w:t>
-      </w:r>
-    </w:p>
-    <w:p>
-      <w:pPr>
-        <w:spacing w:after="160" w:line="360" w:lineRule="auto"/>
-        <w:rPr>
-          <w:lang w:val="pt-BR"/>
-        </w:rPr>
-      </w:pPr>
-      <w:r>
-        <w:rPr>
-          <w:rFonts w:ascii="Calibri" w:eastAsia="Calibri" w:hAnsi="Calibri"/>
-          <w:i/>
-          <w:color w:val="4A5568"/>
-          <w:lang w:val="pt-BR"/>
-        </w:rPr>
-        <w:t>Transição: “</w:t>
-      </w:r>
-      <w:r>
-        <w:rPr>
-          <w:rFonts w:ascii="Calibri" w:eastAsia="Calibri" w:hAnsi="Calibri"/>
-          <w:b/>
-          <w:bCs/>
-          <w:i/>
-          <w:color w:val="4A5568"/>
-          <w:lang w:val="pt-BR"/>
-        </w:rPr>
-        <w:t>Mas quem exatamente enfrenta esse problema e como o DUAXIS entra nessa realidade?</w:t>
-      </w:r>
-      <w:r>
-        <w:rPr>
-          <w:rFonts w:ascii="Calibri" w:eastAsia="Calibri" w:hAnsi="Calibri"/>
-          <w:i/>
-          <w:color w:val="4A5568"/>
-          <w:lang w:val="pt-BR"/>
-        </w:rPr>
-        <w:t>”</w:t>
-      </w:r>
-    </w:p>
-    <w:p>
-      <w:pPr>
-        <w:spacing w:before="320" w:after="160"/>
+        <w:spacing w:before="320" w:after="0" w:line="360" w:lineRule="auto"/>
         <w:rPr>
           <w:lang w:val="pt-BR"/>
         </w:rPr>
@@ -1133,12 +1226,13 @@
           <w:sz w:val="32"/>
           <w:lang w:val="pt-BR"/>
         </w:rPr>
+        <w:lastRenderedPageBreak/>
         <w:t>Participante 2 — Público + solução</w:t>
       </w:r>
     </w:p>
     <w:p>
       <w:pPr>
-        <w:spacing w:after="80"/>
+        <w:spacing w:after="0" w:line="360" w:lineRule="auto"/>
         <w:rPr>
           <w:lang w:val="pt-BR"/>
         </w:rPr>
@@ -1162,7 +1256,7 @@
     </w:p>
     <w:p>
       <w:pPr>
-        <w:spacing w:after="80"/>
+        <w:spacing w:after="0" w:line="360" w:lineRule="auto"/>
         <w:rPr>
           <w:lang w:val="pt-BR"/>
         </w:rPr>
@@ -1186,7 +1280,7 @@
     </w:p>
     <w:p>
       <w:pPr>
-        <w:spacing w:before="240" w:after="120"/>
+        <w:spacing w:before="240" w:after="0" w:line="360" w:lineRule="auto"/>
         <w:rPr>
           <w:lang w:val="pt-BR"/>
         </w:rPr>
@@ -1199,51 +1293,183 @@
           <w:sz w:val="26"/>
           <w:lang w:val="pt-BR"/>
         </w:rPr>
-        <w:t>Fala</w:t>
+        <w:t>Público:</w:t>
+      </w:r>
+      <w:r>
+        <w:rPr>
+          <w:rFonts w:ascii="Calibri" w:eastAsia="Calibri" w:hAnsi="Calibri"/>
+          <w:i/>
+          <w:color w:val="4A5568"/>
+          <w:lang w:val="pt-BR"/>
+        </w:rPr>
+        <w:t xml:space="preserve"> </w:t>
+      </w:r>
+      <w:r>
+        <w:rPr>
+          <w:rFonts w:ascii="Calibri" w:eastAsia="Calibri" w:hAnsi="Calibri"/>
+          <w:i/>
+          <w:color w:val="4A5568"/>
+          <w:lang w:val="pt-BR"/>
+        </w:rPr>
+        <w:t xml:space="preserve">O DUAXIS é voltado para pequenas e médias empresas, principalmente aquelas que utilizam mais de um sistema de gestão e </w:t>
+      </w:r>
+      <w:r>
+        <w:rPr>
+          <w:rFonts w:ascii="Calibri" w:eastAsia="Calibri" w:hAnsi="Calibri"/>
+          <w:i/>
+          <w:color w:val="4A5568"/>
+          <w:lang w:val="pt-BR"/>
+        </w:rPr>
+        <w:t>que não</w:t>
+      </w:r>
+      <w:r>
+        <w:rPr>
+          <w:rFonts w:ascii="Calibri" w:eastAsia="Calibri" w:hAnsi="Calibri"/>
+          <w:i/>
+          <w:color w:val="4A5568"/>
+          <w:lang w:val="pt-BR"/>
+        </w:rPr>
+        <w:t xml:space="preserve"> possuem uma equipe especializada em BI ou Ciência de Dados</w:t>
+      </w:r>
+      <w:r>
+        <w:rPr>
+          <w:rFonts w:ascii="Calibri" w:eastAsia="Calibri" w:hAnsi="Calibri"/>
+          <w:i/>
+          <w:color w:val="4A5568"/>
+          <w:lang w:val="pt-BR"/>
+        </w:rPr>
+        <w:t>.</w:t>
       </w:r>
     </w:p>
     <w:p>
       <w:pPr>
-        <w:spacing w:after="160" w:line="360" w:lineRule="auto"/>
-        <w:rPr>
-          <w:lang w:val="pt-BR"/>
-        </w:rPr>
-      </w:pPr>
-      <w:r>
-        <w:rPr>
-          <w:rFonts w:ascii="Calibri" w:eastAsia="Calibri" w:hAnsi="Calibri"/>
-          <w:i/>
-          <w:color w:val="4A5568"/>
-          <w:lang w:val="pt-BR"/>
-        </w:rPr>
-        <w:t xml:space="preserve">Público: </w:t>
-      </w:r>
-      <w:r>
-        <w:rPr>
-          <w:rFonts w:ascii="Calibri" w:eastAsia="Calibri" w:hAnsi="Calibri"/>
-          <w:i/>
-          <w:color w:val="4A5568"/>
-          <w:lang w:val="pt-BR"/>
-        </w:rPr>
-        <w:t xml:space="preserve">O DUAXIS é voltado para pequenas e médias empresas, principalmente aquelas que utilizam mais de um sistema de gestão e </w:t>
-      </w:r>
-      <w:r>
-        <w:rPr>
-          <w:rFonts w:ascii="Calibri" w:eastAsia="Calibri" w:hAnsi="Calibri"/>
-          <w:i/>
-          <w:color w:val="4A5568"/>
-          <w:lang w:val="pt-BR"/>
-        </w:rPr>
-        <w:t>que não</w:t>
-      </w:r>
-      <w:r>
-        <w:rPr>
-          <w:rFonts w:ascii="Calibri" w:eastAsia="Calibri" w:hAnsi="Calibri"/>
-          <w:i/>
-          <w:color w:val="4A5568"/>
-          <w:lang w:val="pt-BR"/>
-        </w:rPr>
-        <w:t xml:space="preserve"> possuem uma equipe especializada em BI ou Ciência de Dados</w:t>
+        <w:spacing w:after="0" w:line="360" w:lineRule="auto"/>
+        <w:rPr>
+          <w:lang w:val="pt-BR"/>
+        </w:rPr>
+      </w:pPr>
+      <w:r>
+        <w:rPr>
+          <w:rFonts w:ascii="Calibri" w:eastAsia="Calibri" w:hAnsi="Calibri"/>
+          <w:b/>
+          <w:color w:val="1E3A5F"/>
+          <w:sz w:val="26"/>
+          <w:lang w:val="pt-BR"/>
+        </w:rPr>
+        <w:t>Solução:</w:t>
+      </w:r>
+      <w:r>
+        <w:rPr>
+          <w:rFonts w:ascii="Calibri" w:eastAsia="Calibri" w:hAnsi="Calibri"/>
+          <w:i/>
+          <w:color w:val="4A5568"/>
+          <w:lang w:val="pt-BR"/>
+        </w:rPr>
+        <w:t xml:space="preserve"> o DUAXIS </w:t>
+      </w:r>
+      <w:r>
+        <w:rPr>
+          <w:rFonts w:ascii="Calibri" w:eastAsia="Calibri" w:hAnsi="Calibri"/>
+          <w:b/>
+          <w:i/>
+          <w:color w:val="4A5568"/>
+          <w:lang w:val="pt-BR"/>
+        </w:rPr>
+        <w:t>não substitui o ERP</w:t>
+      </w:r>
+      <w:r>
+        <w:rPr>
+          <w:rFonts w:ascii="Calibri" w:eastAsia="Calibri" w:hAnsi="Calibri"/>
+          <w:b/>
+          <w:i/>
+          <w:color w:val="4A5568"/>
+          <w:lang w:val="pt-BR"/>
+        </w:rPr>
+        <w:t>, o CRM, o sistema de RH ou as planilhas</w:t>
+      </w:r>
+      <w:r>
+        <w:rPr>
+          <w:rFonts w:ascii="Calibri" w:eastAsia="Calibri" w:hAnsi="Calibri"/>
+          <w:i/>
+          <w:color w:val="4A5568"/>
+          <w:lang w:val="pt-BR"/>
+        </w:rPr>
+        <w:t xml:space="preserve">. </w:t>
+      </w:r>
+      <w:r>
+        <w:rPr>
+          <w:rFonts w:ascii="Calibri" w:eastAsia="Calibri" w:hAnsi="Calibri"/>
+          <w:i/>
+          <w:color w:val="4A5568"/>
+          <w:lang w:val="pt-BR"/>
+        </w:rPr>
+        <w:t>Ele é</w:t>
+      </w:r>
+      <w:r>
+        <w:rPr>
+          <w:rFonts w:ascii="Calibri" w:eastAsia="Calibri" w:hAnsi="Calibri"/>
+          <w:i/>
+          <w:color w:val="4A5568"/>
+          <w:lang w:val="pt-BR"/>
+        </w:rPr>
+        <w:t xml:space="preserve"> um </w:t>
+      </w:r>
+      <w:r>
+        <w:rPr>
+          <w:rFonts w:ascii="Calibri" w:eastAsia="Calibri" w:hAnsi="Calibri"/>
+          <w:b/>
+          <w:i/>
+          <w:color w:val="4A5568"/>
+          <w:lang w:val="pt-BR"/>
+        </w:rPr>
+        <w:t>copiloto corporativo</w:t>
+      </w:r>
+      <w:r>
+        <w:rPr>
+          <w:rFonts w:ascii="Calibri" w:eastAsia="Calibri" w:hAnsi="Calibri"/>
+          <w:b/>
+          <w:i/>
+          <w:color w:val="4A5568"/>
+          <w:lang w:val="pt-BR"/>
+        </w:rPr>
+        <w:t xml:space="preserve"> </w:t>
+      </w:r>
+      <w:r>
+        <w:rPr>
+          <w:rFonts w:ascii="Calibri" w:eastAsia="Calibri" w:hAnsi="Calibri"/>
+          <w:bCs/>
+          <w:i/>
+          <w:color w:val="4A5568"/>
+          <w:lang w:val="pt-BR"/>
+        </w:rPr>
+        <w:t>que atua</w:t>
+      </w:r>
+      <w:r>
+        <w:rPr>
+          <w:rFonts w:ascii="Calibri" w:eastAsia="Calibri" w:hAnsi="Calibri"/>
+          <w:i/>
+          <w:color w:val="4A5568"/>
+          <w:lang w:val="pt-BR"/>
+        </w:rPr>
+        <w:t xml:space="preserve"> </w:t>
+      </w:r>
+      <w:r>
+        <w:rPr>
+          <w:rFonts w:ascii="Calibri" w:eastAsia="Calibri" w:hAnsi="Calibri"/>
+          <w:i/>
+          <w:color w:val="4A5568"/>
+          <w:lang w:val="pt-BR"/>
+        </w:rPr>
+        <w:t xml:space="preserve">como </w:t>
+      </w:r>
+      <w:r>
+        <w:rPr>
+          <w:rFonts w:ascii="Calibri" w:eastAsia="Calibri" w:hAnsi="Calibri"/>
+          <w:i/>
+          <w:color w:val="4A5568"/>
+          <w:lang w:val="pt-BR"/>
+        </w:rPr>
+        <w:t>uma camada que lê os dados da empresa e devolve resposta com número e explicação</w:t>
       </w:r>
       <w:r>
         <w:rPr>
@@ -1257,123 +1483,30 @@
     </w:p>
     <w:p>
       <w:pPr>
-        <w:spacing w:after="160" w:line="360" w:lineRule="auto"/>
-        <w:rPr>
-          <w:lang w:val="pt-BR"/>
-        </w:rPr>
-      </w:pPr>
-      <w:r>
-        <w:rPr>
-          <w:rFonts w:ascii="Calibri" w:eastAsia="Calibri" w:hAnsi="Calibri"/>
-          <w:i/>
-          <w:color w:val="4A5568"/>
-          <w:lang w:val="pt-BR"/>
-        </w:rPr>
-        <w:t xml:space="preserve">Solução: o DUAXIS </w:t>
+        <w:spacing w:after="0" w:line="360" w:lineRule="auto"/>
+        <w:rPr>
+          <w:lang w:val="pt-BR"/>
+        </w:rPr>
+      </w:pPr>
+      <w:r>
+        <w:rPr>
+          <w:rFonts w:ascii="Calibri" w:eastAsia="Calibri" w:hAnsi="Calibri"/>
+          <w:i/>
+          <w:color w:val="4A5568"/>
+          <w:lang w:val="pt-BR"/>
+        </w:rPr>
+        <w:t xml:space="preserve">E o gestor pode interagir com essas informações utilizando </w:t>
       </w:r>
       <w:r>
         <w:rPr>
           <w:rFonts w:ascii="Calibri" w:eastAsia="Calibri" w:hAnsi="Calibri"/>
           <w:b/>
-          <w:i/>
-          <w:color w:val="4A5568"/>
-          <w:lang w:val="pt-BR"/>
-        </w:rPr>
-        <w:t>não substitui o ERP</w:t>
-      </w:r>
-      <w:r>
-        <w:rPr>
-          <w:rFonts w:ascii="Calibri" w:eastAsia="Calibri" w:hAnsi="Calibri"/>
-          <w:b/>
-          <w:i/>
-          <w:color w:val="4A5568"/>
-          <w:lang w:val="pt-BR"/>
-        </w:rPr>
-        <w:t>, o CRM, o sistema de RH ou as planilhas</w:t>
-      </w:r>
-      <w:r>
-        <w:rPr>
-          <w:rFonts w:ascii="Calibri" w:eastAsia="Calibri" w:hAnsi="Calibri"/>
-          <w:i/>
-          <w:color w:val="4A5568"/>
-          <w:lang w:val="pt-BR"/>
-        </w:rPr>
-        <w:t xml:space="preserve">. </w:t>
-      </w:r>
-      <w:r>
-        <w:rPr>
-          <w:rFonts w:ascii="Calibri" w:eastAsia="Calibri" w:hAnsi="Calibri"/>
-          <w:i/>
-          <w:color w:val="4A5568"/>
-          <w:lang w:val="pt-BR"/>
-        </w:rPr>
-        <w:t>Ele é</w:t>
-      </w:r>
-      <w:r>
-        <w:rPr>
-          <w:rFonts w:ascii="Calibri" w:eastAsia="Calibri" w:hAnsi="Calibri"/>
-          <w:i/>
-          <w:color w:val="4A5568"/>
-          <w:lang w:val="pt-BR"/>
-        </w:rPr>
-        <w:t xml:space="preserve"> um </w:t>
-      </w:r>
-      <w:r>
-        <w:rPr>
-          <w:rFonts w:ascii="Calibri" w:eastAsia="Calibri" w:hAnsi="Calibri"/>
-          <w:b/>
-          <w:i/>
-          <w:color w:val="4A5568"/>
-          <w:lang w:val="pt-BR"/>
-        </w:rPr>
-        <w:t>copiloto corporativo</w:t>
-      </w:r>
-      <w:r>
-        <w:rPr>
-          <w:rFonts w:ascii="Calibri" w:eastAsia="Calibri" w:hAnsi="Calibri"/>
-          <w:b/>
-          <w:i/>
-          <w:color w:val="4A5568"/>
-          <w:lang w:val="pt-BR"/>
-        </w:rPr>
-        <w:t xml:space="preserve"> </w:t>
-      </w:r>
-      <w:r>
-        <w:rPr>
-          <w:rFonts w:ascii="Calibri" w:eastAsia="Calibri" w:hAnsi="Calibri"/>
           <w:bCs/>
           <w:i/>
           <w:color w:val="4A5568"/>
           <w:lang w:val="pt-BR"/>
         </w:rPr>
-        <w:t>que atua</w:t>
-      </w:r>
-      <w:r>
-        <w:rPr>
-          <w:rFonts w:ascii="Calibri" w:eastAsia="Calibri" w:hAnsi="Calibri"/>
-          <w:i/>
-          <w:color w:val="4A5568"/>
-          <w:lang w:val="pt-BR"/>
-        </w:rPr>
-        <w:t xml:space="preserve"> </w:t>
-      </w:r>
-      <w:r>
-        <w:rPr>
-          <w:rFonts w:ascii="Calibri" w:eastAsia="Calibri" w:hAnsi="Calibri"/>
-          <w:i/>
-          <w:color w:val="4A5568"/>
-          <w:lang w:val="pt-BR"/>
-        </w:rPr>
-        <w:t xml:space="preserve">como </w:t>
-      </w:r>
-      <w:r>
-        <w:rPr>
-          <w:rFonts w:ascii="Calibri" w:eastAsia="Calibri" w:hAnsi="Calibri"/>
-          <w:i/>
-          <w:color w:val="4A5568"/>
-          <w:lang w:val="pt-BR"/>
-        </w:rPr>
-        <w:t>uma camada que lê os dados da empresa e devolve resposta com número e explicação</w:t>
+        <w:t>linguagem natural</w:t>
       </w:r>
       <w:r>
         <w:rPr>
@@ -1387,21 +1520,7 @@
     </w:p>
     <w:p>
       <w:pPr>
-        <w:spacing w:after="160" w:line="360" w:lineRule="auto"/>
-        <w:rPr>
-          <w:lang w:val="pt-BR"/>
-        </w:rPr>
-      </w:pPr>
-      <w:r>
-        <w:rPr>
-          <w:rFonts w:ascii="Calibri" w:eastAsia="Calibri" w:hAnsi="Calibri"/>
-          <w:i/>
-          <w:color w:val="4A5568"/>
-          <w:lang w:val="pt-BR"/>
-        </w:rPr>
-        <w:t xml:space="preserve">E o gestor pode interagir com essas informações utilizando </w:t>
-      </w:r>
-      <w:r>
+        <w:spacing w:after="0" w:line="360" w:lineRule="auto"/>
         <w:rPr>
           <w:rFonts w:ascii="Calibri" w:eastAsia="Calibri" w:hAnsi="Calibri"/>
           <w:b/>
@@ -1410,21 +1529,209 @@
           <w:color w:val="4A5568"/>
           <w:lang w:val="pt-BR"/>
         </w:rPr>
-        <w:t>linguagem natural</w:t>
-      </w:r>
-      <w:r>
-        <w:rPr>
-          <w:rFonts w:ascii="Calibri" w:eastAsia="Calibri" w:hAnsi="Calibri"/>
-          <w:i/>
-          <w:color w:val="4A5568"/>
-          <w:lang w:val="pt-BR"/>
-        </w:rPr>
-        <w:t>.</w:t>
+      </w:pPr>
+      <w:r>
+        <w:rPr>
+          <w:rFonts w:ascii="Calibri" w:eastAsia="Calibri" w:hAnsi="Calibri"/>
+          <w:i/>
+          <w:color w:val="4A5568"/>
+          <w:lang w:val="pt-BR"/>
+        </w:rPr>
+        <w:t>Por exemplo:</w:t>
+      </w:r>
+      <w:r>
+        <w:rPr>
+          <w:rFonts w:ascii="Calibri" w:eastAsia="Calibri" w:hAnsi="Calibri"/>
+          <w:i/>
+          <w:color w:val="4A5568"/>
+          <w:lang w:val="pt-BR"/>
+        </w:rPr>
+        <w:t xml:space="preserve"> </w:t>
+      </w:r>
+      <w:r>
+        <w:rPr>
+          <w:rFonts w:ascii="Calibri" w:eastAsia="Calibri" w:hAnsi="Calibri"/>
+          <w:b/>
+          <w:bCs/>
+          <w:i/>
+          <w:color w:val="4A5568"/>
+          <w:lang w:val="pt-BR"/>
+        </w:rPr>
+        <w:t>“</w:t>
+      </w:r>
+      <w:r>
+        <w:rPr>
+          <w:rFonts w:ascii="Calibri" w:eastAsia="Calibri" w:hAnsi="Calibri"/>
+          <w:b/>
+          <w:bCs/>
+          <w:i/>
+          <w:color w:val="4A5568"/>
+          <w:lang w:val="pt-BR"/>
+        </w:rPr>
+        <w:t>Por que o lucro caiu em maio de 2026?</w:t>
+      </w:r>
+      <w:r>
+        <w:rPr>
+          <w:rFonts w:ascii="Calibri" w:eastAsia="Calibri" w:hAnsi="Calibri"/>
+          <w:b/>
+          <w:bCs/>
+          <w:i/>
+          <w:color w:val="4A5568"/>
+          <w:lang w:val="pt-BR"/>
+        </w:rPr>
+        <w:t>”</w:t>
       </w:r>
     </w:p>
     <w:p>
       <w:pPr>
-        <w:spacing w:after="160" w:line="360" w:lineRule="auto"/>
+        <w:spacing w:after="0" w:line="360" w:lineRule="auto"/>
+        <w:rPr>
+          <w:rFonts w:ascii="Calibri" w:eastAsia="Calibri" w:hAnsi="Calibri"/>
+          <w:i/>
+          <w:color w:val="4A5568"/>
+          <w:lang w:val="pt-BR"/>
+        </w:rPr>
+      </w:pPr>
+      <w:r>
+        <w:rPr>
+          <w:rFonts w:ascii="Calibri" w:eastAsia="Calibri" w:hAnsi="Calibri"/>
+          <w:i/>
+          <w:color w:val="4A5568"/>
+          <w:lang w:val="pt-BR"/>
+        </w:rPr>
+        <w:t>O DUAXIS não precisa simplesmente responder que houve uma queda.</w:t>
+      </w:r>
+    </w:p>
+    <w:p>
+      <w:pPr>
+        <w:spacing w:after="0" w:line="360" w:lineRule="auto"/>
+        <w:rPr>
+          <w:rFonts w:ascii="Calibri" w:eastAsia="Calibri" w:hAnsi="Calibri"/>
+          <w:i/>
+          <w:color w:val="4A5568"/>
+          <w:lang w:val="pt-BR"/>
+        </w:rPr>
+      </w:pPr>
+      <w:r>
+        <w:rPr>
+          <w:rFonts w:ascii="Calibri" w:eastAsia="Calibri" w:hAnsi="Calibri"/>
+          <w:i/>
+          <w:color w:val="4A5568"/>
+          <w:lang w:val="pt-BR"/>
+        </w:rPr>
+        <w:t>Ele pode analisar as informações e explicar o que contribuiu para aquele resultado.</w:t>
+      </w:r>
+    </w:p>
+    <w:p>
+      <w:pPr>
+        <w:spacing w:after="0" w:line="360" w:lineRule="auto"/>
+        <w:rPr>
+          <w:rFonts w:ascii="Calibri" w:eastAsia="Calibri" w:hAnsi="Calibri"/>
+          <w:i/>
+          <w:color w:val="4A5568"/>
+          <w:lang w:val="pt-BR"/>
+        </w:rPr>
+      </w:pPr>
+      <w:r>
+        <w:rPr>
+          <w:rFonts w:ascii="Calibri" w:eastAsia="Calibri" w:hAnsi="Calibri"/>
+          <w:i/>
+          <w:color w:val="4A5568"/>
+          <w:lang w:val="pt-BR"/>
+        </w:rPr>
+        <w:t>E o gestor também pode ir além:</w:t>
+      </w:r>
+    </w:p>
+    <w:p>
+      <w:pPr>
+        <w:spacing w:after="0" w:line="360" w:lineRule="auto"/>
+        <w:rPr>
+          <w:rFonts w:ascii="Calibri" w:eastAsia="Calibri" w:hAnsi="Calibri"/>
+          <w:i/>
+          <w:color w:val="4A5568"/>
+          <w:lang w:val="pt-BR"/>
+        </w:rPr>
+      </w:pPr>
+      <w:r>
+        <w:rPr>
+          <w:rFonts w:ascii="Calibri" w:eastAsia="Calibri" w:hAnsi="Calibri"/>
+          <w:i/>
+          <w:color w:val="4A5568"/>
+          <w:lang w:val="pt-BR"/>
+        </w:rPr>
+        <w:t xml:space="preserve">Por exemplo: </w:t>
+      </w:r>
+      <w:r>
+        <w:rPr>
+          <w:rFonts w:ascii="Calibri" w:eastAsia="Calibri" w:hAnsi="Calibri"/>
+          <w:i/>
+          <w:color w:val="4A5568"/>
+          <w:lang w:val="pt-BR"/>
+        </w:rPr>
+        <w:t>E se a despesa operacional subir 10%</w:t>
+      </w:r>
+      <w:r>
+        <w:rPr>
+          <w:rFonts w:ascii="Calibri" w:eastAsia="Calibri" w:hAnsi="Calibri"/>
+          <w:i/>
+          <w:color w:val="4A5568"/>
+          <w:lang w:val="pt-BR"/>
+        </w:rPr>
+        <w:t xml:space="preserve"> em junho de 2026</w:t>
+      </w:r>
+      <w:r>
+        <w:rPr>
+          <w:rFonts w:ascii="Calibri" w:eastAsia="Calibri" w:hAnsi="Calibri"/>
+          <w:i/>
+          <w:color w:val="4A5568"/>
+          <w:lang w:val="pt-BR"/>
+        </w:rPr>
+        <w:t>?</w:t>
+      </w:r>
+    </w:p>
+    <w:p>
+      <w:pPr>
+        <w:spacing w:after="0" w:line="360" w:lineRule="auto"/>
+        <w:rPr>
+          <w:rFonts w:ascii="Calibri" w:eastAsia="Calibri" w:hAnsi="Calibri"/>
+          <w:i/>
+          <w:color w:val="4A5568"/>
+          <w:lang w:val="pt-BR"/>
+        </w:rPr>
+      </w:pPr>
+      <w:r>
+        <w:rPr>
+          <w:rFonts w:ascii="Calibri" w:eastAsia="Calibri" w:hAnsi="Calibri"/>
+          <w:i/>
+          <w:color w:val="4A5568"/>
+          <w:lang w:val="pt-BR"/>
+        </w:rPr>
+        <w:t>Nesse caso, o DUAXIS pode simular o cenário e apresentar os possíveis impactos financeiros.</w:t>
+      </w:r>
+    </w:p>
+    <w:p>
+      <w:pPr>
+        <w:spacing w:after="0" w:line="360" w:lineRule="auto"/>
+        <w:rPr>
+          <w:rFonts w:ascii="Calibri" w:eastAsia="Calibri" w:hAnsi="Calibri"/>
+          <w:i/>
+          <w:color w:val="4A5568"/>
+          <w:lang w:val="pt-BR"/>
+        </w:rPr>
+      </w:pPr>
+      <w:r>
+        <w:rPr>
+          <w:rFonts w:ascii="Calibri" w:eastAsia="Calibri" w:hAnsi="Calibri"/>
+          <w:i/>
+          <w:color w:val="4A5568"/>
+          <w:lang w:val="pt-BR"/>
+        </w:rPr>
+        <w:t>Então, a proposta não é apenas facilitar o acesso aos dados.</w:t>
+      </w:r>
+    </w:p>
+    <w:p>
+      <w:pPr>
+        <w:spacing w:after="0" w:line="360" w:lineRule="auto"/>
         <w:rPr>
           <w:rFonts w:ascii="Calibri" w:eastAsia="Calibri" w:hAnsi="Calibri"/>
           <w:b/>
@@ -1441,7 +1748,7 @@
           <w:color w:val="4A5568"/>
           <w:lang w:val="pt-BR"/>
         </w:rPr>
-        <w:t>Por exemplo:</w:t>
+        <w:t>É transformar dado espalhado em decisão, com número e contexto.”</w:t>
       </w:r>
       <w:r>
         <w:rPr>
@@ -1451,257 +1758,46 @@
           <w:lang w:val="pt-BR"/>
         </w:rPr>
         <w:t xml:space="preserve"> </w:t>
-      </w:r>
-      <w:r>
-        <w:rPr>
-          <w:rFonts w:ascii="Calibri" w:eastAsia="Calibri" w:hAnsi="Calibri"/>
-          <w:b/>
-          <w:bCs/>
-          <w:i/>
-          <w:color w:val="4A5568"/>
-          <w:lang w:val="pt-BR"/>
-        </w:rPr>
-        <w:t>“</w:t>
-      </w:r>
-      <w:r>
-        <w:rPr>
-          <w:rFonts w:ascii="Calibri" w:eastAsia="Calibri" w:hAnsi="Calibri"/>
-          <w:b/>
-          <w:bCs/>
-          <w:i/>
-          <w:color w:val="4A5568"/>
-          <w:lang w:val="pt-BR"/>
-        </w:rPr>
-        <w:t>Por que o lucro caiu em maio de 2026?</w:t>
-      </w:r>
-      <w:r>
-        <w:rPr>
-          <w:rFonts w:ascii="Calibri" w:eastAsia="Calibri" w:hAnsi="Calibri"/>
-          <w:b/>
-          <w:bCs/>
-          <w:i/>
-          <w:color w:val="4A5568"/>
-          <w:lang w:val="pt-BR"/>
-        </w:rPr>
-        <w:t>”</w:t>
       </w:r>
     </w:p>
     <w:p>
       <w:pPr>
-        <w:spacing w:after="160" w:line="360" w:lineRule="auto"/>
-        <w:rPr>
-          <w:rFonts w:ascii="Calibri" w:eastAsia="Calibri" w:hAnsi="Calibri"/>
-          <w:i/>
-          <w:color w:val="4A5568"/>
-          <w:lang w:val="pt-BR"/>
-        </w:rPr>
-      </w:pPr>
-      <w:r>
-        <w:rPr>
-          <w:rFonts w:ascii="Calibri" w:eastAsia="Calibri" w:hAnsi="Calibri"/>
-          <w:i/>
-          <w:color w:val="4A5568"/>
-          <w:lang w:val="pt-BR"/>
-        </w:rPr>
-        <w:t>O DUAXIS não precisa simplesmente responder que houve uma queda.</w:t>
+        <w:spacing w:after="0" w:line="360" w:lineRule="auto"/>
+        <w:rPr>
+          <w:lang w:val="pt-BR"/>
+        </w:rPr>
+      </w:pPr>
+      <w:r>
+        <w:rPr>
+          <w:rFonts w:ascii="Calibri" w:eastAsia="Calibri" w:hAnsi="Calibri"/>
+          <w:i/>
+          <w:color w:val="4A5568"/>
+          <w:lang w:val="pt-BR"/>
+        </w:rPr>
+        <w:t>Transição: “</w:t>
+      </w:r>
+      <w:r>
+        <w:rPr>
+          <w:rFonts w:ascii="Calibri" w:eastAsia="Calibri" w:hAnsi="Calibri"/>
+          <w:i/>
+          <w:color w:val="4A5568"/>
+          <w:lang w:val="pt-BR"/>
+        </w:rPr>
+        <w:t>Mas para que o DUAXIS consiga fazer isso de forma confiável, precisamos entender o que existe por trás dessas respostas.</w:t>
+      </w:r>
+      <w:r>
+        <w:rPr>
+          <w:rFonts w:ascii="Calibri" w:eastAsia="Calibri" w:hAnsi="Calibri"/>
+          <w:i/>
+          <w:color w:val="4A5568"/>
+          <w:lang w:val="pt-BR"/>
+        </w:rPr>
+        <w:t>”</w:t>
       </w:r>
     </w:p>
     <w:p>
       <w:pPr>
-        <w:spacing w:after="160" w:line="360" w:lineRule="auto"/>
-        <w:rPr>
-          <w:rFonts w:ascii="Calibri" w:eastAsia="Calibri" w:hAnsi="Calibri"/>
-          <w:i/>
-          <w:color w:val="4A5568"/>
-          <w:lang w:val="pt-BR"/>
-        </w:rPr>
-      </w:pPr>
-      <w:r>
-        <w:rPr>
-          <w:rFonts w:ascii="Calibri" w:eastAsia="Calibri" w:hAnsi="Calibri"/>
-          <w:i/>
-          <w:color w:val="4A5568"/>
-          <w:lang w:val="pt-BR"/>
-        </w:rPr>
-        <w:t>Ele pode analisar as informações e explicar o que contribuiu para aquele resultado.</w:t>
-      </w:r>
-    </w:p>
-    <w:p>
-      <w:pPr>
-        <w:spacing w:after="160" w:line="360" w:lineRule="auto"/>
-        <w:rPr>
-          <w:rFonts w:ascii="Calibri" w:eastAsia="Calibri" w:hAnsi="Calibri"/>
-          <w:i/>
-          <w:color w:val="4A5568"/>
-          <w:lang w:val="pt-BR"/>
-        </w:rPr>
-      </w:pPr>
-      <w:r>
-        <w:rPr>
-          <w:rFonts w:ascii="Calibri" w:eastAsia="Calibri" w:hAnsi="Calibri"/>
-          <w:i/>
-          <w:color w:val="4A5568"/>
-          <w:lang w:val="pt-BR"/>
-        </w:rPr>
-        <w:t>E o gestor também pode ir além:</w:t>
-      </w:r>
-    </w:p>
-    <w:p>
-      <w:pPr>
-        <w:spacing w:after="160" w:line="360" w:lineRule="auto"/>
-        <w:rPr>
-          <w:rFonts w:ascii="Calibri" w:eastAsia="Calibri" w:hAnsi="Calibri"/>
-          <w:i/>
-          <w:color w:val="4A5568"/>
-          <w:lang w:val="pt-BR"/>
-        </w:rPr>
-      </w:pPr>
-      <w:r>
-        <w:rPr>
-          <w:rFonts w:ascii="Calibri" w:eastAsia="Calibri" w:hAnsi="Calibri"/>
-          <w:i/>
-          <w:color w:val="4A5568"/>
-          <w:lang w:val="pt-BR"/>
-        </w:rPr>
-        <w:t xml:space="preserve">Por exemplo: </w:t>
-      </w:r>
-      <w:r>
-        <w:rPr>
-          <w:rFonts w:ascii="Calibri" w:eastAsia="Calibri" w:hAnsi="Calibri"/>
-          <w:i/>
-          <w:color w:val="4A5568"/>
-          <w:lang w:val="pt-BR"/>
-        </w:rPr>
-        <w:t>E se a despesa operacional subir 10%</w:t>
-      </w:r>
-      <w:r>
-        <w:rPr>
-          <w:rFonts w:ascii="Calibri" w:eastAsia="Calibri" w:hAnsi="Calibri"/>
-          <w:i/>
-          <w:color w:val="4A5568"/>
-          <w:lang w:val="pt-BR"/>
-        </w:rPr>
-        <w:t xml:space="preserve"> em junho de 2026</w:t>
-      </w:r>
-      <w:r>
-        <w:rPr>
-          <w:rFonts w:ascii="Calibri" w:eastAsia="Calibri" w:hAnsi="Calibri"/>
-          <w:i/>
-          <w:color w:val="4A5568"/>
-          <w:lang w:val="pt-BR"/>
-        </w:rPr>
-        <w:t>?</w:t>
-      </w:r>
-    </w:p>
-    <w:p>
-      <w:pPr>
-        <w:spacing w:after="160" w:line="360" w:lineRule="auto"/>
-        <w:rPr>
-          <w:rFonts w:ascii="Calibri" w:eastAsia="Calibri" w:hAnsi="Calibri"/>
-          <w:i/>
-          <w:color w:val="4A5568"/>
-          <w:lang w:val="pt-BR"/>
-        </w:rPr>
-      </w:pPr>
-      <w:r>
-        <w:rPr>
-          <w:rFonts w:ascii="Calibri" w:eastAsia="Calibri" w:hAnsi="Calibri"/>
-          <w:i/>
-          <w:color w:val="4A5568"/>
-          <w:lang w:val="pt-BR"/>
-        </w:rPr>
-        <w:t>Nesse caso, o DUAXIS pode simular o cenário e apresentar os possíveis impactos financeiros.</w:t>
-      </w:r>
-    </w:p>
-    <w:p>
-      <w:pPr>
-        <w:spacing w:after="160" w:line="360" w:lineRule="auto"/>
-        <w:rPr>
-          <w:rFonts w:ascii="Calibri" w:eastAsia="Calibri" w:hAnsi="Calibri"/>
-          <w:i/>
-          <w:color w:val="4A5568"/>
-          <w:lang w:val="pt-BR"/>
-        </w:rPr>
-      </w:pPr>
-      <w:r>
-        <w:rPr>
-          <w:rFonts w:ascii="Calibri" w:eastAsia="Calibri" w:hAnsi="Calibri"/>
-          <w:i/>
-          <w:color w:val="4A5568"/>
-          <w:lang w:val="pt-BR"/>
-        </w:rPr>
-        <w:t>Então, a proposta não é apenas facilitar o acesso aos dados.</w:t>
-      </w:r>
-    </w:p>
-    <w:p>
-      <w:pPr>
-        <w:spacing w:after="160" w:line="360" w:lineRule="auto"/>
-        <w:rPr>
-          <w:rFonts w:ascii="Calibri" w:eastAsia="Calibri" w:hAnsi="Calibri"/>
-          <w:b/>
-          <w:bCs/>
-          <w:i/>
-          <w:color w:val="4A5568"/>
-          <w:lang w:val="pt-BR"/>
-        </w:rPr>
-      </w:pPr>
-      <w:r>
-        <w:rPr>
-          <w:rFonts w:ascii="Calibri" w:eastAsia="Calibri" w:hAnsi="Calibri"/>
-          <w:i/>
-          <w:color w:val="4A5568"/>
-          <w:lang w:val="pt-BR"/>
-        </w:rPr>
-        <w:t>É transformar dado espalhado em decisão, com número e contexto.”</w:t>
-      </w:r>
-      <w:r>
-        <w:rPr>
-          <w:rFonts w:ascii="Calibri" w:eastAsia="Calibri" w:hAnsi="Calibri"/>
-          <w:i/>
-          <w:color w:val="4A5568"/>
-          <w:lang w:val="pt-BR"/>
-        </w:rPr>
-        <w:t xml:space="preserve"> </w:t>
-      </w:r>
-    </w:p>
-    <w:p>
-      <w:pPr>
-        <w:spacing w:after="160" w:line="360" w:lineRule="auto"/>
-        <w:rPr>
-          <w:lang w:val="pt-BR"/>
-        </w:rPr>
-      </w:pPr>
-      <w:r>
-        <w:rPr>
-          <w:rFonts w:ascii="Calibri" w:eastAsia="Calibri" w:hAnsi="Calibri"/>
-          <w:i/>
-          <w:color w:val="4A5568"/>
-          <w:lang w:val="pt-BR"/>
-        </w:rPr>
-        <w:t>Transição: “</w:t>
-      </w:r>
-      <w:r>
-        <w:rPr>
-          <w:rFonts w:ascii="Calibri" w:eastAsia="Calibri" w:hAnsi="Calibri"/>
-          <w:i/>
-          <w:color w:val="4A5568"/>
-          <w:lang w:val="pt-BR"/>
-        </w:rPr>
-        <w:t>Mas para que o DUAXIS consiga fazer isso de forma confiável, precisamos entender o que existe por trás dessas respostas.</w:t>
-      </w:r>
-      <w:r>
-        <w:rPr>
-          <w:rFonts w:ascii="Calibri" w:eastAsia="Calibri" w:hAnsi="Calibri"/>
-          <w:i/>
-          <w:color w:val="4A5568"/>
-          <w:lang w:val="pt-BR"/>
-        </w:rPr>
-        <w:t>”</w:t>
-      </w:r>
-    </w:p>
-    <w:p>
-      <w:pPr>
-        <w:spacing w:before="320" w:after="160"/>
+        <w:spacing w:before="320" w:after="0" w:line="360" w:lineRule="auto"/>
         <w:rPr>
           <w:lang w:val="pt-BR"/>
         </w:rPr>
@@ -1714,13 +1810,12 @@
           <w:sz w:val="32"/>
           <w:lang w:val="pt-BR"/>
         </w:rPr>
-        <w:lastRenderedPageBreak/>
         <w:t>Participante 3 — Dados + tecnologia</w:t>
       </w:r>
     </w:p>
     <w:p>
       <w:pPr>
-        <w:spacing w:after="80"/>
+        <w:spacing w:after="0" w:line="360" w:lineRule="auto"/>
         <w:rPr>
           <w:lang w:val="pt-BR"/>
         </w:rPr>
@@ -1744,7 +1839,7 @@
     </w:p>
     <w:p>
       <w:pPr>
-        <w:spacing w:after="80"/>
+        <w:spacing w:after="0" w:line="360" w:lineRule="auto"/>
         <w:rPr>
           <w:lang w:val="pt-BR"/>
         </w:rPr>
@@ -1768,7 +1863,7 @@
     </w:p>
     <w:p>
       <w:pPr>
-        <w:spacing w:before="240" w:after="120"/>
+        <w:spacing w:before="240" w:after="0" w:line="360" w:lineRule="auto"/>
         <w:rPr>
           <w:lang w:val="pt-BR"/>
         </w:rPr>
@@ -1781,53 +1876,153 @@
           <w:sz w:val="26"/>
           <w:lang w:val="pt-BR"/>
         </w:rPr>
-        <w:t>Fala</w:t>
+        <w:t xml:space="preserve">Dados: </w:t>
+      </w:r>
+      <w:r>
+        <w:rPr>
+          <w:rFonts w:ascii="Calibri" w:eastAsia="Calibri" w:hAnsi="Calibri"/>
+          <w:i/>
+          <w:color w:val="4A5568"/>
+          <w:lang w:val="pt-BR"/>
+        </w:rPr>
+        <w:t xml:space="preserve">Para o nosso </w:t>
+      </w:r>
+      <w:r>
+        <w:rPr>
+          <w:rFonts w:ascii="Calibri" w:eastAsia="Calibri" w:hAnsi="Calibri"/>
+          <w:i/>
+          <w:color w:val="4A5568"/>
+          <w:lang w:val="pt-BR"/>
+        </w:rPr>
+        <w:t>MVP</w:t>
+      </w:r>
+      <w:r>
+        <w:rPr>
+          <w:rFonts w:ascii="Calibri" w:eastAsia="Calibri" w:hAnsi="Calibri"/>
+          <w:i/>
+          <w:color w:val="4A5568"/>
+          <w:lang w:val="pt-BR"/>
+        </w:rPr>
+        <w:t xml:space="preserve"> criamos uma empresa fictícia de vareja de roupas,</w:t>
+      </w:r>
+      <w:r>
+        <w:rPr>
+          <w:rFonts w:ascii="Calibri" w:eastAsia="Calibri" w:hAnsi="Calibri"/>
+          <w:i/>
+          <w:color w:val="4A5568"/>
+          <w:lang w:val="pt-BR"/>
+        </w:rPr>
+        <w:t xml:space="preserve"> a </w:t>
+      </w:r>
+      <w:proofErr w:type="spellStart"/>
+      <w:r>
+        <w:rPr>
+          <w:rFonts w:ascii="Calibri" w:eastAsia="Calibri" w:hAnsi="Calibri"/>
+          <w:b/>
+          <w:i/>
+          <w:color w:val="4A5568"/>
+          <w:lang w:val="pt-BR"/>
+        </w:rPr>
+        <w:t>Urban</w:t>
+      </w:r>
+      <w:proofErr w:type="spellEnd"/>
+      <w:r>
+        <w:rPr>
+          <w:rFonts w:ascii="Calibri" w:eastAsia="Calibri" w:hAnsi="Calibri"/>
+          <w:b/>
+          <w:i/>
+          <w:color w:val="4A5568"/>
+          <w:lang w:val="pt-BR"/>
+        </w:rPr>
+        <w:t xml:space="preserve"> </w:t>
+      </w:r>
+      <w:proofErr w:type="spellStart"/>
+      <w:r>
+        <w:rPr>
+          <w:rFonts w:ascii="Calibri" w:eastAsia="Calibri" w:hAnsi="Calibri"/>
+          <w:b/>
+          <w:i/>
+          <w:color w:val="4A5568"/>
+          <w:lang w:val="pt-BR"/>
+        </w:rPr>
+        <w:t>Style</w:t>
+      </w:r>
+      <w:proofErr w:type="spellEnd"/>
+      <w:r>
+        <w:rPr>
+          <w:rFonts w:ascii="Calibri" w:eastAsia="Calibri" w:hAnsi="Calibri"/>
+          <w:i/>
+          <w:color w:val="4A5568"/>
+          <w:lang w:val="pt-BR"/>
+        </w:rPr>
+        <w:t xml:space="preserve">, </w:t>
+      </w:r>
+      <w:r>
+        <w:rPr>
+          <w:rFonts w:ascii="Calibri" w:eastAsia="Calibri" w:hAnsi="Calibri"/>
+          <w:i/>
+          <w:color w:val="4A5568"/>
+          <w:lang w:val="pt-BR"/>
+        </w:rPr>
+        <w:t>e simulamos 36 meses de operação,</w:t>
+      </w:r>
+      <w:r>
+        <w:rPr>
+          <w:rFonts w:ascii="Calibri" w:eastAsia="Calibri" w:hAnsi="Calibri"/>
+          <w:i/>
+          <w:color w:val="4A5568"/>
+          <w:lang w:val="pt-BR"/>
+        </w:rPr>
+        <w:t xml:space="preserve"> </w:t>
+      </w:r>
+      <w:r>
+        <w:rPr>
+          <w:rFonts w:ascii="Calibri" w:eastAsia="Calibri" w:hAnsi="Calibri"/>
+          <w:b/>
+          <w:i/>
+          <w:color w:val="4A5568"/>
+          <w:lang w:val="pt-BR"/>
+        </w:rPr>
+        <w:t>de agosto de 2023 a julho de 2026</w:t>
+      </w:r>
+      <w:r>
+        <w:rPr>
+          <w:rFonts w:ascii="Calibri" w:eastAsia="Calibri" w:hAnsi="Calibri"/>
+          <w:i/>
+          <w:color w:val="4A5568"/>
+          <w:lang w:val="pt-BR"/>
+        </w:rPr>
+        <w:t>.</w:t>
       </w:r>
     </w:p>
     <w:p>
       <w:pPr>
-        <w:spacing w:after="160" w:line="360" w:lineRule="auto"/>
-        <w:rPr>
-          <w:lang w:val="pt-BR"/>
-        </w:rPr>
-      </w:pPr>
-      <w:r>
-        <w:rPr>
-          <w:rFonts w:ascii="Calibri" w:eastAsia="Calibri" w:hAnsi="Calibri"/>
-          <w:i/>
-          <w:color w:val="4A5568"/>
-          <w:lang w:val="pt-BR"/>
-        </w:rPr>
-        <w:t xml:space="preserve">Para o nosso </w:t>
-      </w:r>
-      <w:r>
-        <w:rPr>
-          <w:rFonts w:ascii="Calibri" w:eastAsia="Calibri" w:hAnsi="Calibri"/>
-          <w:i/>
-          <w:color w:val="4A5568"/>
-          <w:lang w:val="pt-BR"/>
-        </w:rPr>
-        <w:t>MVP</w:t>
-      </w:r>
-      <w:r>
-        <w:rPr>
-          <w:rFonts w:ascii="Calibri" w:eastAsia="Calibri" w:hAnsi="Calibri"/>
-          <w:i/>
-          <w:color w:val="4A5568"/>
-          <w:lang w:val="pt-BR"/>
-        </w:rPr>
-        <w:t xml:space="preserve"> criamos uma empresa fictícia de vareja de roupas,</w:t>
-      </w:r>
-      <w:r>
-        <w:rPr>
-          <w:rFonts w:ascii="Calibri" w:eastAsia="Calibri" w:hAnsi="Calibri"/>
-          <w:i/>
-          <w:color w:val="4A5568"/>
-          <w:lang w:val="pt-BR"/>
-        </w:rPr>
-        <w:t xml:space="preserve"> a </w:t>
-      </w:r>
-      <w:proofErr w:type="spellStart"/>
+        <w:spacing w:after="0" w:line="360" w:lineRule="auto"/>
+        <w:rPr>
+          <w:rFonts w:ascii="Calibri" w:eastAsia="Calibri" w:hAnsi="Calibri"/>
+          <w:i/>
+          <w:color w:val="4A5568"/>
+          <w:lang w:val="pt-BR"/>
+        </w:rPr>
+      </w:pPr>
+      <w:r>
+        <w:rPr>
+          <w:rFonts w:ascii="Calibri" w:eastAsia="Calibri" w:hAnsi="Calibri"/>
+          <w:i/>
+          <w:color w:val="4A5568"/>
+          <w:lang w:val="pt-BR"/>
+        </w:rPr>
+        <w:t>Construímos bases representando</w:t>
+      </w:r>
+      <w:r>
+        <w:rPr>
+          <w:rFonts w:ascii="Calibri" w:eastAsia="Calibri" w:hAnsi="Calibri"/>
+          <w:i/>
+          <w:color w:val="4A5568"/>
+          <w:lang w:val="pt-BR"/>
+        </w:rPr>
+        <w:t xml:space="preserve"> </w:t>
+      </w:r>
       <w:r>
         <w:rPr>
           <w:rFonts w:ascii="Calibri" w:eastAsia="Calibri" w:hAnsi="Calibri"/>
@@ -1836,9 +2031,17 @@
           <w:color w:val="4A5568"/>
           <w:lang w:val="pt-BR"/>
         </w:rPr>
-        <w:t>Urban</w:t>
-      </w:r>
-      <w:proofErr w:type="spellEnd"/>
+        <w:t>financeiro</w:t>
+      </w:r>
+      <w:r>
+        <w:rPr>
+          <w:rFonts w:ascii="Calibri" w:eastAsia="Calibri" w:hAnsi="Calibri"/>
+          <w:i/>
+          <w:color w:val="4A5568"/>
+          <w:lang w:val="pt-BR"/>
+        </w:rPr>
+        <w:t xml:space="preserve"> e </w:t>
+      </w:r>
       <w:r>
         <w:rPr>
           <w:rFonts w:ascii="Calibri" w:eastAsia="Calibri" w:hAnsi="Calibri"/>
@@ -1847,340 +2050,245 @@
           <w:color w:val="4A5568"/>
           <w:lang w:val="pt-BR"/>
         </w:rPr>
-        <w:t xml:space="preserve"> </w:t>
-      </w:r>
-      <w:proofErr w:type="spellStart"/>
-      <w:r>
-        <w:rPr>
-          <w:rFonts w:ascii="Calibri" w:eastAsia="Calibri" w:hAnsi="Calibri"/>
-          <w:b/>
-          <w:i/>
-          <w:color w:val="4A5568"/>
-          <w:lang w:val="pt-BR"/>
-        </w:rPr>
-        <w:t>Style</w:t>
-      </w:r>
-      <w:proofErr w:type="spellEnd"/>
-      <w:r>
-        <w:rPr>
-          <w:rFonts w:ascii="Calibri" w:eastAsia="Calibri" w:hAnsi="Calibri"/>
-          <w:i/>
-          <w:color w:val="4A5568"/>
-          <w:lang w:val="pt-BR"/>
-        </w:rPr>
-        <w:t xml:space="preserve">, </w:t>
-      </w:r>
-      <w:r>
-        <w:rPr>
-          <w:rFonts w:ascii="Calibri" w:eastAsia="Calibri" w:hAnsi="Calibri"/>
-          <w:i/>
-          <w:color w:val="4A5568"/>
-          <w:lang w:val="pt-BR"/>
-        </w:rPr>
-        <w:t>e simulamos 36 meses de operação,</w:t>
-      </w:r>
-      <w:r>
-        <w:rPr>
-          <w:rFonts w:ascii="Calibri" w:eastAsia="Calibri" w:hAnsi="Calibri"/>
-          <w:i/>
-          <w:color w:val="4A5568"/>
-          <w:lang w:val="pt-BR"/>
-        </w:rPr>
-        <w:t xml:space="preserve"> </w:t>
-      </w:r>
-      <w:r>
-        <w:rPr>
-          <w:rFonts w:ascii="Calibri" w:eastAsia="Calibri" w:hAnsi="Calibri"/>
-          <w:b/>
-          <w:i/>
-          <w:color w:val="4A5568"/>
-          <w:lang w:val="pt-BR"/>
-        </w:rPr>
-        <w:t>de agosto de 2023 a julho de 2026</w:t>
-      </w:r>
-      <w:r>
-        <w:rPr>
-          <w:rFonts w:ascii="Calibri" w:eastAsia="Calibri" w:hAnsi="Calibri"/>
-          <w:i/>
-          <w:color w:val="4A5568"/>
-          <w:lang w:val="pt-BR"/>
-        </w:rPr>
-        <w:t>.</w:t>
+        <w:t>logística</w:t>
+      </w:r>
+      <w:r>
+        <w:rPr>
+          <w:rFonts w:ascii="Calibri" w:eastAsia="Calibri" w:hAnsi="Calibri"/>
+          <w:i/>
+          <w:color w:val="4A5568"/>
+          <w:lang w:val="pt-BR"/>
+        </w:rPr>
+        <w:t xml:space="preserve">: </w:t>
+      </w:r>
+      <w:r>
+        <w:rPr>
+          <w:rFonts w:ascii="Calibri" w:eastAsia="Calibri" w:hAnsi="Calibri"/>
+          <w:i/>
+          <w:color w:val="4A5568"/>
+          <w:lang w:val="pt-BR"/>
+        </w:rPr>
+        <w:t xml:space="preserve">com dados de </w:t>
+      </w:r>
+      <w:r>
+        <w:rPr>
+          <w:rFonts w:ascii="Calibri" w:eastAsia="Calibri" w:hAnsi="Calibri"/>
+          <w:i/>
+          <w:color w:val="4A5568"/>
+          <w:lang w:val="pt-BR"/>
+        </w:rPr>
+        <w:t>vendas, despesas, caixa, contas a receber</w:t>
+      </w:r>
+      <w:r>
+        <w:rPr>
+          <w:rFonts w:ascii="Calibri" w:eastAsia="Calibri" w:hAnsi="Calibri"/>
+          <w:i/>
+          <w:color w:val="4A5568"/>
+          <w:lang w:val="pt-BR"/>
+        </w:rPr>
+        <w:t xml:space="preserve"> e a </w:t>
+      </w:r>
+      <w:r>
+        <w:rPr>
+          <w:rFonts w:ascii="Calibri" w:eastAsia="Calibri" w:hAnsi="Calibri"/>
+          <w:i/>
+          <w:color w:val="4A5568"/>
+          <w:lang w:val="pt-BR"/>
+        </w:rPr>
+        <w:t>pagar, estoque, compras</w:t>
+      </w:r>
+      <w:r>
+        <w:rPr>
+          <w:rFonts w:ascii="Calibri" w:eastAsia="Calibri" w:hAnsi="Calibri"/>
+          <w:i/>
+          <w:color w:val="4A5568"/>
+          <w:lang w:val="pt-BR"/>
+        </w:rPr>
+        <w:t xml:space="preserve"> e</w:t>
+      </w:r>
+      <w:r>
+        <w:rPr>
+          <w:rFonts w:ascii="Calibri" w:eastAsia="Calibri" w:hAnsi="Calibri"/>
+          <w:i/>
+          <w:color w:val="4A5568"/>
+          <w:lang w:val="pt-BR"/>
+        </w:rPr>
+        <w:t xml:space="preserve"> fornecedores.</w:t>
       </w:r>
     </w:p>
     <w:p>
       <w:pPr>
-        <w:spacing w:after="160" w:line="360" w:lineRule="auto"/>
-        <w:rPr>
-          <w:rFonts w:ascii="Calibri" w:eastAsia="Calibri" w:hAnsi="Calibri"/>
-          <w:i/>
-          <w:color w:val="4A5568"/>
-          <w:lang w:val="pt-BR"/>
-        </w:rPr>
-      </w:pPr>
-      <w:r>
-        <w:rPr>
-          <w:rFonts w:ascii="Calibri" w:eastAsia="Calibri" w:hAnsi="Calibri"/>
-          <w:i/>
-          <w:color w:val="4A5568"/>
-          <w:lang w:val="pt-BR"/>
-        </w:rPr>
-        <w:t>Construímos bases representando</w:t>
-      </w:r>
-      <w:r>
-        <w:rPr>
-          <w:rFonts w:ascii="Calibri" w:eastAsia="Calibri" w:hAnsi="Calibri"/>
-          <w:i/>
-          <w:color w:val="4A5568"/>
-          <w:lang w:val="pt-BR"/>
-        </w:rPr>
-        <w:t xml:space="preserve"> </w:t>
-      </w:r>
-      <w:r>
-        <w:rPr>
-          <w:rFonts w:ascii="Calibri" w:eastAsia="Calibri" w:hAnsi="Calibri"/>
-          <w:b/>
-          <w:i/>
-          <w:color w:val="4A5568"/>
-          <w:lang w:val="pt-BR"/>
-        </w:rPr>
-        <w:t>financeiro</w:t>
-      </w:r>
-      <w:r>
-        <w:rPr>
-          <w:rFonts w:ascii="Calibri" w:eastAsia="Calibri" w:hAnsi="Calibri"/>
-          <w:i/>
-          <w:color w:val="4A5568"/>
-          <w:lang w:val="pt-BR"/>
-        </w:rPr>
-        <w:t xml:space="preserve"> e </w:t>
-      </w:r>
-      <w:r>
-        <w:rPr>
-          <w:rFonts w:ascii="Calibri" w:eastAsia="Calibri" w:hAnsi="Calibri"/>
-          <w:b/>
-          <w:i/>
-          <w:color w:val="4A5568"/>
-          <w:lang w:val="pt-BR"/>
-        </w:rPr>
-        <w:t>logística</w:t>
-      </w:r>
-      <w:r>
-        <w:rPr>
-          <w:rFonts w:ascii="Calibri" w:eastAsia="Calibri" w:hAnsi="Calibri"/>
-          <w:i/>
-          <w:color w:val="4A5568"/>
-          <w:lang w:val="pt-BR"/>
-        </w:rPr>
-        <w:t xml:space="preserve">: </w:t>
-      </w:r>
-      <w:r>
-        <w:rPr>
-          <w:rFonts w:ascii="Calibri" w:eastAsia="Calibri" w:hAnsi="Calibri"/>
-          <w:i/>
-          <w:color w:val="4A5568"/>
-          <w:lang w:val="pt-BR"/>
-        </w:rPr>
-        <w:t xml:space="preserve">com dados de </w:t>
-      </w:r>
-      <w:r>
-        <w:rPr>
-          <w:rFonts w:ascii="Calibri" w:eastAsia="Calibri" w:hAnsi="Calibri"/>
-          <w:i/>
-          <w:color w:val="4A5568"/>
-          <w:lang w:val="pt-BR"/>
-        </w:rPr>
-        <w:t>vendas, despesas, caixa, contas a receber</w:t>
-      </w:r>
-      <w:r>
-        <w:rPr>
-          <w:rFonts w:ascii="Calibri" w:eastAsia="Calibri" w:hAnsi="Calibri"/>
-          <w:i/>
-          <w:color w:val="4A5568"/>
-          <w:lang w:val="pt-BR"/>
-        </w:rPr>
-        <w:t xml:space="preserve"> e a </w:t>
-      </w:r>
-      <w:r>
-        <w:rPr>
-          <w:rFonts w:ascii="Calibri" w:eastAsia="Calibri" w:hAnsi="Calibri"/>
-          <w:i/>
-          <w:color w:val="4A5568"/>
-          <w:lang w:val="pt-BR"/>
-        </w:rPr>
-        <w:t>pagar, estoque, compras</w:t>
-      </w:r>
-      <w:r>
-        <w:rPr>
-          <w:rFonts w:ascii="Calibri" w:eastAsia="Calibri" w:hAnsi="Calibri"/>
-          <w:i/>
-          <w:color w:val="4A5568"/>
-          <w:lang w:val="pt-BR"/>
-        </w:rPr>
-        <w:t xml:space="preserve"> e</w:t>
-      </w:r>
-      <w:r>
-        <w:rPr>
-          <w:rFonts w:ascii="Calibri" w:eastAsia="Calibri" w:hAnsi="Calibri"/>
-          <w:i/>
-          <w:color w:val="4A5568"/>
-          <w:lang w:val="pt-BR"/>
-        </w:rPr>
-        <w:t xml:space="preserve"> fornecedores.</w:t>
+        <w:spacing w:after="0" w:line="360" w:lineRule="auto"/>
+        <w:rPr>
+          <w:rFonts w:ascii="Calibri" w:eastAsia="Calibri" w:hAnsi="Calibri"/>
+          <w:i/>
+          <w:color w:val="4A5568"/>
+          <w:lang w:val="pt-BR"/>
+        </w:rPr>
+      </w:pPr>
+      <w:r>
+        <w:rPr>
+          <w:rFonts w:ascii="Calibri" w:eastAsia="Calibri" w:hAnsi="Calibri"/>
+          <w:i/>
+          <w:color w:val="4A5568"/>
+          <w:lang w:val="pt-BR"/>
+        </w:rPr>
+        <w:t>Esses dados representam diferentes fontes que, em um cenário real, poderiam estar distribuídos entre sistemas diferentes</w:t>
+      </w:r>
+      <w:r>
+        <w:rPr>
+          <w:rFonts w:ascii="Calibri" w:eastAsia="Calibri" w:hAnsi="Calibri"/>
+          <w:i/>
+          <w:color w:val="4A5568"/>
+          <w:lang w:val="pt-BR"/>
+        </w:rPr>
+        <w:t>.</w:t>
       </w:r>
     </w:p>
     <w:p>
       <w:pPr>
-        <w:spacing w:after="160" w:line="360" w:lineRule="auto"/>
-        <w:rPr>
-          <w:rFonts w:ascii="Calibri" w:eastAsia="Calibri" w:hAnsi="Calibri"/>
-          <w:i/>
-          <w:color w:val="4A5568"/>
-          <w:lang w:val="pt-BR"/>
-        </w:rPr>
-      </w:pPr>
-      <w:r>
-        <w:rPr>
-          <w:rFonts w:ascii="Calibri" w:eastAsia="Calibri" w:hAnsi="Calibri"/>
-          <w:i/>
-          <w:color w:val="4A5568"/>
-          <w:lang w:val="pt-BR"/>
-        </w:rPr>
-        <w:t>Esses dados representam diferentes fontes que, em um cenário real, poderiam estar distribuídos entre sistemas diferentes</w:t>
-      </w:r>
-      <w:r>
-        <w:rPr>
-          <w:rFonts w:ascii="Calibri" w:eastAsia="Calibri" w:hAnsi="Calibri"/>
-          <w:i/>
-          <w:color w:val="4A5568"/>
-          <w:lang w:val="pt-BR"/>
-        </w:rPr>
-        <w:t>.</w:t>
+        <w:spacing w:after="0" w:line="360" w:lineRule="auto"/>
+        <w:rPr>
+          <w:rFonts w:ascii="Calibri" w:eastAsia="Calibri" w:hAnsi="Calibri"/>
+          <w:i/>
+          <w:color w:val="4A5568"/>
+          <w:lang w:val="pt-BR"/>
+        </w:rPr>
+      </w:pPr>
+      <w:r>
+        <w:rPr>
+          <w:rFonts w:ascii="Calibri" w:eastAsia="Calibri" w:hAnsi="Calibri"/>
+          <w:b/>
+          <w:color w:val="1E3A5F"/>
+          <w:sz w:val="26"/>
+          <w:lang w:val="pt-BR"/>
+        </w:rPr>
+        <w:t>Tecnologia</w:t>
+      </w:r>
+      <w:r>
+        <w:rPr>
+          <w:rFonts w:ascii="Calibri" w:eastAsia="Calibri" w:hAnsi="Calibri"/>
+          <w:b/>
+          <w:color w:val="1E3A5F"/>
+          <w:sz w:val="26"/>
+          <w:lang w:val="pt-BR"/>
+        </w:rPr>
+        <w:t xml:space="preserve">: </w:t>
+      </w:r>
+      <w:r>
+        <w:rPr>
+          <w:rFonts w:ascii="Calibri" w:eastAsia="Calibri" w:hAnsi="Calibri"/>
+          <w:i/>
+          <w:color w:val="4A5568"/>
+          <w:lang w:val="pt-BR"/>
+        </w:rPr>
+        <w:t>O DUAXIS trabalha de dois jeitos.</w:t>
       </w:r>
     </w:p>
     <w:p>
       <w:pPr>
-        <w:spacing w:after="160" w:line="360" w:lineRule="auto"/>
-        <w:rPr>
-          <w:rFonts w:ascii="Calibri" w:eastAsia="Calibri" w:hAnsi="Calibri"/>
-          <w:i/>
-          <w:color w:val="4A5568"/>
-          <w:lang w:val="pt-BR"/>
-        </w:rPr>
-      </w:pPr>
-      <w:r>
-        <w:rPr>
-          <w:rFonts w:ascii="Calibri" w:eastAsia="Calibri" w:hAnsi="Calibri"/>
-          <w:i/>
-          <w:color w:val="4A5568"/>
-          <w:lang w:val="pt-BR"/>
-        </w:rPr>
-        <w:t>O DUAXIS trabalha de dois jeitos.</w:t>
+        <w:spacing w:after="0" w:line="360" w:lineRule="auto"/>
+        <w:rPr>
+          <w:rFonts w:ascii="Calibri" w:eastAsia="Calibri" w:hAnsi="Calibri"/>
+          <w:i/>
+          <w:color w:val="4A5568"/>
+          <w:lang w:val="pt-BR"/>
+        </w:rPr>
+      </w:pPr>
+      <w:r>
+        <w:rPr>
+          <w:rFonts w:ascii="Calibri" w:eastAsia="Calibri" w:hAnsi="Calibri"/>
+          <w:i/>
+          <w:color w:val="4A5568"/>
+          <w:lang w:val="pt-BR"/>
+        </w:rPr>
+        <w:lastRenderedPageBreak/>
+        <w:t>Quando a pergunta é sobre o que já aconteceu — faturamento, lucro, despesa — o sistema calcula com o que está na base. A inteligência artificial explica o resultado. Ela não inventa o número.</w:t>
       </w:r>
     </w:p>
     <w:p>
       <w:pPr>
-        <w:spacing w:after="160" w:line="360" w:lineRule="auto"/>
-        <w:rPr>
-          <w:rFonts w:ascii="Calibri" w:eastAsia="Calibri" w:hAnsi="Calibri"/>
-          <w:i/>
-          <w:color w:val="4A5568"/>
-          <w:lang w:val="pt-BR"/>
-        </w:rPr>
-      </w:pPr>
-      <w:r>
-        <w:rPr>
-          <w:rFonts w:ascii="Calibri" w:eastAsia="Calibri" w:hAnsi="Calibri"/>
-          <w:i/>
-          <w:color w:val="4A5568"/>
-          <w:lang w:val="pt-BR"/>
-        </w:rPr>
-        <w:t>Quando a pergunta é sobre o que já aconteceu — faturamento, lucro, despesa — o sistema calcula com o que está na base. A inteligência artificial explica o resultado. Ela não inventa o número.</w:t>
+        <w:spacing w:after="0" w:line="360" w:lineRule="auto"/>
+        <w:rPr>
+          <w:rFonts w:ascii="Calibri" w:eastAsia="Calibri" w:hAnsi="Calibri"/>
+          <w:i/>
+          <w:color w:val="4A5568"/>
+          <w:lang w:val="pt-BR"/>
+        </w:rPr>
+      </w:pPr>
+      <w:r>
+        <w:rPr>
+          <w:rFonts w:ascii="Calibri" w:eastAsia="Calibri" w:hAnsi="Calibri"/>
+          <w:i/>
+          <w:color w:val="4A5568"/>
+          <w:lang w:val="pt-BR"/>
+        </w:rPr>
+        <w:t>Quando a pergunta é sobre o que pode faltar no estoque, aí sim entra um modelo que nós treinamos: ele olha o histórico de vendas e estima a demanda dos próximos períodos, para indicar o que repor. Isso é uma estimativa, não um fato. Por isso usamos só na reposição — não para contar o que já aconteceu em maio ou junho.</w:t>
       </w:r>
     </w:p>
     <w:p>
       <w:pPr>
-        <w:spacing w:after="160" w:line="360" w:lineRule="auto"/>
-        <w:rPr>
-          <w:rFonts w:ascii="Calibri" w:eastAsia="Calibri" w:hAnsi="Calibri"/>
-          <w:i/>
-          <w:color w:val="4A5568"/>
-          <w:lang w:val="pt-BR"/>
-        </w:rPr>
-      </w:pPr>
-      <w:r>
-        <w:rPr>
-          <w:rFonts w:ascii="Calibri" w:eastAsia="Calibri" w:hAnsi="Calibri"/>
-          <w:i/>
-          <w:color w:val="4A5568"/>
-          <w:lang w:val="pt-BR"/>
-        </w:rPr>
-        <w:t>Quando a pergunta é sobre o que pode faltar no estoque, aí sim entra um modelo que nós treinamos: ele olha o histórico de vendas e estima a demanda dos próximos períodos, para indicar o que repor. Isso é uma estimativa, não um fato. Por isso usamos só na reposição — não para contar o que já aconteceu em maio ou junho.</w:t>
+        <w:spacing w:after="0" w:line="360" w:lineRule="auto"/>
+        <w:rPr>
+          <w:rFonts w:ascii="Calibri" w:eastAsia="Calibri" w:hAnsi="Calibri"/>
+          <w:i/>
+          <w:color w:val="4A5568"/>
+          <w:lang w:val="pt-BR"/>
+        </w:rPr>
+      </w:pPr>
+      <w:r>
+        <w:rPr>
+          <w:rFonts w:ascii="Calibri" w:eastAsia="Calibri" w:hAnsi="Calibri"/>
+          <w:i/>
+          <w:color w:val="4A5568"/>
+          <w:lang w:val="pt-BR"/>
+        </w:rPr>
+        <w:t>Cada resposta na tela mostra de onde veio o número, o período, quantos registros entram na conta e o que essa análise não cobre. O gestor também pode levar isso em PDF.</w:t>
       </w:r>
     </w:p>
     <w:p>
       <w:pPr>
-        <w:spacing w:after="160" w:line="360" w:lineRule="auto"/>
-        <w:rPr>
-          <w:rFonts w:ascii="Calibri" w:eastAsia="Calibri" w:hAnsi="Calibri"/>
-          <w:i/>
-          <w:color w:val="4A5568"/>
-          <w:lang w:val="pt-BR"/>
-        </w:rPr>
-      </w:pPr>
-      <w:r>
-        <w:rPr>
-          <w:rFonts w:ascii="Calibri" w:eastAsia="Calibri" w:hAnsi="Calibri"/>
-          <w:i/>
-          <w:color w:val="4A5568"/>
-          <w:lang w:val="pt-BR"/>
-        </w:rPr>
-        <w:t>Cada resposta na tela mostra de onde veio o número, o período, quantos registros entram na conta e o que essa análise não cobre. O gestor também pode levar isso em PDF.</w:t>
+        <w:spacing w:after="0" w:line="360" w:lineRule="auto"/>
+        <w:rPr>
+          <w:rFonts w:ascii="Calibri" w:eastAsia="Calibri" w:hAnsi="Calibri"/>
+          <w:i/>
+          <w:color w:val="4A5568"/>
+          <w:lang w:val="pt-BR"/>
+        </w:rPr>
+      </w:pPr>
+      <w:r>
+        <w:rPr>
+          <w:rFonts w:ascii="Calibri" w:eastAsia="Calibri" w:hAnsi="Calibri"/>
+          <w:i/>
+          <w:color w:val="4A5568"/>
+          <w:lang w:val="pt-BR"/>
+        </w:rPr>
+        <w:t xml:space="preserve">Antes de qualquer análise, os dados passam por uma </w:t>
+      </w:r>
+      <w:r>
+        <w:rPr>
+          <w:rFonts w:ascii="Calibri" w:eastAsia="Calibri" w:hAnsi="Calibri"/>
+          <w:b/>
+          <w:bCs/>
+          <w:i/>
+          <w:color w:val="4A5568"/>
+          <w:lang w:val="pt-BR"/>
+        </w:rPr>
+        <w:t>camada de validação</w:t>
+      </w:r>
+      <w:r>
+        <w:rPr>
+          <w:rFonts w:ascii="Calibri" w:eastAsia="Calibri" w:hAnsi="Calibri"/>
+          <w:i/>
+          <w:color w:val="4A5568"/>
+          <w:lang w:val="pt-BR"/>
+        </w:rPr>
+        <w:t>.</w:t>
       </w:r>
     </w:p>
     <w:p>
       <w:pPr>
-        <w:spacing w:after="160" w:line="360" w:lineRule="auto"/>
-        <w:rPr>
-          <w:rFonts w:ascii="Calibri" w:eastAsia="Calibri" w:hAnsi="Calibri"/>
-          <w:i/>
-          <w:color w:val="4A5568"/>
-          <w:lang w:val="pt-BR"/>
-        </w:rPr>
-      </w:pPr>
-      <w:r>
-        <w:rPr>
-          <w:rFonts w:ascii="Calibri" w:eastAsia="Calibri" w:hAnsi="Calibri"/>
-          <w:i/>
-          <w:color w:val="4A5568"/>
-          <w:lang w:val="pt-BR"/>
-        </w:rPr>
-        <w:t xml:space="preserve">Antes de qualquer análise, os dados passam por uma </w:t>
-      </w:r>
-      <w:r>
-        <w:rPr>
-          <w:rFonts w:ascii="Calibri" w:eastAsia="Calibri" w:hAnsi="Calibri"/>
-          <w:b/>
-          <w:bCs/>
-          <w:i/>
-          <w:color w:val="4A5568"/>
-          <w:lang w:val="pt-BR"/>
-        </w:rPr>
-        <w:t>camada de validação</w:t>
-      </w:r>
-      <w:r>
-        <w:rPr>
-          <w:rFonts w:ascii="Calibri" w:eastAsia="Calibri" w:hAnsi="Calibri"/>
-          <w:i/>
-          <w:color w:val="4A5568"/>
-          <w:lang w:val="pt-BR"/>
-        </w:rPr>
-        <w:t>.</w:t>
-      </w:r>
-    </w:p>
-    <w:p>
-      <w:pPr>
-        <w:spacing w:after="160" w:line="360" w:lineRule="auto"/>
+        <w:spacing w:after="0" w:line="360" w:lineRule="auto"/>
         <w:rPr>
           <w:rFonts w:ascii="Calibri" w:eastAsia="Calibri" w:hAnsi="Calibri"/>
           <w:i/>
@@ -2204,7 +2312,7 @@
           <w:ilvl w:val="0"/>
           <w:numId w:val="10"/>
         </w:numPr>
-        <w:spacing w:after="160" w:line="360" w:lineRule="auto"/>
+        <w:spacing w:after="0" w:line="360" w:lineRule="auto"/>
         <w:rPr>
           <w:rFonts w:ascii="Calibri" w:eastAsia="Calibri" w:hAnsi="Calibri"/>
           <w:i/>
@@ -2248,7 +2356,7 @@
           <w:ilvl w:val="0"/>
           <w:numId w:val="10"/>
         </w:numPr>
-        <w:spacing w:after="160" w:line="360" w:lineRule="auto"/>
+        <w:spacing w:after="0" w:line="360" w:lineRule="auto"/>
         <w:rPr>
           <w:rFonts w:ascii="Calibri" w:eastAsia="Calibri" w:hAnsi="Calibri"/>
           <w:i/>
@@ -2283,7 +2391,7 @@
           <w:ilvl w:val="0"/>
           <w:numId w:val="10"/>
         </w:numPr>
-        <w:spacing w:after="160" w:line="360" w:lineRule="auto"/>
+        <w:spacing w:after="0" w:line="360" w:lineRule="auto"/>
         <w:rPr>
           <w:rFonts w:ascii="Calibri" w:eastAsia="Calibri" w:hAnsi="Calibri"/>
           <w:i/>
@@ -2318,7 +2426,7 @@
           <w:ilvl w:val="0"/>
           <w:numId w:val="10"/>
         </w:numPr>
-        <w:spacing w:after="160" w:line="360" w:lineRule="auto"/>
+        <w:spacing w:after="0" w:line="360" w:lineRule="auto"/>
         <w:rPr>
           <w:rFonts w:ascii="Calibri" w:eastAsia="Calibri" w:hAnsi="Calibri"/>
           <w:i/>
@@ -2353,7 +2461,7 @@
           <w:ilvl w:val="0"/>
           <w:numId w:val="10"/>
         </w:numPr>
-        <w:spacing w:after="160" w:line="360" w:lineRule="auto"/>
+        <w:spacing w:after="0" w:line="360" w:lineRule="auto"/>
         <w:rPr>
           <w:rFonts w:ascii="Calibri" w:eastAsia="Calibri" w:hAnsi="Calibri"/>
           <w:i/>
@@ -2404,28 +2512,27 @@
     </w:p>
     <w:p>
       <w:pPr>
-        <w:spacing w:after="160" w:line="360" w:lineRule="auto"/>
-        <w:rPr>
-          <w:rFonts w:ascii="Calibri" w:eastAsia="Calibri" w:hAnsi="Calibri"/>
-          <w:i/>
-          <w:color w:val="4A5568"/>
-          <w:lang w:val="pt-BR"/>
-        </w:rPr>
-      </w:pPr>
-      <w:r>
-        <w:rPr>
-          <w:rFonts w:ascii="Calibri" w:eastAsia="Calibri" w:hAnsi="Calibri"/>
-          <w:i/>
-          <w:color w:val="4A5568"/>
-          <w:lang w:val="pt-BR"/>
-        </w:rPr>
-        <w:lastRenderedPageBreak/>
+        <w:spacing w:after="0" w:line="360" w:lineRule="auto"/>
+        <w:rPr>
+          <w:rFonts w:ascii="Calibri" w:eastAsia="Calibri" w:hAnsi="Calibri"/>
+          <w:i/>
+          <w:color w:val="4A5568"/>
+          <w:lang w:val="pt-BR"/>
+        </w:rPr>
+      </w:pPr>
+      <w:r>
+        <w:rPr>
+          <w:rFonts w:ascii="Calibri" w:eastAsia="Calibri" w:hAnsi="Calibri"/>
+          <w:i/>
+          <w:color w:val="4A5568"/>
+          <w:lang w:val="pt-BR"/>
+        </w:rPr>
         <w:t>Isso é importante porque o DUAXIS não deve simplesmente gerar uma resposta quando os dados não são suficientes ou confiáveis.</w:t>
       </w:r>
     </w:p>
     <w:p>
       <w:pPr>
-        <w:spacing w:after="160" w:line="360" w:lineRule="auto"/>
+        <w:spacing w:after="0" w:line="360" w:lineRule="auto"/>
         <w:rPr>
           <w:lang w:val="pt-BR"/>
         </w:rPr>
@@ -2465,12 +2572,12 @@
           <w:color w:val="4A5568"/>
           <w:lang w:val="pt-BR"/>
         </w:rPr>
-        <w:t>. Relatório em PDF a partir dos cards.</w:t>
+        <w:t>.</w:t>
       </w:r>
     </w:p>
     <w:p>
       <w:pPr>
-        <w:spacing w:after="160" w:line="360" w:lineRule="auto"/>
+        <w:spacing w:after="0" w:line="360" w:lineRule="auto"/>
         <w:rPr>
           <w:lang w:val="pt-BR"/>
         </w:rPr>
@@ -2505,7 +2612,7 @@
     </w:p>
     <w:p>
       <w:pPr>
-        <w:spacing w:before="320" w:after="160"/>
+        <w:spacing w:before="320" w:after="0" w:line="360" w:lineRule="auto"/>
         <w:rPr>
           <w:lang w:val="pt-BR"/>
         </w:rPr>
@@ -2523,7 +2630,7 @@
     </w:p>
     <w:p>
       <w:pPr>
-        <w:spacing w:after="80"/>
+        <w:spacing w:after="0" w:line="360" w:lineRule="auto"/>
         <w:rPr>
           <w:lang w:val="pt-BR"/>
         </w:rPr>
@@ -2547,7 +2654,7 @@
     </w:p>
     <w:p>
       <w:pPr>
-        <w:spacing w:after="80"/>
+        <w:spacing w:after="0" w:line="360" w:lineRule="auto"/>
         <w:rPr>
           <w:lang w:val="pt-BR"/>
         </w:rPr>
@@ -2571,7 +2678,7 @@
     </w:p>
     <w:p>
       <w:pPr>
-        <w:spacing w:after="160" w:line="360" w:lineRule="auto"/>
+        <w:spacing w:after="0" w:line="360" w:lineRule="auto"/>
         <w:rPr>
           <w:rFonts w:ascii="Calibri" w:eastAsia="Calibri" w:hAnsi="Calibri"/>
           <w:b/>
@@ -2593,7 +2700,7 @@
     </w:p>
     <w:p>
       <w:pPr>
-        <w:spacing w:after="160" w:line="360" w:lineRule="auto"/>
+        <w:spacing w:after="0" w:line="360" w:lineRule="auto"/>
         <w:rPr>
           <w:rFonts w:ascii="Calibri" w:eastAsia="Calibri" w:hAnsi="Calibri"/>
           <w:bCs/>
@@ -2613,7 +2720,7 @@
     </w:p>
     <w:p>
       <w:pPr>
-        <w:spacing w:after="160" w:line="360" w:lineRule="auto"/>
+        <w:spacing w:after="0" w:line="360" w:lineRule="auto"/>
         <w:rPr>
           <w:rFonts w:ascii="Calibri" w:eastAsia="Calibri" w:hAnsi="Calibri"/>
           <w:b/>
@@ -2635,7 +2742,7 @@
     </w:p>
     <w:p>
       <w:pPr>
-        <w:spacing w:after="160" w:line="360" w:lineRule="auto"/>
+        <w:spacing w:after="0" w:line="360" w:lineRule="auto"/>
         <w:rPr>
           <w:rFonts w:ascii="Calibri" w:eastAsia="Calibri" w:hAnsi="Calibri"/>
           <w:b/>
@@ -2655,7 +2762,7 @@
     </w:p>
     <w:p>
       <w:pPr>
-        <w:spacing w:after="160" w:line="360" w:lineRule="auto"/>
+        <w:spacing w:after="0" w:line="360" w:lineRule="auto"/>
         <w:rPr>
           <w:rFonts w:ascii="Calibri" w:eastAsia="Calibri" w:hAnsi="Calibri"/>
           <w:bCs/>
@@ -2677,7 +2784,7 @@
     </w:p>
     <w:p>
       <w:pPr>
-        <w:spacing w:after="160" w:line="360" w:lineRule="auto"/>
+        <w:spacing w:after="0" w:line="360" w:lineRule="auto"/>
         <w:rPr>
           <w:rFonts w:ascii="Calibri" w:eastAsia="Calibri" w:hAnsi="Calibri"/>
           <w:b/>
@@ -2697,7 +2804,7 @@
     </w:p>
     <w:p>
       <w:pPr>
-        <w:spacing w:after="160" w:line="360" w:lineRule="auto"/>
+        <w:spacing w:after="0" w:line="360" w:lineRule="auto"/>
         <w:rPr>
           <w:rFonts w:ascii="Calibri" w:eastAsia="Calibri" w:hAnsi="Calibri"/>
           <w:bCs/>
@@ -2741,7 +2848,7 @@
     </w:p>
     <w:p>
       <w:pPr>
-        <w:spacing w:after="160" w:line="360" w:lineRule="auto"/>
+        <w:spacing w:after="0" w:line="360" w:lineRule="auto"/>
         <w:rPr>
           <w:rFonts w:ascii="Calibri" w:eastAsia="Calibri" w:hAnsi="Calibri"/>
           <w:b/>
@@ -2763,7 +2870,7 @@
     </w:p>
     <w:p>
       <w:pPr>
-        <w:spacing w:after="160" w:line="360" w:lineRule="auto"/>
+        <w:spacing w:after="0" w:line="360" w:lineRule="auto"/>
         <w:rPr>
           <w:rFonts w:ascii="Calibri" w:eastAsia="Calibri" w:hAnsi="Calibri"/>
           <w:b/>
@@ -2778,12 +2885,13 @@
           <w:color w:val="1E3A5F"/>
           <w:lang w:val="pt-BR"/>
         </w:rPr>
+        <w:lastRenderedPageBreak/>
         <w:t>[clicar Fontes de Dados no menu]</w:t>
       </w:r>
     </w:p>
     <w:p>
       <w:pPr>
-        <w:spacing w:after="160" w:line="360" w:lineRule="auto"/>
+        <w:spacing w:after="0" w:line="360" w:lineRule="auto"/>
         <w:rPr>
           <w:rFonts w:ascii="Calibri" w:eastAsia="Calibri" w:hAnsi="Calibri"/>
           <w:bCs/>
@@ -2877,7 +2985,7 @@
     </w:p>
     <w:p>
       <w:pPr>
-        <w:spacing w:after="160" w:line="360" w:lineRule="auto"/>
+        <w:spacing w:after="0" w:line="360" w:lineRule="auto"/>
         <w:rPr>
           <w:rFonts w:ascii="Calibri" w:eastAsia="Calibri" w:hAnsi="Calibri"/>
           <w:b/>
@@ -2899,7 +3007,7 @@
     </w:p>
     <w:p>
       <w:pPr>
-        <w:spacing w:after="160" w:line="360" w:lineRule="auto"/>
+        <w:spacing w:after="0" w:line="360" w:lineRule="auto"/>
         <w:rPr>
           <w:rFonts w:ascii="Calibri" w:eastAsia="Calibri" w:hAnsi="Calibri"/>
           <w:b/>
@@ -2919,7 +3027,7 @@
     </w:p>
     <w:p>
       <w:pPr>
-        <w:spacing w:after="160" w:line="360" w:lineRule="auto"/>
+        <w:spacing w:after="0" w:line="360" w:lineRule="auto"/>
         <w:rPr>
           <w:rFonts w:ascii="Calibri" w:eastAsia="Calibri" w:hAnsi="Calibri"/>
           <w:bCs/>
@@ -2936,12 +3044,34 @@
           <w:color w:val="1E3A5F"/>
           <w:lang w:val="pt-BR"/>
         </w:rPr>
-        <w:t>Agora a mesma base, em pergunta. Três perguntas de gestor.</w:t>
+        <w:t xml:space="preserve">Agora a mesma base, </w:t>
+      </w:r>
+      <w:r>
+        <w:rPr>
+          <w:rFonts w:ascii="Calibri" w:eastAsia="Calibri" w:hAnsi="Calibri"/>
+          <w:bCs/>
+          <w:i/>
+          <w:iCs/>
+          <w:color w:val="1E3A5F"/>
+          <w:lang w:val="pt-BR"/>
+        </w:rPr>
+        <w:t>vamos simular três perguntas do gestor</w:t>
+      </w:r>
+      <w:r>
+        <w:rPr>
+          <w:rFonts w:ascii="Calibri" w:eastAsia="Calibri" w:hAnsi="Calibri"/>
+          <w:bCs/>
+          <w:i/>
+          <w:iCs/>
+          <w:color w:val="1E3A5F"/>
+          <w:lang w:val="pt-BR"/>
+        </w:rPr>
+        <w:t>.</w:t>
       </w:r>
     </w:p>
     <w:p>
       <w:pPr>
-        <w:spacing w:after="160" w:line="360" w:lineRule="auto"/>
+        <w:spacing w:after="0" w:line="360" w:lineRule="auto"/>
         <w:rPr>
           <w:rFonts w:ascii="Calibri" w:eastAsia="Calibri" w:hAnsi="Calibri"/>
           <w:bCs/>
@@ -2966,7 +3096,24 @@
           <w:lang w:val="pt-BR"/>
         </w:rPr>
         <w:br/>
-        <w:t> [colar e enviar] </w:t>
+      </w:r>
+      <w:r>
+        <w:rPr>
+          <w:rFonts w:ascii="Calibri" w:eastAsia="Calibri" w:hAnsi="Calibri"/>
+          <w:b/>
+          <w:color w:val="1E3A5F"/>
+          <w:lang w:val="pt-BR"/>
+        </w:rPr>
+        <w:t>Exemplo:</w:t>
+      </w:r>
+      <w:r>
+        <w:rPr>
+          <w:rFonts w:ascii="Calibri" w:eastAsia="Calibri" w:hAnsi="Calibri"/>
+          <w:b/>
+          <w:color w:val="1E3A5F"/>
+          <w:lang w:val="pt-BR"/>
+        </w:rPr>
+        <w:t> </w:t>
       </w:r>
       <w:r>
         <w:rPr>
@@ -2985,7 +3132,17 @@
           <w:lang w:val="pt-BR"/>
         </w:rPr>
         <w:br/>
-        <w:t> [enquanto carrega] </w:t>
+        <w:t>[enquanto carrega</w:t>
+      </w:r>
+      <w:proofErr w:type="gramStart"/>
+      <w:r>
+        <w:rPr>
+          <w:rFonts w:ascii="Calibri" w:eastAsia="Calibri" w:hAnsi="Calibri"/>
+          <w:b/>
+          <w:color w:val="1E3A5F"/>
+          <w:lang w:val="pt-BR"/>
+        </w:rPr>
+        <w:t>] </w:t>
       </w:r>
       <w:r>
         <w:rPr>
@@ -2996,7 +3153,19 @@
           <w:color w:val="1E3A5F"/>
           <w:lang w:val="pt-BR"/>
         </w:rPr>
-        <w:t>Isso é o que já aconteceu. O sistema soma as vendas de junho; a IA só resume.</w:t>
+        <w:t>Isso</w:t>
+      </w:r>
+      <w:proofErr w:type="gramEnd"/>
+      <w:r>
+        <w:rPr>
+          <w:rFonts w:ascii="Calibri" w:eastAsia="Calibri" w:hAnsi="Calibri"/>
+          <w:bCs/>
+          <w:i/>
+          <w:iCs/>
+          <w:color w:val="1E3A5F"/>
+          <w:lang w:val="pt-BR"/>
+        </w:rPr>
+        <w:t xml:space="preserve"> é o que já aconteceu. O sistema soma as vendas de junho; a IA só resume.</w:t>
       </w:r>
       <w:r>
         <w:rPr>
@@ -3006,6 +3175,7 @@
           <w:lang w:val="pt-BR"/>
         </w:rPr>
         <w:br/>
+        <w:t>[quando aparecer: apontar o valor, depois o bloco CONFIABILIDADE DA ANÁLISE]</w:t>
       </w:r>
       <w:r>
         <w:rPr>
@@ -3014,9 +3184,30 @@
           <w:color w:val="1E3A5F"/>
           <w:lang w:val="pt-BR"/>
         </w:rPr>
-        <w:lastRenderedPageBreak/>
-        <w:t> [quando aparecer: apontar o valor, depois o bloco CONFIABILIDADE DA ANÁLISE]</w:t>
-      </w:r>
+        <w:br/>
+      </w:r>
+      <w:r>
+        <w:rPr>
+          <w:rFonts w:ascii="Calibri" w:eastAsia="Calibri" w:hAnsi="Calibri"/>
+          <w:bCs/>
+          <w:i/>
+          <w:iCs/>
+          <w:color w:val="1E3A5F"/>
+          <w:lang w:val="pt-BR"/>
+        </w:rPr>
+        <w:t>O número está nos blocos. Embaixo: fonte, quantos registros e limitações. É isso que mede se a resposta é usável.</w:t>
+      </w:r>
+    </w:p>
+    <w:p>
+      <w:pPr>
+        <w:spacing w:after="0" w:line="360" w:lineRule="auto"/>
+        <w:rPr>
+          <w:rFonts w:ascii="Calibri" w:eastAsia="Calibri" w:hAnsi="Calibri"/>
+          <w:bCs/>
+          <w:color w:val="1E3A5F"/>
+          <w:lang w:val="pt-BR"/>
+        </w:rPr>
+      </w:pPr>
       <w:r>
         <w:rPr>
           <w:rFonts w:ascii="Calibri" w:eastAsia="Calibri" w:hAnsi="Calibri"/>
@@ -3024,7 +3215,34 @@
           <w:color w:val="1E3A5F"/>
           <w:lang w:val="pt-BR"/>
         </w:rPr>
+        <w:t>Pergunta 2 — ~1:00</w:t>
+      </w:r>
+      <w:r>
+        <w:rPr>
+          <w:rFonts w:ascii="Calibri" w:eastAsia="Calibri" w:hAnsi="Calibri"/>
+          <w:b/>
+          <w:color w:val="1E3A5F"/>
+          <w:lang w:val="pt-BR"/>
+        </w:rPr>
         <w:br/>
+      </w:r>
+      <w:r>
+        <w:rPr>
+          <w:rFonts w:ascii="Calibri" w:eastAsia="Calibri" w:hAnsi="Calibri"/>
+          <w:b/>
+          <w:color w:val="1E3A5F"/>
+          <w:lang w:val="pt-BR"/>
+        </w:rPr>
+        <w:t>Exemplo:</w:t>
+      </w:r>
+      <w:r>
+        <w:rPr>
+          <w:rFonts w:ascii="Calibri" w:eastAsia="Calibri" w:hAnsi="Calibri"/>
+          <w:b/>
+          <w:color w:val="1E3A5F"/>
+          <w:lang w:val="pt-BR"/>
+        </w:rPr>
+        <w:t> </w:t>
       </w:r>
       <w:r>
         <w:rPr>
@@ -3033,7 +3251,17 @@
           <w:color w:val="1E3A5F"/>
           <w:lang w:val="pt-BR"/>
         </w:rPr>
-        <w:t> </w:t>
+        <w:t>Por que o lucro caiu em maio de 2026?</w:t>
+      </w:r>
+      <w:r>
+        <w:rPr>
+          <w:rFonts w:ascii="Calibri" w:eastAsia="Calibri" w:hAnsi="Calibri"/>
+          <w:b/>
+          <w:color w:val="1E3A5F"/>
+          <w:lang w:val="pt-BR"/>
+        </w:rPr>
+        <w:br/>
+        <w:t>[enquanto carrega] </w:t>
       </w:r>
       <w:r>
         <w:rPr>
@@ -3044,12 +3272,42 @@
           <w:color w:val="1E3A5F"/>
           <w:lang w:val="pt-BR"/>
         </w:rPr>
-        <w:t>O número está nos blocos. Embaixo: fonte, quantos registros e limitações. É isso que mede se a resposta é usável.</w:t>
+        <w:t>Aqui não basta “caiu”. O sistema decompõe o que pesou no lucro.</w:t>
+      </w:r>
+      <w:r>
+        <w:rPr>
+          <w:rFonts w:ascii="Calibri" w:eastAsia="Calibri" w:hAnsi="Calibri"/>
+          <w:b/>
+          <w:color w:val="1E3A5F"/>
+          <w:lang w:val="pt-BR"/>
+        </w:rPr>
+        <w:br/>
+        <w:t>[apontar o resumo + as parcelas; não ler a lista inteira]</w:t>
+      </w:r>
+      <w:r>
+        <w:rPr>
+          <w:rFonts w:ascii="Calibri" w:eastAsia="Calibri" w:hAnsi="Calibri"/>
+          <w:b/>
+          <w:color w:val="1E3A5F"/>
+          <w:lang w:val="pt-BR"/>
+        </w:rPr>
+        <w:br/>
+      </w:r>
+      <w:r>
+        <w:rPr>
+          <w:rFonts w:ascii="Calibri" w:eastAsia="Calibri" w:hAnsi="Calibri"/>
+          <w:bCs/>
+          <w:i/>
+          <w:iCs/>
+          <w:color w:val="1E3A5F"/>
+          <w:lang w:val="pt-BR"/>
+        </w:rPr>
+        <w:t>A tela mostra o que contribuiu — não um texto genérico.</w:t>
       </w:r>
     </w:p>
     <w:p>
       <w:pPr>
-        <w:spacing w:after="160" w:line="360" w:lineRule="auto"/>
+        <w:spacing w:after="0" w:line="360" w:lineRule="auto"/>
         <w:rPr>
           <w:rFonts w:ascii="Calibri" w:eastAsia="Calibri" w:hAnsi="Calibri"/>
           <w:bCs/>
@@ -3064,7 +3322,7 @@
           <w:color w:val="1E3A5F"/>
           <w:lang w:val="pt-BR"/>
         </w:rPr>
-        <w:t>Pergunta 2 — ~1:00</w:t>
+        <w:t>Pergunta 3 — ~1:15</w:t>
       </w:r>
       <w:r>
         <w:rPr>
@@ -3074,7 +3332,24 @@
           <w:lang w:val="pt-BR"/>
         </w:rPr>
         <w:br/>
-        <w:t> [colar e enviar] </w:t>
+      </w:r>
+      <w:r>
+        <w:rPr>
+          <w:rFonts w:ascii="Calibri" w:eastAsia="Calibri" w:hAnsi="Calibri"/>
+          <w:b/>
+          <w:color w:val="1E3A5F"/>
+          <w:lang w:val="pt-BR"/>
+        </w:rPr>
+        <w:t>Exemplo:</w:t>
+      </w:r>
+      <w:r>
+        <w:rPr>
+          <w:rFonts w:ascii="Calibri" w:eastAsia="Calibri" w:hAnsi="Calibri"/>
+          <w:b/>
+          <w:color w:val="1E3A5F"/>
+          <w:lang w:val="pt-BR"/>
+        </w:rPr>
+        <w:t> </w:t>
       </w:r>
       <w:r>
         <w:rPr>
@@ -3083,7 +3358,7 @@
           <w:color w:val="1E3A5F"/>
           <w:lang w:val="pt-BR"/>
         </w:rPr>
-        <w:t>Por que o lucro caiu em maio de 2026?</w:t>
+        <w:t>Quais produtos precisam de reposição?</w:t>
       </w:r>
       <w:r>
         <w:rPr>
@@ -3093,7 +3368,17 @@
           <w:lang w:val="pt-BR"/>
         </w:rPr>
         <w:br/>
-        <w:t> [enquanto carrega] </w:t>
+        <w:t>[enquanto carrega</w:t>
+      </w:r>
+      <w:proofErr w:type="gramStart"/>
+      <w:r>
+        <w:rPr>
+          <w:rFonts w:ascii="Calibri" w:eastAsia="Calibri" w:hAnsi="Calibri"/>
+          <w:b/>
+          <w:color w:val="1E3A5F"/>
+          <w:lang w:val="pt-BR"/>
+        </w:rPr>
+        <w:t>] </w:t>
       </w:r>
       <w:r>
         <w:rPr>
@@ -3104,7 +3389,19 @@
           <w:color w:val="1E3A5F"/>
           <w:lang w:val="pt-BR"/>
         </w:rPr>
-        <w:t>Aqui não basta “caiu”. O sistema decompõe o que pesou no lucro.</w:t>
+        <w:t>Aqui</w:t>
+      </w:r>
+      <w:proofErr w:type="gramEnd"/>
+      <w:r>
+        <w:rPr>
+          <w:rFonts w:ascii="Calibri" w:eastAsia="Calibri" w:hAnsi="Calibri"/>
+          <w:bCs/>
+          <w:i/>
+          <w:iCs/>
+          <w:color w:val="1E3A5F"/>
+          <w:lang w:val="pt-BR"/>
+        </w:rPr>
+        <w:t xml:space="preserve"> olhamos para frente: o modelo estima demanda para sugerir reposição. É previsão, não o faturamento de junho.</w:t>
       </w:r>
       <w:r>
         <w:rPr>
@@ -3114,7 +3411,7 @@
           <w:lang w:val="pt-BR"/>
         </w:rPr>
         <w:br/>
-        <w:t> [apontar o resumo + as parcelas; não ler a lista inteira]</w:t>
+        <w:t>[apontar 1–2 produtos da lista + o bloco de confiabilidade]</w:t>
       </w:r>
       <w:r>
         <w:rPr>
@@ -3129,26 +3426,17 @@
         <w:rPr>
           <w:rFonts w:ascii="Calibri" w:eastAsia="Calibri" w:hAnsi="Calibri"/>
           <w:bCs/>
-          <w:color w:val="1E3A5F"/>
-          <w:lang w:val="pt-BR"/>
-        </w:rPr>
-        <w:t> </w:t>
-      </w:r>
-      <w:r>
-        <w:rPr>
-          <w:rFonts w:ascii="Calibri" w:eastAsia="Calibri" w:hAnsi="Calibri"/>
-          <w:bCs/>
           <w:i/>
           <w:iCs/>
           <w:color w:val="1E3A5F"/>
           <w:lang w:val="pt-BR"/>
         </w:rPr>
-        <w:t>A tela mostra o que contribuiu — não um texto genérico.</w:t>
+        <w:t>O gestor vê o quê repor e o critério. Sem caçar planilha de estoque.</w:t>
       </w:r>
     </w:p>
     <w:p>
       <w:pPr>
-        <w:spacing w:after="160" w:line="360" w:lineRule="auto"/>
+        <w:spacing w:after="0" w:line="360" w:lineRule="auto"/>
         <w:rPr>
           <w:rFonts w:ascii="Calibri" w:eastAsia="Calibri" w:hAnsi="Calibri"/>
           <w:bCs/>
@@ -3163,7 +3451,7 @@
           <w:color w:val="1E3A5F"/>
           <w:lang w:val="pt-BR"/>
         </w:rPr>
-        <w:t>Pergunta 3 — ~1:15</w:t>
+        <w:t>Fechar a demo (~1:28)</w:t>
       </w:r>
       <w:r>
         <w:rPr>
@@ -3173,26 +3461,6 @@
           <w:lang w:val="pt-BR"/>
         </w:rPr>
         <w:br/>
-        <w:t> [colar e enviar] </w:t>
-      </w:r>
-      <w:r>
-        <w:rPr>
-          <w:rFonts w:ascii="Calibri" w:eastAsia="Calibri" w:hAnsi="Calibri"/>
-          <w:bCs/>
-          <w:color w:val="1E3A5F"/>
-          <w:lang w:val="pt-BR"/>
-        </w:rPr>
-        <w:t>Quais produtos precisam de reposição?</w:t>
-      </w:r>
-      <w:r>
-        <w:rPr>
-          <w:rFonts w:ascii="Calibri" w:eastAsia="Calibri" w:hAnsi="Calibri"/>
-          <w:b/>
-          <w:color w:val="1E3A5F"/>
-          <w:lang w:val="pt-BR"/>
-        </w:rPr>
-        <w:br/>
-        <w:t> [enquanto carrega] </w:t>
       </w:r>
       <w:r>
         <w:rPr>
@@ -3203,91 +3471,12 @@
           <w:color w:val="1E3A5F"/>
           <w:lang w:val="pt-BR"/>
         </w:rPr>
-        <w:t>Aqui olhamos para frente: o modelo estima demanda para sugerir reposição. É previsão, não o faturamento de junho.</w:t>
-      </w:r>
-      <w:r>
-        <w:rPr>
-          <w:rFonts w:ascii="Calibri" w:eastAsia="Calibri" w:hAnsi="Calibri"/>
-          <w:b/>
-          <w:color w:val="1E3A5F"/>
-          <w:lang w:val="pt-BR"/>
-        </w:rPr>
-        <w:br/>
-        <w:t> [apontar 1–2 produtos da lista + o bloco de confiabilidade]</w:t>
-      </w:r>
-      <w:r>
-        <w:rPr>
-          <w:rFonts w:ascii="Calibri" w:eastAsia="Calibri" w:hAnsi="Calibri"/>
-          <w:b/>
-          <w:color w:val="1E3A5F"/>
-          <w:lang w:val="pt-BR"/>
-        </w:rPr>
-        <w:br/>
-      </w:r>
-      <w:r>
-        <w:rPr>
-          <w:rFonts w:ascii="Calibri" w:eastAsia="Calibri" w:hAnsi="Calibri"/>
-          <w:bCs/>
-          <w:color w:val="1E3A5F"/>
-          <w:lang w:val="pt-BR"/>
-        </w:rPr>
-        <w:t> </w:t>
-      </w:r>
-      <w:r>
-        <w:rPr>
-          <w:rFonts w:ascii="Calibri" w:eastAsia="Calibri" w:hAnsi="Calibri"/>
-          <w:bCs/>
-          <w:i/>
-          <w:iCs/>
-          <w:color w:val="1E3A5F"/>
-          <w:lang w:val="pt-BR"/>
-        </w:rPr>
-        <w:t>O gestor vê o quê repor e o critério. Sem caçar planilha de estoque.</w:t>
+        <w:t>Painel para ver o mês. Fontes para ver o que está conectado. Copiloto para perguntar, entender e decidir.</w:t>
       </w:r>
     </w:p>
     <w:p>
       <w:pPr>
-        <w:spacing w:after="160" w:line="360" w:lineRule="auto"/>
-        <w:rPr>
-          <w:rFonts w:ascii="Calibri" w:eastAsia="Calibri" w:hAnsi="Calibri"/>
-          <w:bCs/>
-          <w:color w:val="1E3A5F"/>
-          <w:lang w:val="pt-BR"/>
-        </w:rPr>
-      </w:pPr>
-      <w:r>
-        <w:rPr>
-          <w:rFonts w:ascii="Calibri" w:eastAsia="Calibri" w:hAnsi="Calibri"/>
-          <w:b/>
-          <w:color w:val="1E3A5F"/>
-          <w:lang w:val="pt-BR"/>
-        </w:rPr>
-        <w:t>Fechar a demo (~1:28)</w:t>
-      </w:r>
-      <w:r>
-        <w:rPr>
-          <w:rFonts w:ascii="Calibri" w:eastAsia="Calibri" w:hAnsi="Calibri"/>
-          <w:b/>
-          <w:color w:val="1E3A5F"/>
-          <w:lang w:val="pt-BR"/>
-        </w:rPr>
-        <w:br/>
-      </w:r>
-      <w:r>
-        <w:rPr>
-          <w:rFonts w:ascii="Calibri" w:eastAsia="Calibri" w:hAnsi="Calibri"/>
-          <w:bCs/>
-          <w:i/>
-          <w:iCs/>
-          <w:color w:val="1E3A5F"/>
-          <w:lang w:val="pt-BR"/>
-        </w:rPr>
-        <w:t>Painel para ver o mês. Fontes para ver o que está conectado. Copiloto para perguntar, entender e decidir.</w:t>
-      </w:r>
-    </w:p>
-    <w:p>
-      <w:pPr>
-        <w:spacing w:after="160" w:line="360" w:lineRule="auto"/>
+        <w:spacing w:after="0" w:line="360" w:lineRule="auto"/>
         <w:rPr>
           <w:rFonts w:ascii="Calibri" w:eastAsia="Calibri" w:hAnsi="Calibri"/>
           <w:i/>
@@ -3336,7 +3525,7 @@
     </w:p>
     <w:p>
       <w:pPr>
-        <w:spacing w:after="160" w:line="360" w:lineRule="auto"/>
+        <w:spacing w:after="0" w:line="360" w:lineRule="auto"/>
         <w:rPr>
           <w:rFonts w:ascii="Calibri" w:eastAsia="Calibri" w:hAnsi="Calibri"/>
           <w:i/>
@@ -3374,7 +3563,7 @@
     </w:p>
     <w:p>
       <w:pPr>
-        <w:spacing w:after="160" w:line="360" w:lineRule="auto"/>
+        <w:spacing w:after="0" w:line="360" w:lineRule="auto"/>
         <w:rPr>
           <w:rFonts w:ascii="Calibri" w:eastAsia="Calibri" w:hAnsi="Calibri"/>
           <w:i/>
@@ -3430,7 +3619,7 @@
     </w:p>
     <w:p>
       <w:pPr>
-        <w:spacing w:after="160" w:line="360" w:lineRule="auto"/>
+        <w:spacing w:after="0" w:line="360" w:lineRule="auto"/>
         <w:rPr>
           <w:rFonts w:ascii="Calibri" w:eastAsia="Calibri" w:hAnsi="Calibri"/>
           <w:i/>
@@ -3455,21 +3644,22 @@
           <w:ilvl w:val="0"/>
           <w:numId w:val="11"/>
         </w:numPr>
-        <w:spacing w:after="160" w:line="360" w:lineRule="auto"/>
-        <w:rPr>
-          <w:rFonts w:ascii="Calibri" w:eastAsia="Calibri" w:hAnsi="Calibri"/>
-          <w:i/>
-          <w:color w:val="4A5568"/>
-          <w:lang w:val="pt-BR"/>
-        </w:rPr>
-      </w:pPr>
-      <w:r>
-        <w:rPr>
-          <w:rFonts w:ascii="Calibri" w:eastAsia="Calibri" w:hAnsi="Calibri"/>
-          <w:i/>
-          <w:color w:val="4A5568"/>
-          <w:lang w:val="pt-BR"/>
-        </w:rPr>
+        <w:spacing w:after="0" w:line="360" w:lineRule="auto"/>
+        <w:rPr>
+          <w:rFonts w:ascii="Calibri" w:eastAsia="Calibri" w:hAnsi="Calibri"/>
+          <w:i/>
+          <w:color w:val="4A5568"/>
+          <w:lang w:val="pt-BR"/>
+        </w:rPr>
+      </w:pPr>
+      <w:r>
+        <w:rPr>
+          <w:rFonts w:ascii="Calibri" w:eastAsia="Calibri" w:hAnsi="Calibri"/>
+          <w:i/>
+          <w:color w:val="4A5568"/>
+          <w:lang w:val="pt-BR"/>
+        </w:rPr>
+        <w:lastRenderedPageBreak/>
         <w:t>explicar acontecimentos;</w:t>
       </w:r>
     </w:p>
@@ -3480,7 +3670,7 @@
           <w:ilvl w:val="0"/>
           <w:numId w:val="11"/>
         </w:numPr>
-        <w:spacing w:after="160" w:line="360" w:lineRule="auto"/>
+        <w:spacing w:after="0" w:line="360" w:lineRule="auto"/>
         <w:rPr>
           <w:rFonts w:ascii="Calibri" w:eastAsia="Calibri" w:hAnsi="Calibri"/>
           <w:i/>
@@ -3505,7 +3695,7 @@
           <w:ilvl w:val="0"/>
           <w:numId w:val="11"/>
         </w:numPr>
-        <w:spacing w:after="160" w:line="360" w:lineRule="auto"/>
+        <w:spacing w:after="0" w:line="360" w:lineRule="auto"/>
         <w:rPr>
           <w:rFonts w:ascii="Calibri" w:eastAsia="Calibri" w:hAnsi="Calibri"/>
           <w:i/>
@@ -3530,7 +3720,7 @@
           <w:ilvl w:val="0"/>
           <w:numId w:val="11"/>
         </w:numPr>
-        <w:spacing w:after="160" w:line="360" w:lineRule="auto"/>
+        <w:spacing w:after="0" w:line="360" w:lineRule="auto"/>
         <w:rPr>
           <w:rFonts w:ascii="Calibri" w:eastAsia="Calibri" w:hAnsi="Calibri"/>
           <w:i/>
@@ -3555,7 +3745,7 @@
           <w:ilvl w:val="0"/>
           <w:numId w:val="11"/>
         </w:numPr>
-        <w:spacing w:after="160" w:line="360" w:lineRule="auto"/>
+        <w:spacing w:after="0" w:line="360" w:lineRule="auto"/>
         <w:rPr>
           <w:rFonts w:ascii="Calibri" w:eastAsia="Calibri" w:hAnsi="Calibri"/>
           <w:i/>
@@ -3575,19 +3765,18 @@
     </w:p>
     <w:p>
       <w:pPr>
-        <w:spacing w:after="160" w:line="360" w:lineRule="auto"/>
-        <w:rPr>
-          <w:lang w:val="pt-BR"/>
-        </w:rPr>
-      </w:pPr>
-      <w:r>
-        <w:rPr>
-          <w:rFonts w:ascii="Calibri" w:eastAsia="Calibri" w:hAnsi="Calibri"/>
-          <w:i/>
-          <w:color w:val="4A5568"/>
-          <w:lang w:val="pt-BR"/>
-        </w:rPr>
-        <w:lastRenderedPageBreak/>
+        <w:spacing w:after="0" w:line="360" w:lineRule="auto"/>
+        <w:rPr>
+          <w:lang w:val="pt-BR"/>
+        </w:rPr>
+      </w:pPr>
+      <w:r>
+        <w:rPr>
+          <w:rFonts w:ascii="Calibri" w:eastAsia="Calibri" w:hAnsi="Calibri"/>
+          <w:i/>
+          <w:color w:val="4A5568"/>
+          <w:lang w:val="pt-BR"/>
+        </w:rPr>
         <w:t>Transição: “</w:t>
       </w:r>
       <w:r>
@@ -3611,8 +3800,86 @@
     </w:p>
     <w:p>
       <w:pPr>
-        <w:spacing w:before="240" w:after="120"/>
-        <w:rPr>
+        <w:spacing w:before="320" w:after="0" w:line="360" w:lineRule="auto"/>
+        <w:rPr>
+          <w:lang w:val="pt-BR"/>
+        </w:rPr>
+      </w:pPr>
+      <w:r>
+        <w:rPr>
+          <w:rFonts w:ascii="Calibri" w:eastAsia="Calibri" w:hAnsi="Calibri"/>
+          <w:b/>
+          <w:color w:val="1E3A5F"/>
+          <w:sz w:val="32"/>
+          <w:lang w:val="pt-BR"/>
+        </w:rPr>
+        <w:t>Participante 5 — Próximos passos + fechamento</w:t>
+      </w:r>
+    </w:p>
+    <w:p>
+      <w:pPr>
+        <w:spacing w:after="0" w:line="360" w:lineRule="auto"/>
+        <w:rPr>
+          <w:lang w:val="pt-BR"/>
+        </w:rPr>
+      </w:pPr>
+      <w:r>
+        <w:rPr>
+          <w:rFonts w:ascii="Calibri" w:eastAsia="Calibri" w:hAnsi="Calibri"/>
+          <w:b/>
+          <w:color w:val="1E3A5F"/>
+          <w:lang w:val="pt-BR"/>
+        </w:rPr>
+        <w:t xml:space="preserve">Tempo: </w:t>
+      </w:r>
+      <w:r>
+        <w:rPr>
+          <w:rFonts w:ascii="Calibri" w:eastAsia="Calibri" w:hAnsi="Calibri"/>
+          <w:lang w:val="pt-BR"/>
+        </w:rPr>
+        <w:t>cerca de 1 minuto e 30 segundos</w:t>
+      </w:r>
+    </w:p>
+    <w:p>
+      <w:pPr>
+        <w:spacing w:after="0" w:line="360" w:lineRule="auto"/>
+        <w:rPr>
+          <w:lang w:val="pt-BR"/>
+        </w:rPr>
+      </w:pPr>
+      <w:r>
+        <w:rPr>
+          <w:rFonts w:ascii="Calibri" w:eastAsia="Calibri" w:hAnsi="Calibri"/>
+          <w:b/>
+          <w:color w:val="1E3A5F"/>
+          <w:lang w:val="pt-BR"/>
+        </w:rPr>
+        <w:t xml:space="preserve">Slides: </w:t>
+      </w:r>
+      <w:proofErr w:type="spellStart"/>
+      <w:r>
+        <w:rPr>
+          <w:rFonts w:ascii="Calibri" w:eastAsia="Calibri" w:hAnsi="Calibri"/>
+          <w:lang w:val="pt-BR"/>
+        </w:rPr>
+        <w:t>roadmap</w:t>
+      </w:r>
+      <w:proofErr w:type="spellEnd"/>
+      <w:r>
+        <w:rPr>
+          <w:rFonts w:ascii="Calibri" w:eastAsia="Calibri" w:hAnsi="Calibri"/>
+          <w:lang w:val="pt-BR"/>
+        </w:rPr>
+        <w:t xml:space="preserve"> curto + slogan</w:t>
+      </w:r>
+    </w:p>
+    <w:p>
+      <w:pPr>
+        <w:spacing w:before="240" w:after="0" w:line="360" w:lineRule="auto"/>
+        <w:rPr>
+          <w:rFonts w:ascii="Calibri" w:eastAsia="Calibri" w:hAnsi="Calibri"/>
+          <w:i/>
+          <w:color w:val="4A5568"/>
           <w:lang w:val="pt-BR"/>
         </w:rPr>
       </w:pPr>
@@ -3624,49 +3891,301 @@
           <w:sz w:val="26"/>
           <w:lang w:val="pt-BR"/>
         </w:rPr>
-        <w:t>Plano B se a API falhar</w:t>
+        <w:t xml:space="preserve">Próximos passos: </w:t>
+      </w:r>
+      <w:r>
+        <w:rPr>
+          <w:rFonts w:ascii="Calibri" w:eastAsia="Calibri" w:hAnsi="Calibri"/>
+          <w:i/>
+          <w:color w:val="4A5568"/>
+          <w:lang w:val="pt-BR"/>
+        </w:rPr>
+        <w:t xml:space="preserve">E o que mostramos hoje é o </w:t>
+      </w:r>
+      <w:r>
+        <w:rPr>
+          <w:rFonts w:ascii="Calibri" w:eastAsia="Calibri" w:hAnsi="Calibri"/>
+          <w:b/>
+          <w:bCs/>
+          <w:i/>
+          <w:color w:val="4A5568"/>
+          <w:lang w:val="pt-BR"/>
+        </w:rPr>
+        <w:t>primeiro passo do DUAXIS</w:t>
+      </w:r>
+      <w:r>
+        <w:rPr>
+          <w:rFonts w:ascii="Calibri" w:eastAsia="Calibri" w:hAnsi="Calibri"/>
+          <w:i/>
+          <w:color w:val="4A5568"/>
+          <w:lang w:val="pt-BR"/>
+        </w:rPr>
+        <w:t>.</w:t>
       </w:r>
     </w:p>
     <w:p>
       <w:pPr>
-        <w:spacing w:after="160" w:line="360" w:lineRule="auto"/>
-        <w:rPr>
-          <w:lang w:val="pt-BR"/>
-        </w:rPr>
-      </w:pPr>
-      <w:r>
-        <w:rPr>
-          <w:rFonts w:ascii="Calibri" w:eastAsia="Calibri" w:hAnsi="Calibri"/>
-          <w:i/>
-          <w:color w:val="4A5568"/>
-          <w:lang w:val="pt-BR"/>
-        </w:rPr>
-        <w:t xml:space="preserve">Não improvisar número. Ter print ou PDF da mesma pergunta. Dizer que a demo depende do </w:t>
-      </w:r>
-      <w:proofErr w:type="spellStart"/>
-      <w:r>
-        <w:rPr>
-          <w:rFonts w:ascii="Calibri" w:eastAsia="Calibri" w:hAnsi="Calibri"/>
-          <w:i/>
-          <w:color w:val="4A5568"/>
-          <w:lang w:val="pt-BR"/>
-        </w:rPr>
-        <w:t>backend</w:t>
-      </w:r>
-      <w:proofErr w:type="spellEnd"/>
-      <w:r>
-        <w:rPr>
-          <w:rFonts w:ascii="Calibri" w:eastAsia="Calibri" w:hAnsi="Calibri"/>
-          <w:i/>
-          <w:color w:val="4A5568"/>
-          <w:lang w:val="pt-BR"/>
-        </w:rPr>
-        <w:t xml:space="preserve"> no ar e seguir para os próximos passos.</w:t>
+        <w:spacing w:after="0" w:line="360" w:lineRule="auto"/>
+        <w:rPr>
+          <w:rFonts w:ascii="Calibri" w:eastAsia="Calibri" w:hAnsi="Calibri"/>
+          <w:i/>
+          <w:color w:val="4A5568"/>
+          <w:lang w:val="pt-BR"/>
+        </w:rPr>
+      </w:pPr>
+      <w:r>
+        <w:rPr>
+          <w:rFonts w:ascii="Calibri" w:eastAsia="Calibri" w:hAnsi="Calibri"/>
+          <w:i/>
+          <w:color w:val="4A5568"/>
+          <w:lang w:val="pt-BR"/>
+        </w:rPr>
+        <w:t xml:space="preserve">A próxima etapa é </w:t>
+      </w:r>
+      <w:r>
+        <w:rPr>
+          <w:rFonts w:ascii="Calibri" w:eastAsia="Calibri" w:hAnsi="Calibri"/>
+          <w:i/>
+          <w:color w:val="4A5568"/>
+          <w:lang w:val="pt-BR"/>
+        </w:rPr>
+        <w:t>validar o MVP com empresas reais, medir a qualidade das respostas e entender quais integrações geram mais valor.</w:t>
       </w:r>
     </w:p>
     <w:p>
       <w:pPr>
-        <w:spacing w:before="320" w:after="160"/>
+        <w:spacing w:after="0" w:line="360" w:lineRule="auto"/>
+        <w:rPr>
+          <w:rFonts w:ascii="Calibri" w:eastAsia="Calibri" w:hAnsi="Calibri"/>
+          <w:i/>
+          <w:color w:val="4A5568"/>
+          <w:lang w:val="pt-BR"/>
+        </w:rPr>
+      </w:pPr>
+      <w:r>
+        <w:rPr>
+          <w:rFonts w:ascii="Calibri" w:eastAsia="Calibri" w:hAnsi="Calibri"/>
+          <w:i/>
+          <w:color w:val="4A5568"/>
+          <w:lang w:val="pt-BR"/>
+        </w:rPr>
+        <w:t>A partir dessa validação, poderemos substituir as bases simuladas por conexões com sistemas reais</w:t>
+      </w:r>
+      <w:r>
+        <w:rPr>
+          <w:rFonts w:ascii="Calibri" w:eastAsia="Calibri" w:hAnsi="Calibri"/>
+          <w:i/>
+          <w:color w:val="4A5568"/>
+          <w:lang w:val="pt-BR"/>
+        </w:rPr>
+        <w:t xml:space="preserve"> e</w:t>
+      </w:r>
+      <w:r>
+        <w:rPr>
+          <w:rFonts w:ascii="Calibri" w:eastAsia="Calibri" w:hAnsi="Calibri"/>
+          <w:i/>
+          <w:color w:val="4A5568"/>
+          <w:lang w:val="pt-BR"/>
+        </w:rPr>
+        <w:t xml:space="preserve"> ampliar os módulo</w:t>
+      </w:r>
+      <w:r>
+        <w:rPr>
+          <w:rFonts w:ascii="Calibri" w:eastAsia="Calibri" w:hAnsi="Calibri"/>
+          <w:i/>
+          <w:color w:val="4A5568"/>
+          <w:lang w:val="pt-BR"/>
+        </w:rPr>
+        <w:t>s</w:t>
+      </w:r>
+      <w:r>
+        <w:rPr>
+          <w:rFonts w:ascii="Calibri" w:eastAsia="Calibri" w:hAnsi="Calibri"/>
+          <w:i/>
+          <w:color w:val="4A5568"/>
+          <w:lang w:val="pt-BR"/>
+        </w:rPr>
+        <w:t>.</w:t>
+      </w:r>
+    </w:p>
+    <w:p>
+      <w:pPr>
+        <w:spacing w:after="0" w:line="360" w:lineRule="auto"/>
+        <w:rPr>
+          <w:rFonts w:ascii="Calibri" w:eastAsia="Calibri" w:hAnsi="Calibri"/>
+          <w:i/>
+          <w:color w:val="4A5568"/>
+          <w:lang w:val="pt-BR"/>
+        </w:rPr>
+      </w:pPr>
+      <w:r>
+        <w:rPr>
+          <w:rFonts w:ascii="Calibri" w:eastAsia="Calibri" w:hAnsi="Calibri"/>
+          <w:i/>
+          <w:color w:val="4A5568"/>
+          <w:lang w:val="pt-BR"/>
+        </w:rPr>
+        <w:t xml:space="preserve">O objetivo é transformar essa prova de conceito em um </w:t>
+      </w:r>
+      <w:r>
+        <w:rPr>
+          <w:rFonts w:ascii="Calibri" w:eastAsia="Calibri" w:hAnsi="Calibri"/>
+          <w:b/>
+          <w:bCs/>
+          <w:i/>
+          <w:color w:val="4A5568"/>
+          <w:lang w:val="pt-BR"/>
+        </w:rPr>
+        <w:t>produto escalável</w:t>
+      </w:r>
+      <w:r>
+        <w:rPr>
+          <w:rFonts w:ascii="Calibri" w:eastAsia="Calibri" w:hAnsi="Calibri"/>
+          <w:i/>
+          <w:color w:val="4A5568"/>
+          <w:lang w:val="pt-BR"/>
+        </w:rPr>
+        <w:t>, capaz de consolidar diferentes fontes de informação e apoiar gestores em suas decisões.</w:t>
+      </w:r>
+    </w:p>
+    <w:p>
+      <w:pPr>
+        <w:spacing w:after="0" w:line="360" w:lineRule="auto"/>
+        <w:rPr>
+          <w:lang w:val="pt-BR"/>
+        </w:rPr>
+      </w:pPr>
+      <w:r>
+        <w:rPr>
+          <w:rFonts w:ascii="Calibri" w:eastAsia="Calibri" w:hAnsi="Calibri"/>
+          <w:b/>
+          <w:color w:val="1E3A5F"/>
+          <w:sz w:val="26"/>
+          <w:lang w:val="pt-BR"/>
+        </w:rPr>
+        <w:t>Fechamento</w:t>
+      </w:r>
+      <w:r>
+        <w:rPr>
+          <w:rFonts w:ascii="Calibri" w:eastAsia="Calibri" w:hAnsi="Calibri"/>
+          <w:b/>
+          <w:color w:val="1E3A5F"/>
+          <w:sz w:val="26"/>
+          <w:lang w:val="pt-BR"/>
+        </w:rPr>
+        <w:t xml:space="preserve">: </w:t>
+      </w:r>
+      <w:r>
+        <w:rPr>
+          <w:rFonts w:ascii="Calibri" w:eastAsia="Calibri" w:hAnsi="Calibri"/>
+          <w:i/>
+          <w:color w:val="4A5568"/>
+          <w:lang w:val="pt-BR"/>
+        </w:rPr>
+        <w:t xml:space="preserve">No início convidamos vocês a imaginarem que vocês descobriram que o faturamento caiu 18% </w:t>
+      </w:r>
+      <w:r>
+        <w:rPr>
+          <w:rFonts w:ascii="Calibri" w:eastAsia="Calibri" w:hAnsi="Calibri"/>
+          <w:i/>
+          <w:color w:val="4A5568"/>
+          <w:lang w:val="pt-BR"/>
+        </w:rPr>
+        <w:t>e precisava</w:t>
+      </w:r>
+      <w:r>
+        <w:rPr>
+          <w:rFonts w:ascii="Calibri" w:eastAsia="Calibri" w:hAnsi="Calibri"/>
+          <w:i/>
+          <w:color w:val="4A5568"/>
+          <w:lang w:val="pt-BR"/>
+        </w:rPr>
+        <w:t>m</w:t>
+      </w:r>
+      <w:r>
+        <w:rPr>
+          <w:rFonts w:ascii="Calibri" w:eastAsia="Calibri" w:hAnsi="Calibri"/>
+          <w:i/>
+          <w:color w:val="4A5568"/>
+          <w:lang w:val="pt-BR"/>
+        </w:rPr>
+        <w:t xml:space="preserve"> procurar em diferentes sistemas para entender o motivo.</w:t>
+      </w:r>
+      <w:r>
+        <w:rPr>
+          <w:rFonts w:ascii="Calibri" w:eastAsia="Calibri" w:hAnsi="Calibri"/>
+          <w:i/>
+          <w:color w:val="4A5568"/>
+          <w:lang w:val="pt-BR"/>
+        </w:rPr>
+        <w:t xml:space="preserve"> Com o DUAXIS, os dados continuam no lugar da empresa; </w:t>
+      </w:r>
+      <w:r>
+        <w:rPr>
+          <w:rFonts w:ascii="Calibri" w:eastAsia="Calibri" w:hAnsi="Calibri"/>
+          <w:b/>
+          <w:bCs/>
+          <w:i/>
+          <w:color w:val="4A5568"/>
+          <w:lang w:val="pt-BR"/>
+        </w:rPr>
+        <w:t>O que muda é a forma de transformá-los em entendimento e decisões.</w:t>
+      </w:r>
+    </w:p>
+    <w:p>
+      <w:pPr>
+        <w:spacing w:after="0" w:line="360" w:lineRule="auto"/>
+        <w:rPr>
+          <w:lang w:val="pt-BR"/>
+        </w:rPr>
+      </w:pPr>
+      <w:r>
+        <w:rPr>
+          <w:rFonts w:ascii="Calibri" w:eastAsia="Calibri" w:hAnsi="Calibri"/>
+          <w:i/>
+          <w:color w:val="4A5568"/>
+          <w:lang w:val="pt-BR"/>
+        </w:rPr>
+        <w:t>Uma empresa não precisa de mais um lugar para consultar números. Precisa entender o que esses números estão dizendo.</w:t>
+      </w:r>
+    </w:p>
+    <w:p>
+      <w:pPr>
+        <w:spacing w:after="0" w:line="360" w:lineRule="auto"/>
+        <w:rPr>
+          <w:lang w:val="pt-BR"/>
+        </w:rPr>
+      </w:pPr>
+      <w:r>
+        <w:rPr>
+          <w:rFonts w:ascii="Calibri" w:eastAsia="Calibri" w:hAnsi="Calibri"/>
+          <w:i/>
+          <w:color w:val="4A5568"/>
+          <w:lang w:val="pt-BR"/>
+        </w:rPr>
+        <w:t>Pausa.</w:t>
+      </w:r>
+    </w:p>
+    <w:p>
+      <w:pPr>
+        <w:spacing w:after="0" w:line="360" w:lineRule="auto"/>
+        <w:rPr>
+          <w:lang w:val="pt-BR"/>
+        </w:rPr>
+      </w:pPr>
+      <w:r>
+        <w:rPr>
+          <w:rFonts w:ascii="Calibri" w:eastAsia="Calibri" w:hAnsi="Calibri"/>
+          <w:i/>
+          <w:color w:val="4A5568"/>
+          <w:lang w:val="pt-BR"/>
+        </w:rPr>
+        <w:t>DUAXIS: seus dados já têm as respostas. Nós queremos tornar mais fácil encontrá-las.</w:t>
+      </w:r>
+    </w:p>
+    <w:p>
+      <w:pPr>
+        <w:spacing w:before="320" w:after="0" w:line="360" w:lineRule="auto"/>
         <w:rPr>
           <w:lang w:val="pt-BR"/>
         </w:rPr>
@@ -3679,349 +4198,12 @@
           <w:sz w:val="32"/>
           <w:lang w:val="pt-BR"/>
         </w:rPr>
-        <w:t>Participante 5 — Próximos passos + fechamento</w:t>
+        <w:t>Slide Antes × com o DUAXIS (versão segura)</w:t>
       </w:r>
     </w:p>
     <w:p>
       <w:pPr>
-        <w:spacing w:after="80"/>
-        <w:rPr>
-          <w:lang w:val="pt-BR"/>
-        </w:rPr>
-      </w:pPr>
-      <w:r>
-        <w:rPr>
-          <w:rFonts w:ascii="Calibri" w:eastAsia="Calibri" w:hAnsi="Calibri"/>
-          <w:b/>
-          <w:color w:val="1E3A5F"/>
-          <w:lang w:val="pt-BR"/>
-        </w:rPr>
-        <w:t xml:space="preserve">Tempo: </w:t>
-      </w:r>
-      <w:r>
-        <w:rPr>
-          <w:rFonts w:ascii="Calibri" w:eastAsia="Calibri" w:hAnsi="Calibri"/>
-          <w:lang w:val="pt-BR"/>
-        </w:rPr>
-        <w:t>cerca de 1 minuto e 30 segundos</w:t>
-      </w:r>
-    </w:p>
-    <w:p>
-      <w:pPr>
-        <w:spacing w:after="80"/>
-        <w:rPr>
-          <w:lang w:val="pt-BR"/>
-        </w:rPr>
-      </w:pPr>
-      <w:r>
-        <w:rPr>
-          <w:rFonts w:ascii="Calibri" w:eastAsia="Calibri" w:hAnsi="Calibri"/>
-          <w:b/>
-          <w:color w:val="1E3A5F"/>
-          <w:lang w:val="pt-BR"/>
-        </w:rPr>
-        <w:t xml:space="preserve">Slides: </w:t>
-      </w:r>
-      <w:proofErr w:type="spellStart"/>
-      <w:r>
-        <w:rPr>
-          <w:rFonts w:ascii="Calibri" w:eastAsia="Calibri" w:hAnsi="Calibri"/>
-          <w:lang w:val="pt-BR"/>
-        </w:rPr>
-        <w:t>roadmap</w:t>
-      </w:r>
-      <w:proofErr w:type="spellEnd"/>
-      <w:r>
-        <w:rPr>
-          <w:rFonts w:ascii="Calibri" w:eastAsia="Calibri" w:hAnsi="Calibri"/>
-          <w:lang w:val="pt-BR"/>
-        </w:rPr>
-        <w:t xml:space="preserve"> curto + slogan</w:t>
-      </w:r>
-    </w:p>
-    <w:p>
-      <w:pPr>
-        <w:spacing w:before="240" w:after="120"/>
-        <w:rPr>
-          <w:lang w:val="pt-BR"/>
-        </w:rPr>
-      </w:pPr>
-      <w:r>
-        <w:rPr>
-          <w:rFonts w:ascii="Calibri" w:eastAsia="Calibri" w:hAnsi="Calibri"/>
-          <w:b/>
-          <w:color w:val="1E3A5F"/>
-          <w:sz w:val="26"/>
-          <w:lang w:val="pt-BR"/>
-        </w:rPr>
-        <w:t>Fala</w:t>
-      </w:r>
-    </w:p>
-    <w:p>
-      <w:pPr>
-        <w:spacing w:after="160" w:line="360" w:lineRule="auto"/>
-        <w:rPr>
-          <w:rFonts w:ascii="Calibri" w:eastAsia="Calibri" w:hAnsi="Calibri"/>
-          <w:i/>
-          <w:color w:val="4A5568"/>
-          <w:lang w:val="pt-BR"/>
-        </w:rPr>
-      </w:pPr>
-      <w:r>
-        <w:rPr>
-          <w:rFonts w:ascii="Calibri" w:eastAsia="Calibri" w:hAnsi="Calibri"/>
-          <w:i/>
-          <w:color w:val="4A5568"/>
-          <w:lang w:val="pt-BR"/>
-        </w:rPr>
-        <w:t xml:space="preserve">E o que mostramos hoje é o </w:t>
-      </w:r>
-      <w:r>
-        <w:rPr>
-          <w:rFonts w:ascii="Calibri" w:eastAsia="Calibri" w:hAnsi="Calibri"/>
-          <w:b/>
-          <w:bCs/>
-          <w:i/>
-          <w:color w:val="4A5568"/>
-          <w:lang w:val="pt-BR"/>
-        </w:rPr>
-        <w:t>primeiro passo do DUAXIS</w:t>
-      </w:r>
-      <w:r>
-        <w:rPr>
-          <w:rFonts w:ascii="Calibri" w:eastAsia="Calibri" w:hAnsi="Calibri"/>
-          <w:i/>
-          <w:color w:val="4A5568"/>
-          <w:lang w:val="pt-BR"/>
-        </w:rPr>
-        <w:t>.</w:t>
-      </w:r>
-    </w:p>
-    <w:p>
-      <w:pPr>
-        <w:spacing w:after="160" w:line="360" w:lineRule="auto"/>
-        <w:rPr>
-          <w:rFonts w:ascii="Calibri" w:eastAsia="Calibri" w:hAnsi="Calibri"/>
-          <w:i/>
-          <w:color w:val="4A5568"/>
-          <w:lang w:val="pt-BR"/>
-        </w:rPr>
-      </w:pPr>
-      <w:r>
-        <w:rPr>
-          <w:rFonts w:ascii="Calibri" w:eastAsia="Calibri" w:hAnsi="Calibri"/>
-          <w:i/>
-          <w:color w:val="4A5568"/>
-          <w:lang w:val="pt-BR"/>
-        </w:rPr>
-        <w:t xml:space="preserve">A próxima etapa é </w:t>
-      </w:r>
-      <w:r>
-        <w:rPr>
-          <w:rFonts w:ascii="Calibri" w:eastAsia="Calibri" w:hAnsi="Calibri"/>
-          <w:i/>
-          <w:color w:val="4A5568"/>
-          <w:lang w:val="pt-BR"/>
-        </w:rPr>
-        <w:t>validar o MVP com empresas reais, medir a qualidade das respostas e entender quais integrações geram mais valor.</w:t>
-      </w:r>
-    </w:p>
-    <w:p>
-      <w:pPr>
-        <w:spacing w:after="160" w:line="360" w:lineRule="auto"/>
-        <w:rPr>
-          <w:rFonts w:ascii="Calibri" w:eastAsia="Calibri" w:hAnsi="Calibri"/>
-          <w:i/>
-          <w:color w:val="4A5568"/>
-          <w:lang w:val="pt-BR"/>
-        </w:rPr>
-      </w:pPr>
-      <w:r>
-        <w:rPr>
-          <w:rFonts w:ascii="Calibri" w:eastAsia="Calibri" w:hAnsi="Calibri"/>
-          <w:i/>
-          <w:color w:val="4A5568"/>
-          <w:lang w:val="pt-BR"/>
-        </w:rPr>
-        <w:t>A partir dessa validação, poderemos substituir as bases simuladas por conexões com sistemas reais, ampliar os módulos e evoluir a solução para novos segmentos.</w:t>
-      </w:r>
-    </w:p>
-    <w:p>
-      <w:pPr>
-        <w:spacing w:after="160" w:line="360" w:lineRule="auto"/>
-        <w:rPr>
-          <w:rFonts w:ascii="Calibri" w:eastAsia="Calibri" w:hAnsi="Calibri"/>
-          <w:i/>
-          <w:color w:val="4A5568"/>
-          <w:lang w:val="pt-BR"/>
-        </w:rPr>
-      </w:pPr>
-      <w:r>
-        <w:rPr>
-          <w:rFonts w:ascii="Calibri" w:eastAsia="Calibri" w:hAnsi="Calibri"/>
-          <w:i/>
-          <w:color w:val="4A5568"/>
-          <w:lang w:val="pt-BR"/>
-        </w:rPr>
-        <w:t xml:space="preserve">O objetivo é transformar essa prova de conceito em um </w:t>
-      </w:r>
-      <w:r>
-        <w:rPr>
-          <w:rFonts w:ascii="Calibri" w:eastAsia="Calibri" w:hAnsi="Calibri"/>
-          <w:b/>
-          <w:bCs/>
-          <w:i/>
-          <w:color w:val="4A5568"/>
-          <w:lang w:val="pt-BR"/>
-        </w:rPr>
-        <w:t>produto escalável</w:t>
-      </w:r>
-      <w:r>
-        <w:rPr>
-          <w:rFonts w:ascii="Calibri" w:eastAsia="Calibri" w:hAnsi="Calibri"/>
-          <w:i/>
-          <w:color w:val="4A5568"/>
-          <w:lang w:val="pt-BR"/>
-        </w:rPr>
-        <w:t>, capaz de consolidar diferentes fontes de informação e apoiar gestores em suas decisões.</w:t>
-      </w:r>
-    </w:p>
-    <w:p>
-      <w:pPr>
-        <w:spacing w:after="160" w:line="360" w:lineRule="auto"/>
-        <w:rPr>
-          <w:lang w:val="pt-BR"/>
-        </w:rPr>
-      </w:pPr>
-      <w:r>
-        <w:rPr>
-          <w:rFonts w:ascii="Calibri" w:eastAsia="Calibri" w:hAnsi="Calibri"/>
-          <w:i/>
-          <w:color w:val="4A5568"/>
-          <w:lang w:val="pt-BR"/>
-        </w:rPr>
-        <w:t xml:space="preserve">No início convidamos vocês a imaginarem que vocês descobriram que o faturamento caiu 18% </w:t>
-      </w:r>
-      <w:r>
-        <w:rPr>
-          <w:rFonts w:ascii="Calibri" w:eastAsia="Calibri" w:hAnsi="Calibri"/>
-          <w:i/>
-          <w:color w:val="4A5568"/>
-          <w:lang w:val="pt-BR"/>
-        </w:rPr>
-        <w:t>e precisava</w:t>
-      </w:r>
-      <w:r>
-        <w:rPr>
-          <w:rFonts w:ascii="Calibri" w:eastAsia="Calibri" w:hAnsi="Calibri"/>
-          <w:i/>
-          <w:color w:val="4A5568"/>
-          <w:lang w:val="pt-BR"/>
-        </w:rPr>
-        <w:t>m</w:t>
-      </w:r>
-      <w:r>
-        <w:rPr>
-          <w:rFonts w:ascii="Calibri" w:eastAsia="Calibri" w:hAnsi="Calibri"/>
-          <w:i/>
-          <w:color w:val="4A5568"/>
-          <w:lang w:val="pt-BR"/>
-        </w:rPr>
-        <w:t xml:space="preserve"> procurar em diferentes sistemas para entender o motivo.</w:t>
-      </w:r>
-      <w:r>
-        <w:rPr>
-          <w:rFonts w:ascii="Calibri" w:eastAsia="Calibri" w:hAnsi="Calibri"/>
-          <w:i/>
-          <w:color w:val="4A5568"/>
-          <w:lang w:val="pt-BR"/>
-        </w:rPr>
-        <w:t xml:space="preserve"> Com o DUAXIS, os dados continuam no lugar da empresa; </w:t>
-      </w:r>
-      <w:r>
-        <w:rPr>
-          <w:rFonts w:ascii="Calibri" w:eastAsia="Calibri" w:hAnsi="Calibri"/>
-          <w:b/>
-          <w:bCs/>
-          <w:i/>
-          <w:color w:val="4A5568"/>
-          <w:lang w:val="pt-BR"/>
-        </w:rPr>
-        <w:t>O que muda é a forma de transformá-los em entendimento e decisões.</w:t>
-      </w:r>
-    </w:p>
-    <w:p>
-      <w:pPr>
-        <w:spacing w:after="160" w:line="360" w:lineRule="auto"/>
-        <w:rPr>
-          <w:lang w:val="pt-BR"/>
-        </w:rPr>
-      </w:pPr>
-      <w:r>
-        <w:rPr>
-          <w:rFonts w:ascii="Calibri" w:eastAsia="Calibri" w:hAnsi="Calibri"/>
-          <w:i/>
-          <w:color w:val="4A5568"/>
-          <w:lang w:val="pt-BR"/>
-        </w:rPr>
-        <w:t>Uma empresa não precisa de mais um lugar para consultar números. Precisa entender o que esses números estão dizendo.</w:t>
-      </w:r>
-    </w:p>
-    <w:p>
-      <w:pPr>
-        <w:spacing w:after="160" w:line="360" w:lineRule="auto"/>
-        <w:rPr>
-          <w:lang w:val="pt-BR"/>
-        </w:rPr>
-      </w:pPr>
-      <w:r>
-        <w:rPr>
-          <w:rFonts w:ascii="Calibri" w:eastAsia="Calibri" w:hAnsi="Calibri"/>
-          <w:i/>
-          <w:color w:val="4A5568"/>
-          <w:lang w:val="pt-BR"/>
-        </w:rPr>
-        <w:t>Pausa.</w:t>
-      </w:r>
-    </w:p>
-    <w:p>
-      <w:pPr>
-        <w:spacing w:after="160" w:line="360" w:lineRule="auto"/>
-        <w:rPr>
-          <w:lang w:val="pt-BR"/>
-        </w:rPr>
-      </w:pPr>
-      <w:r>
-        <w:rPr>
-          <w:rFonts w:ascii="Calibri" w:eastAsia="Calibri" w:hAnsi="Calibri"/>
-          <w:i/>
-          <w:color w:val="4A5568"/>
-          <w:lang w:val="pt-BR"/>
-        </w:rPr>
-        <w:t>DUAXIS: seus dados já têm as respostas. Nós queremos tornar mais fácil encontrá-las.</w:t>
-      </w:r>
-    </w:p>
-    <w:p>
-      <w:pPr>
-        <w:spacing w:before="320" w:after="160"/>
-        <w:rPr>
-          <w:lang w:val="pt-BR"/>
-        </w:rPr>
-      </w:pPr>
-      <w:r>
-        <w:rPr>
-          <w:rFonts w:ascii="Calibri" w:eastAsia="Calibri" w:hAnsi="Calibri"/>
-          <w:b/>
-          <w:color w:val="1E3A5F"/>
-          <w:sz w:val="32"/>
-          <w:lang w:val="pt-BR"/>
-        </w:rPr>
-        <w:t>Slide Antes × com o DUAXIS (versão segura)</w:t>
-      </w:r>
-    </w:p>
-    <w:p>
-      <w:pPr>
-        <w:spacing w:after="160" w:line="360" w:lineRule="auto"/>
+        <w:spacing w:after="0" w:line="360" w:lineRule="auto"/>
         <w:rPr>
           <w:lang w:val="pt-BR"/>
         </w:rPr>
@@ -4053,6 +4235,9 @@
             <w:shd w:val="clear" w:color="auto" w:fill="1E3A5F"/>
           </w:tcPr>
           <w:p>
+            <w:pPr>
+              <w:spacing w:line="360" w:lineRule="auto"/>
+            </w:pPr>
             <w:r>
               <w:rPr>
                 <w:rFonts w:ascii="Calibri" w:hAnsi="Calibri"/>
@@ -4070,6 +4255,9 @@
             <w:shd w:val="clear" w:color="auto" w:fill="1E3A5F"/>
           </w:tcPr>
           <w:p>
+            <w:pPr>
+              <w:spacing w:line="360" w:lineRule="auto"/>
+            </w:pPr>
             <w:r>
               <w:rPr>
                 <w:rFonts w:ascii="Calibri" w:hAnsi="Calibri"/>
@@ -4089,6 +4277,7 @@
           </w:tcPr>
           <w:p>
             <w:pPr>
+              <w:spacing w:line="360" w:lineRule="auto"/>
               <w:rPr>
                 <w:rFonts w:ascii="Calibri" w:eastAsia="Calibri" w:hAnsi="Calibri"/>
                 <w:i/>
@@ -4113,6 +4302,7 @@
           </w:tcPr>
           <w:p>
             <w:pPr>
+              <w:spacing w:line="360" w:lineRule="auto"/>
               <w:rPr>
                 <w:rFonts w:ascii="Calibri" w:eastAsia="Calibri" w:hAnsi="Calibri"/>
                 <w:i/>
@@ -4139,6 +4329,7 @@
           </w:tcPr>
           <w:p>
             <w:pPr>
+              <w:spacing w:line="360" w:lineRule="auto"/>
               <w:rPr>
                 <w:rFonts w:ascii="Calibri" w:eastAsia="Calibri" w:hAnsi="Calibri"/>
                 <w:i/>
@@ -4153,7 +4344,6 @@
                 <w:color w:val="4A5568"/>
                 <w:lang w:val="pt-BR"/>
               </w:rPr>
-              <w:lastRenderedPageBreak/>
               <w:t>Cruzamento manual</w:t>
             </w:r>
           </w:p>
@@ -4164,6 +4354,7 @@
           </w:tcPr>
           <w:p>
             <w:pPr>
+              <w:spacing w:line="360" w:lineRule="auto"/>
               <w:rPr>
                 <w:rFonts w:ascii="Calibri" w:eastAsia="Calibri" w:hAnsi="Calibri"/>
                 <w:i/>
@@ -4190,6 +4381,7 @@
           </w:tcPr>
           <w:p>
             <w:pPr>
+              <w:spacing w:line="360" w:lineRule="auto"/>
               <w:rPr>
                 <w:rFonts w:ascii="Calibri" w:eastAsia="Calibri" w:hAnsi="Calibri"/>
                 <w:i/>
@@ -4214,6 +4406,7 @@
           </w:tcPr>
           <w:p>
             <w:pPr>
+              <w:spacing w:line="360" w:lineRule="auto"/>
               <w:rPr>
                 <w:rFonts w:ascii="Calibri" w:eastAsia="Calibri" w:hAnsi="Calibri"/>
                 <w:i/>
@@ -4240,6 +4433,7 @@
           </w:tcPr>
           <w:p>
             <w:pPr>
+              <w:spacing w:line="360" w:lineRule="auto"/>
               <w:rPr>
                 <w:rFonts w:ascii="Calibri" w:eastAsia="Calibri" w:hAnsi="Calibri"/>
                 <w:i/>
@@ -4254,6 +4448,7 @@
                 <w:color w:val="4A5568"/>
                 <w:lang w:val="pt-BR"/>
               </w:rPr>
+              <w:lastRenderedPageBreak/>
               <w:t>Relatórios para interpretar</w:t>
             </w:r>
           </w:p>
@@ -4264,6 +4459,7 @@
           </w:tcPr>
           <w:p>
             <w:pPr>
+              <w:spacing w:line="360" w:lineRule="auto"/>
               <w:rPr>
                 <w:rFonts w:ascii="Calibri" w:eastAsia="Calibri" w:hAnsi="Calibri"/>
                 <w:i/>
@@ -4290,6 +4486,7 @@
           </w:tcPr>
           <w:p>
             <w:pPr>
+              <w:spacing w:line="360" w:lineRule="auto"/>
               <w:rPr>
                 <w:rFonts w:ascii="Calibri" w:eastAsia="Calibri" w:hAnsi="Calibri"/>
                 <w:i/>
@@ -4314,6 +4511,7 @@
           </w:tcPr>
           <w:p>
             <w:pPr>
+              <w:spacing w:line="360" w:lineRule="auto"/>
               <w:rPr>
                 <w:rFonts w:ascii="Calibri" w:eastAsia="Calibri" w:hAnsi="Calibri"/>
                 <w:i/>
@@ -4340,6 +4538,7 @@
           </w:tcPr>
           <w:p>
             <w:pPr>
+              <w:spacing w:line="360" w:lineRule="auto"/>
               <w:rPr>
                 <w:rFonts w:ascii="Calibri" w:eastAsia="Calibri" w:hAnsi="Calibri"/>
                 <w:i/>
@@ -4364,6 +4563,7 @@
           </w:tcPr>
           <w:p>
             <w:pPr>
+              <w:spacing w:line="360" w:lineRule="auto"/>
               <w:rPr>
                 <w:rFonts w:ascii="Calibri" w:eastAsia="Calibri" w:hAnsi="Calibri"/>
                 <w:i/>

</xml_diff>

<commit_message>
Adiciona novos documentos de apresentação e planejamento do DUAXIS, incluindo uma proposta de apresentação em PDF e um roteiro atualizado para a apresentação. O documento "TUDO OQUE FOI FEITO" foi criado para detalhar ajustes e funcionalidades do projeto, visando melhorar a comunicação e a clareza das informações apresentadas. Essas adições têm como objetivo aprimorar a experiência de apresentação e facilitar a compreensão do projeto por stakeholders e novos membros da equipe.
</commit_message>
<xml_diff>
--- a/DOCUMENTOS/PITCH/Roteiro Duaxis - 05.09.docx
+++ b/DOCUMENTOS/PITCH/Roteiro Duaxis - 05.09.docx
@@ -747,6 +747,25 @@
         <w:t>problema</w:t>
       </w:r>
       <w:proofErr w:type="spellEnd"/>
+      <w:r>
+        <w:rPr>
+          <w:rFonts w:ascii="Calibri" w:eastAsia="Calibri" w:hAnsi="Calibri"/>
+          <w:b/>
+          <w:color w:val="1E3A5F"/>
+          <w:sz w:val="32"/>
+        </w:rPr>
+        <w:t xml:space="preserve"> - </w:t>
+      </w:r>
+      <w:r>
+        <w:rPr>
+          <w:rFonts w:ascii="Calibri" w:eastAsia="Calibri" w:hAnsi="Calibri"/>
+          <w:b/>
+          <w:color w:val="1E3A5F"/>
+          <w:sz w:val="32"/>
+          <w:highlight w:val="green"/>
+        </w:rPr>
+        <w:t>ALEXYA</w:t>
+      </w:r>
     </w:p>
     <w:p>
       <w:pPr>
@@ -897,8 +916,405 @@
           <w:sz w:val="26"/>
           <w:lang w:val="pt-BR"/>
         </w:rPr>
-        <w:t>Problema</w:t>
-      </w:r>
+        <w:t>Problema:</w:t>
+      </w:r>
+      <w:r>
+        <w:rPr>
+          <w:rFonts w:ascii="Calibri" w:eastAsia="Calibri" w:hAnsi="Calibri"/>
+          <w:i/>
+          <w:color w:val="4A5568"/>
+          <w:lang w:val="pt-BR"/>
+        </w:rPr>
+        <w:t xml:space="preserve"> </w:t>
+      </w:r>
+      <w:r>
+        <w:rPr>
+          <w:rFonts w:ascii="Calibri" w:eastAsia="Calibri" w:hAnsi="Calibri"/>
+          <w:i/>
+          <w:color w:val="4A5568"/>
+          <w:lang w:val="pt-BR"/>
+        </w:rPr>
+        <w:t xml:space="preserve">E essa é a realidade de muitas </w:t>
+      </w:r>
+      <w:proofErr w:type="spellStart"/>
+      <w:r>
+        <w:rPr>
+          <w:rFonts w:ascii="Calibri" w:eastAsia="Calibri" w:hAnsi="Calibri"/>
+          <w:i/>
+          <w:color w:val="4A5568"/>
+          <w:lang w:val="pt-BR"/>
+        </w:rPr>
+        <w:t>PMEs</w:t>
+      </w:r>
+      <w:proofErr w:type="spellEnd"/>
+      <w:r>
+        <w:rPr>
+          <w:rFonts w:ascii="Calibri" w:eastAsia="Calibri" w:hAnsi="Calibri"/>
+          <w:i/>
+          <w:color w:val="4A5568"/>
+          <w:lang w:val="pt-BR"/>
+        </w:rPr>
+        <w:t>, O problema não é necessariamente a falta de dados,</w:t>
+      </w:r>
+      <w:r>
+        <w:rPr>
+          <w:rFonts w:ascii="Calibri" w:eastAsia="Calibri" w:hAnsi="Calibri"/>
+          <w:b/>
+          <w:bCs/>
+          <w:i/>
+          <w:color w:val="4A5568"/>
+          <w:lang w:val="pt-BR"/>
+        </w:rPr>
+        <w:t xml:space="preserve"> eles</w:t>
+      </w:r>
+      <w:r>
+        <w:rPr>
+          <w:rFonts w:ascii="Calibri" w:eastAsia="Calibri" w:hAnsi="Calibri"/>
+          <w:i/>
+          <w:color w:val="4A5568"/>
+          <w:lang w:val="pt-BR"/>
+        </w:rPr>
+        <w:t xml:space="preserve"> </w:t>
+      </w:r>
+      <w:r>
+        <w:rPr>
+          <w:rFonts w:ascii="Calibri" w:eastAsia="Calibri" w:hAnsi="Calibri"/>
+          <w:b/>
+          <w:i/>
+          <w:color w:val="4A5568"/>
+          <w:lang w:val="pt-BR"/>
+        </w:rPr>
+        <w:t>existem</w:t>
+      </w:r>
+      <w:r>
+        <w:rPr>
+          <w:rFonts w:ascii="Calibri" w:eastAsia="Calibri" w:hAnsi="Calibri"/>
+          <w:i/>
+          <w:color w:val="4A5568"/>
+          <w:lang w:val="pt-BR"/>
+        </w:rPr>
+        <w:t xml:space="preserve"> — vendas, estoque, compras, financeiro</w:t>
+      </w:r>
+      <w:r>
+        <w:rPr>
+          <w:rFonts w:ascii="Calibri" w:eastAsia="Calibri" w:hAnsi="Calibri"/>
+          <w:i/>
+          <w:color w:val="4A5568"/>
+          <w:lang w:val="pt-BR"/>
+        </w:rPr>
+        <w:t>, RH</w:t>
+      </w:r>
+      <w:r>
+        <w:rPr>
+          <w:rFonts w:ascii="Calibri" w:eastAsia="Calibri" w:hAnsi="Calibri"/>
+          <w:i/>
+          <w:color w:val="4A5568"/>
+          <w:lang w:val="pt-BR"/>
+        </w:rPr>
+        <w:t xml:space="preserve"> — mas estão </w:t>
+      </w:r>
+      <w:r>
+        <w:rPr>
+          <w:rFonts w:ascii="Calibri" w:eastAsia="Calibri" w:hAnsi="Calibri"/>
+          <w:b/>
+          <w:i/>
+          <w:color w:val="4A5568"/>
+          <w:lang w:val="pt-BR"/>
+        </w:rPr>
+        <w:t>espalhados</w:t>
+      </w:r>
+      <w:r>
+        <w:rPr>
+          <w:rFonts w:ascii="Calibri" w:eastAsia="Calibri" w:hAnsi="Calibri"/>
+          <w:i/>
+          <w:color w:val="4A5568"/>
+          <w:lang w:val="pt-BR"/>
+        </w:rPr>
+        <w:t>. O gargalo não é “não ter número”. É o caminho longo até transformar número em decisão.</w:t>
+      </w:r>
+    </w:p>
+    <w:p>
+      <w:pPr>
+        <w:spacing w:after="0" w:line="360" w:lineRule="auto"/>
+        <w:rPr>
+          <w:rFonts w:ascii="Calibri" w:eastAsia="Calibri" w:hAnsi="Calibri"/>
+          <w:bCs/>
+          <w:i/>
+          <w:color w:val="4A5568"/>
+          <w:lang w:val="pt-BR"/>
+        </w:rPr>
+      </w:pPr>
+      <w:r>
+        <w:rPr>
+          <w:rFonts w:ascii="Calibri" w:eastAsia="Calibri" w:hAnsi="Calibri"/>
+          <w:bCs/>
+          <w:i/>
+          <w:color w:val="4A5568"/>
+          <w:lang w:val="pt-BR"/>
+        </w:rPr>
+        <w:t>E esse cenário também aparece nos dados do Sebrae:</w:t>
+      </w:r>
+      <w:r>
+        <w:rPr>
+          <w:rFonts w:ascii="Calibri" w:eastAsia="Calibri" w:hAnsi="Calibri"/>
+          <w:bCs/>
+          <w:i/>
+          <w:color w:val="4A5568"/>
+          <w:lang w:val="pt-BR"/>
+        </w:rPr>
+        <w:t xml:space="preserve"> uma pesquisa de</w:t>
+      </w:r>
+      <w:r>
+        <w:rPr>
+          <w:rFonts w:ascii="Calibri" w:eastAsia="Calibri" w:hAnsi="Calibri"/>
+          <w:bCs/>
+          <w:i/>
+          <w:color w:val="4A5568"/>
+          <w:lang w:val="pt-BR"/>
+        </w:rPr>
+        <w:t xml:space="preserve"> 2025,</w:t>
+      </w:r>
+      <w:r>
+        <w:rPr>
+          <w:rFonts w:ascii="Calibri" w:eastAsia="Calibri" w:hAnsi="Calibri"/>
+          <w:bCs/>
+          <w:i/>
+          <w:color w:val="4A5568"/>
+          <w:lang w:val="pt-BR"/>
+        </w:rPr>
+        <w:t xml:space="preserve"> aponta que</w:t>
+      </w:r>
+      <w:r>
+        <w:rPr>
+          <w:rFonts w:ascii="Calibri" w:eastAsia="Calibri" w:hAnsi="Calibri"/>
+          <w:bCs/>
+          <w:i/>
+          <w:color w:val="4A5568"/>
+          <w:lang w:val="pt-BR"/>
+        </w:rPr>
+        <w:t xml:space="preserve"> 47% dos pequenos negócios </w:t>
+      </w:r>
+      <w:r>
+        <w:rPr>
+          <w:rFonts w:ascii="Calibri" w:eastAsia="Calibri" w:hAnsi="Calibri"/>
+          <w:bCs/>
+          <w:i/>
+          <w:color w:val="4A5568"/>
+          <w:lang w:val="pt-BR"/>
+        </w:rPr>
+        <w:t xml:space="preserve">já usam software de gestão. Ou seja: já há ferramenta e dado; falta um copiloto que interprete sem substituir </w:t>
+      </w:r>
+      <w:r>
+        <w:rPr>
+          <w:rFonts w:ascii="Calibri" w:eastAsia="Calibri" w:hAnsi="Calibri"/>
+          <w:bCs/>
+          <w:i/>
+          <w:color w:val="4A5568"/>
+          <w:lang w:val="pt-BR"/>
+        </w:rPr>
+        <w:t>os sistema</w:t>
+      </w:r>
+      <w:r>
+        <w:rPr>
+          <w:rFonts w:ascii="Calibri" w:eastAsia="Calibri" w:hAnsi="Calibri"/>
+          <w:bCs/>
+          <w:i/>
+          <w:color w:val="4A5568"/>
+          <w:lang w:val="pt-BR"/>
+        </w:rPr>
+        <w:t>s</w:t>
+      </w:r>
+      <w:r>
+        <w:rPr>
+          <w:rFonts w:ascii="Calibri" w:eastAsia="Calibri" w:hAnsi="Calibri"/>
+          <w:bCs/>
+          <w:i/>
+          <w:color w:val="4A5568"/>
+          <w:lang w:val="pt-BR"/>
+        </w:rPr>
+        <w:t xml:space="preserve"> de gestão que a empresa já usa</w:t>
+      </w:r>
+      <w:r>
+        <w:rPr>
+          <w:rFonts w:ascii="Calibri" w:eastAsia="Calibri" w:hAnsi="Calibri"/>
+          <w:bCs/>
+          <w:i/>
+          <w:color w:val="4A5568"/>
+          <w:lang w:val="pt-BR"/>
+        </w:rPr>
+        <w:t>.</w:t>
+      </w:r>
+    </w:p>
+    <w:p>
+      <w:pPr>
+        <w:spacing w:after="0" w:line="360" w:lineRule="auto"/>
+        <w:rPr>
+          <w:rFonts w:ascii="Calibri" w:eastAsia="Calibri" w:hAnsi="Calibri"/>
+          <w:i/>
+          <w:color w:val="4A5568"/>
+          <w:lang w:val="pt-BR"/>
+        </w:rPr>
+      </w:pPr>
+      <w:r>
+        <w:rPr>
+          <w:rFonts w:ascii="Calibri" w:eastAsia="Calibri" w:hAnsi="Calibri"/>
+          <w:i/>
+          <w:color w:val="4A5568"/>
+          <w:lang w:val="pt-BR"/>
+        </w:rPr>
+        <w:t>É justamente essa distância entre os dados disponíveis e a decisão do gestor que o DUAXIS busca reduzir</w:t>
+      </w:r>
+      <w:r>
+        <w:rPr>
+          <w:rFonts w:ascii="Calibri" w:eastAsia="Calibri" w:hAnsi="Calibri"/>
+          <w:i/>
+          <w:color w:val="4A5568"/>
+          <w:lang w:val="pt-BR"/>
+        </w:rPr>
+        <w:t>.</w:t>
+      </w:r>
+      <w:r>
+        <w:rPr>
+          <w:rFonts w:ascii="Calibri" w:eastAsia="Calibri" w:hAnsi="Calibri"/>
+          <w:i/>
+          <w:color w:val="4A5568"/>
+          <w:lang w:val="pt-BR"/>
+        </w:rPr>
+        <w:t xml:space="preserve"> </w:t>
+      </w:r>
+    </w:p>
+    <w:p>
+      <w:pPr>
+        <w:spacing w:after="0" w:line="360" w:lineRule="auto"/>
+        <w:rPr>
+          <w:lang w:val="pt-BR"/>
+        </w:rPr>
+      </w:pPr>
+      <w:r>
+        <w:rPr>
+          <w:rFonts w:ascii="Calibri" w:eastAsia="Calibri" w:hAnsi="Calibri"/>
+          <w:i/>
+          <w:color w:val="4A5568"/>
+          <w:lang w:val="pt-BR"/>
+        </w:rPr>
+        <w:t>Transição: “</w:t>
+      </w:r>
+      <w:r>
+        <w:rPr>
+          <w:rFonts w:ascii="Calibri" w:eastAsia="Calibri" w:hAnsi="Calibri"/>
+          <w:b/>
+          <w:bCs/>
+          <w:i/>
+          <w:color w:val="4A5568"/>
+          <w:lang w:val="pt-BR"/>
+        </w:rPr>
+        <w:t>Mas quem exatamente enfrenta esse problema e como o DUAXIS entra nessa realidade?</w:t>
+      </w:r>
+      <w:r>
+        <w:rPr>
+          <w:rFonts w:ascii="Calibri" w:eastAsia="Calibri" w:hAnsi="Calibri"/>
+          <w:i/>
+          <w:color w:val="4A5568"/>
+          <w:lang w:val="pt-BR"/>
+        </w:rPr>
+        <w:t>”</w:t>
+      </w:r>
+    </w:p>
+    <w:p>
+      <w:pPr>
+        <w:spacing w:before="320" w:after="0" w:line="360" w:lineRule="auto"/>
+        <w:rPr>
+          <w:lang w:val="pt-BR"/>
+        </w:rPr>
+      </w:pPr>
+      <w:r>
+        <w:rPr>
+          <w:rFonts w:ascii="Calibri" w:eastAsia="Calibri" w:hAnsi="Calibri"/>
+          <w:b/>
+          <w:color w:val="1E3A5F"/>
+          <w:sz w:val="32"/>
+          <w:lang w:val="pt-BR"/>
+        </w:rPr>
+        <w:lastRenderedPageBreak/>
+        <w:t>Participante 2 — Público + solução</w:t>
+      </w:r>
+      <w:r>
+        <w:rPr>
+          <w:rFonts w:ascii="Calibri" w:eastAsia="Calibri" w:hAnsi="Calibri"/>
+          <w:b/>
+          <w:color w:val="1E3A5F"/>
+          <w:sz w:val="32"/>
+          <w:lang w:val="pt-BR"/>
+        </w:rPr>
+        <w:t xml:space="preserve"> - </w:t>
+      </w:r>
+      <w:r>
+        <w:rPr>
+          <w:rFonts w:ascii="Calibri" w:eastAsia="Calibri" w:hAnsi="Calibri"/>
+          <w:b/>
+          <w:color w:val="1E3A5F"/>
+          <w:sz w:val="32"/>
+          <w:highlight w:val="green"/>
+          <w:lang w:val="pt-BR"/>
+        </w:rPr>
+        <w:t>LETICIA</w:t>
+      </w:r>
+    </w:p>
+    <w:p>
+      <w:pPr>
+        <w:spacing w:after="0" w:line="360" w:lineRule="auto"/>
+        <w:rPr>
+          <w:lang w:val="pt-BR"/>
+        </w:rPr>
+      </w:pPr>
+      <w:r>
+        <w:rPr>
+          <w:rFonts w:ascii="Calibri" w:eastAsia="Calibri" w:hAnsi="Calibri"/>
+          <w:b/>
+          <w:color w:val="1E3A5F"/>
+          <w:lang w:val="pt-BR"/>
+        </w:rPr>
+        <w:t xml:space="preserve">Tempo: </w:t>
+      </w:r>
+      <w:r>
+        <w:rPr>
+          <w:rFonts w:ascii="Calibri" w:eastAsia="Calibri" w:hAnsi="Calibri"/>
+          <w:lang w:val="pt-BR"/>
+        </w:rPr>
+        <w:t>cerca de 2 minutos</w:t>
+      </w:r>
+    </w:p>
+    <w:p>
+      <w:pPr>
+        <w:spacing w:after="0" w:line="360" w:lineRule="auto"/>
+        <w:rPr>
+          <w:lang w:val="pt-BR"/>
+        </w:rPr>
+      </w:pPr>
+      <w:r>
+        <w:rPr>
+          <w:rFonts w:ascii="Calibri" w:eastAsia="Calibri" w:hAnsi="Calibri"/>
+          <w:b/>
+          <w:color w:val="1E3A5F"/>
+          <w:lang w:val="pt-BR"/>
+        </w:rPr>
+        <w:t xml:space="preserve">Slides: </w:t>
+      </w:r>
+      <w:r>
+        <w:rPr>
+          <w:rFonts w:ascii="Calibri" w:eastAsia="Calibri" w:hAnsi="Calibri"/>
+          <w:lang w:val="pt-BR"/>
+        </w:rPr>
+        <w:t>para quem é + o que o DUAXIS é (e o que não é)</w:t>
+      </w:r>
+    </w:p>
+    <w:p>
+      <w:pPr>
+        <w:spacing w:before="240" w:after="0" w:line="360" w:lineRule="auto"/>
+        <w:rPr>
+          <w:lang w:val="pt-BR"/>
+        </w:rPr>
+      </w:pPr>
       <w:r>
         <w:rPr>
           <w:rFonts w:ascii="Calibri" w:eastAsia="Calibri" w:hAnsi="Calibri"/>
@@ -907,7 +1323,7 @@
           <w:sz w:val="26"/>
           <w:lang w:val="pt-BR"/>
         </w:rPr>
-        <w:t>:</w:t>
+        <w:t>Público:</w:t>
       </w:r>
       <w:r>
         <w:rPr>
@@ -925,27 +1341,191 @@
           <w:color w:val="4A5568"/>
           <w:lang w:val="pt-BR"/>
         </w:rPr>
-        <w:t xml:space="preserve">E essa é a realidade de muitas </w:t>
-      </w:r>
-      <w:proofErr w:type="spellStart"/>
-      <w:r>
-        <w:rPr>
-          <w:rFonts w:ascii="Calibri" w:eastAsia="Calibri" w:hAnsi="Calibri"/>
-          <w:i/>
-          <w:color w:val="4A5568"/>
-          <w:lang w:val="pt-BR"/>
-        </w:rPr>
-        <w:t>PMEs</w:t>
-      </w:r>
-      <w:proofErr w:type="spellEnd"/>
-      <w:r>
-        <w:rPr>
-          <w:rFonts w:ascii="Calibri" w:eastAsia="Calibri" w:hAnsi="Calibri"/>
-          <w:i/>
-          <w:color w:val="4A5568"/>
-          <w:lang w:val="pt-BR"/>
-        </w:rPr>
-        <w:t>, O problema não é necessariamente a falta de dados,</w:t>
+        <w:t xml:space="preserve">O DUAXIS é voltado para pequenas e médias empresas, principalmente aquelas que utilizam mais de um sistema de gestão e </w:t>
+      </w:r>
+      <w:r>
+        <w:rPr>
+          <w:rFonts w:ascii="Calibri" w:eastAsia="Calibri" w:hAnsi="Calibri"/>
+          <w:i/>
+          <w:color w:val="4A5568"/>
+          <w:lang w:val="pt-BR"/>
+        </w:rPr>
+        <w:t>que não</w:t>
+      </w:r>
+      <w:r>
+        <w:rPr>
+          <w:rFonts w:ascii="Calibri" w:eastAsia="Calibri" w:hAnsi="Calibri"/>
+          <w:i/>
+          <w:color w:val="4A5568"/>
+          <w:lang w:val="pt-BR"/>
+        </w:rPr>
+        <w:t xml:space="preserve"> possuem uma equipe especializada em BI ou Ciência de Dados</w:t>
+      </w:r>
+      <w:r>
+        <w:rPr>
+          <w:rFonts w:ascii="Calibri" w:eastAsia="Calibri" w:hAnsi="Calibri"/>
+          <w:i/>
+          <w:color w:val="4A5568"/>
+          <w:lang w:val="pt-BR"/>
+        </w:rPr>
+        <w:t>.</w:t>
+      </w:r>
+    </w:p>
+    <w:p>
+      <w:pPr>
+        <w:spacing w:after="0" w:line="360" w:lineRule="auto"/>
+        <w:rPr>
+          <w:lang w:val="pt-BR"/>
+        </w:rPr>
+      </w:pPr>
+      <w:r>
+        <w:rPr>
+          <w:rFonts w:ascii="Calibri" w:eastAsia="Calibri" w:hAnsi="Calibri"/>
+          <w:b/>
+          <w:color w:val="1E3A5F"/>
+          <w:sz w:val="26"/>
+          <w:lang w:val="pt-BR"/>
+        </w:rPr>
+        <w:t>Solução:</w:t>
+      </w:r>
+      <w:r>
+        <w:rPr>
+          <w:rFonts w:ascii="Calibri" w:eastAsia="Calibri" w:hAnsi="Calibri"/>
+          <w:i/>
+          <w:color w:val="4A5568"/>
+          <w:lang w:val="pt-BR"/>
+        </w:rPr>
+        <w:t xml:space="preserve"> o DUAXIS </w:t>
+      </w:r>
+      <w:r>
+        <w:rPr>
+          <w:rFonts w:ascii="Calibri" w:eastAsia="Calibri" w:hAnsi="Calibri"/>
+          <w:b/>
+          <w:i/>
+          <w:color w:val="4A5568"/>
+          <w:lang w:val="pt-BR"/>
+        </w:rPr>
+        <w:t>não substitui o ERP</w:t>
+      </w:r>
+      <w:r>
+        <w:rPr>
+          <w:rFonts w:ascii="Calibri" w:eastAsia="Calibri" w:hAnsi="Calibri"/>
+          <w:b/>
+          <w:i/>
+          <w:color w:val="4A5568"/>
+          <w:lang w:val="pt-BR"/>
+        </w:rPr>
+        <w:t>, o CRM, o sistema de RH ou as planilhas</w:t>
+      </w:r>
+      <w:r>
+        <w:rPr>
+          <w:rFonts w:ascii="Calibri" w:eastAsia="Calibri" w:hAnsi="Calibri"/>
+          <w:i/>
+          <w:color w:val="4A5568"/>
+          <w:lang w:val="pt-BR"/>
+        </w:rPr>
+        <w:t xml:space="preserve">. </w:t>
+      </w:r>
+      <w:r>
+        <w:rPr>
+          <w:rFonts w:ascii="Calibri" w:eastAsia="Calibri" w:hAnsi="Calibri"/>
+          <w:i/>
+          <w:color w:val="4A5568"/>
+          <w:lang w:val="pt-BR"/>
+        </w:rPr>
+        <w:t>Ele é</w:t>
+      </w:r>
+      <w:r>
+        <w:rPr>
+          <w:rFonts w:ascii="Calibri" w:eastAsia="Calibri" w:hAnsi="Calibri"/>
+          <w:i/>
+          <w:color w:val="4A5568"/>
+          <w:lang w:val="pt-BR"/>
+        </w:rPr>
+        <w:t xml:space="preserve"> um </w:t>
+      </w:r>
+      <w:r>
+        <w:rPr>
+          <w:rFonts w:ascii="Calibri" w:eastAsia="Calibri" w:hAnsi="Calibri"/>
+          <w:b/>
+          <w:i/>
+          <w:color w:val="4A5568"/>
+          <w:lang w:val="pt-BR"/>
+        </w:rPr>
+        <w:t>copiloto corporativo</w:t>
+      </w:r>
+      <w:r>
+        <w:rPr>
+          <w:rFonts w:ascii="Calibri" w:eastAsia="Calibri" w:hAnsi="Calibri"/>
+          <w:b/>
+          <w:i/>
+          <w:color w:val="4A5568"/>
+          <w:lang w:val="pt-BR"/>
+        </w:rPr>
+        <w:t xml:space="preserve"> </w:t>
+      </w:r>
+      <w:r>
+        <w:rPr>
+          <w:rFonts w:ascii="Calibri" w:eastAsia="Calibri" w:hAnsi="Calibri"/>
+          <w:bCs/>
+          <w:i/>
+          <w:color w:val="4A5568"/>
+          <w:lang w:val="pt-BR"/>
+        </w:rPr>
+        <w:t>que atua</w:t>
+      </w:r>
+      <w:r>
+        <w:rPr>
+          <w:rFonts w:ascii="Calibri" w:eastAsia="Calibri" w:hAnsi="Calibri"/>
+          <w:i/>
+          <w:color w:val="4A5568"/>
+          <w:lang w:val="pt-BR"/>
+        </w:rPr>
+        <w:t xml:space="preserve"> </w:t>
+      </w:r>
+      <w:r>
+        <w:rPr>
+          <w:rFonts w:ascii="Calibri" w:eastAsia="Calibri" w:hAnsi="Calibri"/>
+          <w:i/>
+          <w:color w:val="4A5568"/>
+          <w:lang w:val="pt-BR"/>
+        </w:rPr>
+        <w:t xml:space="preserve">como </w:t>
+      </w:r>
+      <w:r>
+        <w:rPr>
+          <w:rFonts w:ascii="Calibri" w:eastAsia="Calibri" w:hAnsi="Calibri"/>
+          <w:i/>
+          <w:color w:val="4A5568"/>
+          <w:lang w:val="pt-BR"/>
+        </w:rPr>
+        <w:t>uma camada que lê os dados da empresa e devolve resposta com número e explicação</w:t>
+      </w:r>
+      <w:r>
+        <w:rPr>
+          <w:rFonts w:ascii="Calibri" w:eastAsia="Calibri" w:hAnsi="Calibri"/>
+          <w:i/>
+          <w:color w:val="4A5568"/>
+          <w:lang w:val="pt-BR"/>
+        </w:rPr>
+        <w:t>.</w:t>
+      </w:r>
+    </w:p>
+    <w:p>
+      <w:pPr>
+        <w:spacing w:after="0" w:line="360" w:lineRule="auto"/>
+        <w:rPr>
+          <w:lang w:val="pt-BR"/>
+        </w:rPr>
+      </w:pPr>
+      <w:r>
+        <w:rPr>
+          <w:rFonts w:ascii="Calibri" w:eastAsia="Calibri" w:hAnsi="Calibri"/>
+          <w:i/>
+          <w:color w:val="4A5568"/>
+          <w:lang w:val="pt-BR"/>
+        </w:rPr>
+        <w:t xml:space="preserve">E o gestor pode interagir com essas informações utilizando </w:t>
       </w:r>
       <w:r>
         <w:rPr>
@@ -956,72 +1536,16 @@
           <w:color w:val="4A5568"/>
           <w:lang w:val="pt-BR"/>
         </w:rPr>
-        <w:t xml:space="preserve"> eles</w:t>
-      </w:r>
-      <w:r>
-        <w:rPr>
-          <w:rFonts w:ascii="Calibri" w:eastAsia="Calibri" w:hAnsi="Calibri"/>
-          <w:i/>
-          <w:color w:val="4A5568"/>
-          <w:lang w:val="pt-BR"/>
-        </w:rPr>
-        <w:t xml:space="preserve"> </w:t>
-      </w:r>
-      <w:r>
-        <w:rPr>
-          <w:rFonts w:ascii="Calibri" w:eastAsia="Calibri" w:hAnsi="Calibri"/>
-          <w:b/>
-          <w:i/>
-          <w:color w:val="4A5568"/>
-          <w:lang w:val="pt-BR"/>
-        </w:rPr>
-        <w:t>existem</w:t>
-      </w:r>
-      <w:r>
-        <w:rPr>
-          <w:rFonts w:ascii="Calibri" w:eastAsia="Calibri" w:hAnsi="Calibri"/>
-          <w:i/>
-          <w:color w:val="4A5568"/>
-          <w:lang w:val="pt-BR"/>
-        </w:rPr>
-        <w:t xml:space="preserve"> — vendas, estoque, compras, financeiro</w:t>
-      </w:r>
-      <w:r>
-        <w:rPr>
-          <w:rFonts w:ascii="Calibri" w:eastAsia="Calibri" w:hAnsi="Calibri"/>
-          <w:i/>
-          <w:color w:val="4A5568"/>
-          <w:lang w:val="pt-BR"/>
-        </w:rPr>
-        <w:t>, RH</w:t>
-      </w:r>
-      <w:r>
-        <w:rPr>
-          <w:rFonts w:ascii="Calibri" w:eastAsia="Calibri" w:hAnsi="Calibri"/>
-          <w:i/>
-          <w:color w:val="4A5568"/>
-          <w:lang w:val="pt-BR"/>
-        </w:rPr>
-        <w:t xml:space="preserve"> — mas estão </w:t>
-      </w:r>
-      <w:r>
-        <w:rPr>
-          <w:rFonts w:ascii="Calibri" w:eastAsia="Calibri" w:hAnsi="Calibri"/>
-          <w:b/>
-          <w:i/>
-          <w:color w:val="4A5568"/>
-          <w:lang w:val="pt-BR"/>
-        </w:rPr>
-        <w:t>espalhados</w:t>
-      </w:r>
-      <w:r>
-        <w:rPr>
-          <w:rFonts w:ascii="Calibri" w:eastAsia="Calibri" w:hAnsi="Calibri"/>
-          <w:i/>
-          <w:color w:val="4A5568"/>
-          <w:lang w:val="pt-BR"/>
-        </w:rPr>
-        <w:t>. O gargalo não é “não ter número”. É o caminho longo até transformar número em decisão.</w:t>
+        <w:t>linguagem natural</w:t>
+      </w:r>
+      <w:r>
+        <w:rPr>
+          <w:rFonts w:ascii="Calibri" w:eastAsia="Calibri" w:hAnsi="Calibri"/>
+          <w:i/>
+          <w:color w:val="4A5568"/>
+          <w:lang w:val="pt-BR"/>
+        </w:rPr>
+        <w:t>.</w:t>
       </w:r>
     </w:p>
     <w:p>
@@ -1029,6 +1553,7 @@
         <w:spacing w:after="0" w:line="360" w:lineRule="auto"/>
         <w:rPr>
           <w:rFonts w:ascii="Calibri" w:eastAsia="Calibri" w:hAnsi="Calibri"/>
+          <w:b/>
           <w:bCs/>
           <w:i/>
           <w:color w:val="4A5568"/>
@@ -1038,102 +1563,53 @@
       <w:r>
         <w:rPr>
           <w:rFonts w:ascii="Calibri" w:eastAsia="Calibri" w:hAnsi="Calibri"/>
+          <w:i/>
+          <w:color w:val="4A5568"/>
+          <w:lang w:val="pt-BR"/>
+        </w:rPr>
+        <w:t>Por exemplo:</w:t>
+      </w:r>
+      <w:r>
+        <w:rPr>
+          <w:rFonts w:ascii="Calibri" w:eastAsia="Calibri" w:hAnsi="Calibri"/>
+          <w:i/>
+          <w:color w:val="4A5568"/>
+          <w:lang w:val="pt-BR"/>
+        </w:rPr>
+        <w:t xml:space="preserve"> </w:t>
+      </w:r>
+      <w:r>
+        <w:rPr>
+          <w:rFonts w:ascii="Calibri" w:eastAsia="Calibri" w:hAnsi="Calibri"/>
+          <w:b/>
           <w:bCs/>
           <w:i/>
           <w:color w:val="4A5568"/>
           <w:lang w:val="pt-BR"/>
         </w:rPr>
-        <w:t>E esse cenário também aparece nos dados do Sebrae:</w:t>
-      </w:r>
-      <w:r>
-        <w:rPr>
-          <w:rFonts w:ascii="Calibri" w:eastAsia="Calibri" w:hAnsi="Calibri"/>
+        <w:t>“</w:t>
+      </w:r>
+      <w:r>
+        <w:rPr>
+          <w:rFonts w:ascii="Calibri" w:eastAsia="Calibri" w:hAnsi="Calibri"/>
+          <w:b/>
           <w:bCs/>
           <w:i/>
           <w:color w:val="4A5568"/>
           <w:lang w:val="pt-BR"/>
         </w:rPr>
-        <w:t xml:space="preserve"> uma pesquisa de</w:t>
-      </w:r>
-      <w:r>
-        <w:rPr>
-          <w:rFonts w:ascii="Calibri" w:eastAsia="Calibri" w:hAnsi="Calibri"/>
+        <w:t>Por que o lucro caiu em maio de 2026?</w:t>
+      </w:r>
+      <w:r>
+        <w:rPr>
+          <w:rFonts w:ascii="Calibri" w:eastAsia="Calibri" w:hAnsi="Calibri"/>
+          <w:b/>
           <w:bCs/>
           <w:i/>
           <w:color w:val="4A5568"/>
           <w:lang w:val="pt-BR"/>
         </w:rPr>
-        <w:t xml:space="preserve"> 2025,</w:t>
-      </w:r>
-      <w:r>
-        <w:rPr>
-          <w:rFonts w:ascii="Calibri" w:eastAsia="Calibri" w:hAnsi="Calibri"/>
-          <w:bCs/>
-          <w:i/>
-          <w:color w:val="4A5568"/>
-          <w:lang w:val="pt-BR"/>
-        </w:rPr>
-        <w:t xml:space="preserve"> aponta que</w:t>
-      </w:r>
-      <w:r>
-        <w:rPr>
-          <w:rFonts w:ascii="Calibri" w:eastAsia="Calibri" w:hAnsi="Calibri"/>
-          <w:bCs/>
-          <w:i/>
-          <w:color w:val="4A5568"/>
-          <w:lang w:val="pt-BR"/>
-        </w:rPr>
-        <w:t xml:space="preserve"> 47% dos pequenos negócios </w:t>
-      </w:r>
-      <w:r>
-        <w:rPr>
-          <w:rFonts w:ascii="Calibri" w:eastAsia="Calibri" w:hAnsi="Calibri"/>
-          <w:bCs/>
-          <w:i/>
-          <w:color w:val="4A5568"/>
-          <w:lang w:val="pt-BR"/>
-        </w:rPr>
-        <w:t xml:space="preserve">já usam software de gestão. Ou seja: já há ferramenta e dado; falta um copiloto que interprete sem substituir </w:t>
-      </w:r>
-      <w:r>
-        <w:rPr>
-          <w:rFonts w:ascii="Calibri" w:eastAsia="Calibri" w:hAnsi="Calibri"/>
-          <w:bCs/>
-          <w:i/>
-          <w:color w:val="4A5568"/>
-          <w:lang w:val="pt-BR"/>
-        </w:rPr>
-        <w:t>os sistema</w:t>
-      </w:r>
-      <w:r>
-        <w:rPr>
-          <w:rFonts w:ascii="Calibri" w:eastAsia="Calibri" w:hAnsi="Calibri"/>
-          <w:bCs/>
-          <w:i/>
-          <w:color w:val="4A5568"/>
-          <w:lang w:val="pt-BR"/>
-        </w:rPr>
-        <w:t>s</w:t>
-      </w:r>
-      <w:r>
-        <w:rPr>
-          <w:rFonts w:ascii="Calibri" w:eastAsia="Calibri" w:hAnsi="Calibri"/>
-          <w:bCs/>
-          <w:i/>
-          <w:color w:val="4A5568"/>
-          <w:lang w:val="pt-BR"/>
-        </w:rPr>
-        <w:t xml:space="preserve"> de gestão que a empresa já usa</w:t>
-      </w:r>
-      <w:r>
-        <w:rPr>
-          <w:rFonts w:ascii="Calibri" w:eastAsia="Calibri" w:hAnsi="Calibri"/>
-          <w:bCs/>
-          <w:i/>
-          <w:color w:val="4A5568"/>
-          <w:lang w:val="pt-BR"/>
-        </w:rPr>
-        <w:t>.</w:t>
+        <w:t>”</w:t>
       </w:r>
     </w:p>
     <w:p>
@@ -1153,44 +1629,52 @@
           <w:color w:val="4A5568"/>
           <w:lang w:val="pt-BR"/>
         </w:rPr>
-        <w:t>É justamente essa distância entre os dados disponíveis e a decisão do gestor que o DUAXIS busca reduzir</w:t>
-      </w:r>
-      <w:r>
-        <w:rPr>
-          <w:rFonts w:ascii="Calibri" w:eastAsia="Calibri" w:hAnsi="Calibri"/>
-          <w:i/>
-          <w:color w:val="4A5568"/>
-          <w:lang w:val="pt-BR"/>
-        </w:rPr>
-        <w:t>.</w:t>
-      </w:r>
-      <w:r>
-        <w:rPr>
-          <w:rFonts w:ascii="Calibri" w:eastAsia="Calibri" w:hAnsi="Calibri"/>
-          <w:i/>
-          <w:color w:val="4A5568"/>
-          <w:lang w:val="pt-BR"/>
-        </w:rPr>
-        <w:t xml:space="preserve"> </w:t>
+        <w:t>O DUAXIS não precisa simplesmente responder que houve uma queda.</w:t>
       </w:r>
     </w:p>
     <w:p>
       <w:pPr>
         <w:spacing w:after="0" w:line="360" w:lineRule="auto"/>
         <w:rPr>
-          <w:lang w:val="pt-BR"/>
-        </w:rPr>
-      </w:pPr>
-      <w:r>
-        <w:rPr>
-          <w:rFonts w:ascii="Calibri" w:eastAsia="Calibri" w:hAnsi="Calibri"/>
-          <w:i/>
-          <w:color w:val="4A5568"/>
-          <w:lang w:val="pt-BR"/>
-        </w:rPr>
-        <w:t>Transição: “</w:t>
-      </w:r>
-      <w:r>
+          <w:rFonts w:ascii="Calibri" w:eastAsia="Calibri" w:hAnsi="Calibri"/>
+          <w:i/>
+          <w:color w:val="4A5568"/>
+          <w:lang w:val="pt-BR"/>
+        </w:rPr>
+      </w:pPr>
+      <w:r>
+        <w:rPr>
+          <w:rFonts w:ascii="Calibri" w:eastAsia="Calibri" w:hAnsi="Calibri"/>
+          <w:i/>
+          <w:color w:val="4A5568"/>
+          <w:lang w:val="pt-BR"/>
+        </w:rPr>
+        <w:t>Ele pode analisar as informações e explicar o que contribuiu para aquele resultado.</w:t>
+      </w:r>
+    </w:p>
+    <w:p>
+      <w:pPr>
+        <w:spacing w:after="0" w:line="360" w:lineRule="auto"/>
+        <w:rPr>
+          <w:rFonts w:ascii="Calibri" w:eastAsia="Calibri" w:hAnsi="Calibri"/>
+          <w:i/>
+          <w:color w:val="4A5568"/>
+          <w:lang w:val="pt-BR"/>
+        </w:rPr>
+      </w:pPr>
+      <w:r>
+        <w:rPr>
+          <w:rFonts w:ascii="Calibri" w:eastAsia="Calibri" w:hAnsi="Calibri"/>
+          <w:i/>
+          <w:color w:val="4A5568"/>
+          <w:lang w:val="pt-BR"/>
+        </w:rPr>
+        <w:t>E o gestor também pode ir além:</w:t>
+      </w:r>
+    </w:p>
+    <w:p>
+      <w:pPr>
+        <w:spacing w:after="0" w:line="360" w:lineRule="auto"/>
         <w:rPr>
           <w:rFonts w:ascii="Calibri" w:eastAsia="Calibri" w:hAnsi="Calibri"/>
           <w:b/>
@@ -1199,7 +1683,145 @@
           <w:color w:val="4A5568"/>
           <w:lang w:val="pt-BR"/>
         </w:rPr>
-        <w:t>Mas quem exatamente enfrenta esse problema e como o DUAXIS entra nessa realidade?</w:t>
+      </w:pPr>
+      <w:r>
+        <w:rPr>
+          <w:rFonts w:ascii="Calibri" w:eastAsia="Calibri" w:hAnsi="Calibri"/>
+          <w:i/>
+          <w:color w:val="4A5568"/>
+          <w:lang w:val="pt-BR"/>
+        </w:rPr>
+        <w:t xml:space="preserve">Por exemplo: </w:t>
+      </w:r>
+      <w:r>
+        <w:rPr>
+          <w:rFonts w:ascii="Calibri" w:eastAsia="Calibri" w:hAnsi="Calibri"/>
+          <w:b/>
+          <w:bCs/>
+          <w:i/>
+          <w:color w:val="4A5568"/>
+          <w:lang w:val="pt-BR"/>
+        </w:rPr>
+        <w:t>E se a despesa operacional subir 10%</w:t>
+      </w:r>
+      <w:r>
+        <w:rPr>
+          <w:rFonts w:ascii="Calibri" w:eastAsia="Calibri" w:hAnsi="Calibri"/>
+          <w:b/>
+          <w:bCs/>
+          <w:i/>
+          <w:color w:val="4A5568"/>
+          <w:lang w:val="pt-BR"/>
+        </w:rPr>
+        <w:t xml:space="preserve"> em junho de 2026</w:t>
+      </w:r>
+      <w:r>
+        <w:rPr>
+          <w:rFonts w:ascii="Calibri" w:eastAsia="Calibri" w:hAnsi="Calibri"/>
+          <w:b/>
+          <w:bCs/>
+          <w:i/>
+          <w:color w:val="4A5568"/>
+          <w:lang w:val="pt-BR"/>
+        </w:rPr>
+        <w:t>?</w:t>
+      </w:r>
+    </w:p>
+    <w:p>
+      <w:pPr>
+        <w:spacing w:after="0" w:line="360" w:lineRule="auto"/>
+        <w:rPr>
+          <w:rFonts w:ascii="Calibri" w:eastAsia="Calibri" w:hAnsi="Calibri"/>
+          <w:i/>
+          <w:color w:val="4A5568"/>
+          <w:lang w:val="pt-BR"/>
+        </w:rPr>
+      </w:pPr>
+      <w:r>
+        <w:rPr>
+          <w:rFonts w:ascii="Calibri" w:eastAsia="Calibri" w:hAnsi="Calibri"/>
+          <w:i/>
+          <w:color w:val="4A5568"/>
+          <w:lang w:val="pt-BR"/>
+        </w:rPr>
+        <w:t>Nesse caso, o DUAXIS pode simular o cenário e apresentar os possíveis impactos financeiros.</w:t>
+      </w:r>
+    </w:p>
+    <w:p>
+      <w:pPr>
+        <w:spacing w:after="0" w:line="360" w:lineRule="auto"/>
+        <w:rPr>
+          <w:rFonts w:ascii="Calibri" w:eastAsia="Calibri" w:hAnsi="Calibri"/>
+          <w:i/>
+          <w:color w:val="4A5568"/>
+          <w:lang w:val="pt-BR"/>
+        </w:rPr>
+      </w:pPr>
+      <w:r>
+        <w:rPr>
+          <w:rFonts w:ascii="Calibri" w:eastAsia="Calibri" w:hAnsi="Calibri"/>
+          <w:i/>
+          <w:color w:val="4A5568"/>
+          <w:lang w:val="pt-BR"/>
+        </w:rPr>
+        <w:t>Então, a proposta não é apenas facilitar o acesso aos dados.</w:t>
+      </w:r>
+    </w:p>
+    <w:p>
+      <w:pPr>
+        <w:spacing w:after="0" w:line="360" w:lineRule="auto"/>
+        <w:rPr>
+          <w:rFonts w:ascii="Calibri" w:eastAsia="Calibri" w:hAnsi="Calibri"/>
+          <w:b/>
+          <w:bCs/>
+          <w:i/>
+          <w:color w:val="4A5568"/>
+          <w:lang w:val="pt-BR"/>
+        </w:rPr>
+      </w:pPr>
+      <w:r>
+        <w:rPr>
+          <w:rFonts w:ascii="Calibri" w:eastAsia="Calibri" w:hAnsi="Calibri"/>
+          <w:i/>
+          <w:color w:val="4A5568"/>
+          <w:lang w:val="pt-BR"/>
+        </w:rPr>
+        <w:t>É transformar dado espalhado em decisão, com número e contexto.”</w:t>
+      </w:r>
+      <w:r>
+        <w:rPr>
+          <w:rFonts w:ascii="Calibri" w:eastAsia="Calibri" w:hAnsi="Calibri"/>
+          <w:i/>
+          <w:color w:val="4A5568"/>
+          <w:lang w:val="pt-BR"/>
+        </w:rPr>
+        <w:t xml:space="preserve"> </w:t>
+      </w:r>
+    </w:p>
+    <w:p>
+      <w:pPr>
+        <w:spacing w:after="0" w:line="360" w:lineRule="auto"/>
+        <w:rPr>
+          <w:lang w:val="pt-BR"/>
+        </w:rPr>
+      </w:pPr>
+      <w:r>
+        <w:rPr>
+          <w:rFonts w:ascii="Calibri" w:eastAsia="Calibri" w:hAnsi="Calibri"/>
+          <w:i/>
+          <w:color w:val="4A5568"/>
+          <w:lang w:val="pt-BR"/>
+        </w:rPr>
+        <w:t>Transição: “</w:t>
+      </w:r>
+      <w:r>
+        <w:rPr>
+          <w:rFonts w:ascii="Calibri" w:eastAsia="Calibri" w:hAnsi="Calibri"/>
+          <w:i/>
+          <w:color w:val="4A5568"/>
+          <w:lang w:val="pt-BR"/>
+        </w:rPr>
+        <w:t>Mas para que o DUAXIS consiga fazer isso de forma confiável, precisamos entender o que existe por trás dessas respostas.</w:t>
       </w:r>
       <w:r>
         <w:rPr>
@@ -1226,8 +1848,28 @@
           <w:sz w:val="32"/>
           <w:lang w:val="pt-BR"/>
         </w:rPr>
-        <w:lastRenderedPageBreak/>
-        <w:t>Participante 2 — Público + solução</w:t>
+        <w:t>Participante 3 — Dados + tecnologia</w:t>
+      </w:r>
+      <w:r>
+        <w:rPr>
+          <w:rFonts w:ascii="Calibri" w:eastAsia="Calibri" w:hAnsi="Calibri"/>
+          <w:b/>
+          <w:color w:val="1E3A5F"/>
+          <w:sz w:val="32"/>
+          <w:lang w:val="pt-BR"/>
+        </w:rPr>
+        <w:t xml:space="preserve"> - </w:t>
+      </w:r>
+      <w:r>
+        <w:rPr>
+          <w:rFonts w:ascii="Calibri" w:eastAsia="Calibri" w:hAnsi="Calibri"/>
+          <w:b/>
+          <w:color w:val="1E3A5F"/>
+          <w:sz w:val="32"/>
+          <w:highlight w:val="green"/>
+          <w:lang w:val="pt-BR"/>
+        </w:rPr>
+        <w:t>VITORIA</w:t>
       </w:r>
     </w:p>
     <w:p>
@@ -1251,7 +1893,7 @@
           <w:rFonts w:ascii="Calibri" w:eastAsia="Calibri" w:hAnsi="Calibri"/>
           <w:lang w:val="pt-BR"/>
         </w:rPr>
-        <w:t>cerca de 2 minutos</w:t>
+        <w:t>cerca de 1 minuto e 40 segundos</w:t>
       </w:r>
     </w:p>
     <w:p>
@@ -1275,7 +1917,7 @@
           <w:rFonts w:ascii="Calibri" w:eastAsia="Calibri" w:hAnsi="Calibri"/>
           <w:lang w:val="pt-BR"/>
         </w:rPr>
-        <w:t>para quem é + o que o DUAXIS é (e o que não é)</w:t>
+        <w:t>arquitetura em uma frase + o papel de cada peça</w:t>
       </w:r>
     </w:p>
     <w:p>
@@ -1293,43 +1935,114 @@
           <w:sz w:val="26"/>
           <w:lang w:val="pt-BR"/>
         </w:rPr>
-        <w:t>Público:</w:t>
-      </w:r>
-      <w:r>
-        <w:rPr>
-          <w:rFonts w:ascii="Calibri" w:eastAsia="Calibri" w:hAnsi="Calibri"/>
+        <w:t xml:space="preserve">Dados: </w:t>
+      </w:r>
+      <w:r>
+        <w:rPr>
+          <w:rFonts w:ascii="Calibri" w:eastAsia="Calibri" w:hAnsi="Calibri"/>
+          <w:i/>
+          <w:color w:val="4A5568"/>
+          <w:lang w:val="pt-BR"/>
+        </w:rPr>
+        <w:t xml:space="preserve">Para o nosso </w:t>
+      </w:r>
+      <w:r>
+        <w:rPr>
+          <w:rFonts w:ascii="Calibri" w:eastAsia="Calibri" w:hAnsi="Calibri"/>
+          <w:i/>
+          <w:color w:val="4A5568"/>
+          <w:lang w:val="pt-BR"/>
+        </w:rPr>
+        <w:t>MVP</w:t>
+      </w:r>
+      <w:r>
+        <w:rPr>
+          <w:rFonts w:ascii="Calibri" w:eastAsia="Calibri" w:hAnsi="Calibri"/>
+          <w:i/>
+          <w:color w:val="4A5568"/>
+          <w:lang w:val="pt-BR"/>
+        </w:rPr>
+        <w:t xml:space="preserve"> criamos uma empresa fictícia de vareja de roupas,</w:t>
+      </w:r>
+      <w:r>
+        <w:rPr>
+          <w:rFonts w:ascii="Calibri" w:eastAsia="Calibri" w:hAnsi="Calibri"/>
+          <w:i/>
+          <w:color w:val="4A5568"/>
+          <w:lang w:val="pt-BR"/>
+        </w:rPr>
+        <w:t xml:space="preserve"> a </w:t>
+      </w:r>
+      <w:proofErr w:type="spellStart"/>
+      <w:r>
+        <w:rPr>
+          <w:rFonts w:ascii="Calibri" w:eastAsia="Calibri" w:hAnsi="Calibri"/>
+          <w:b/>
+          <w:i/>
+          <w:color w:val="4A5568"/>
+          <w:lang w:val="pt-BR"/>
+        </w:rPr>
+        <w:t>Urban</w:t>
+      </w:r>
+      <w:proofErr w:type="spellEnd"/>
+      <w:r>
+        <w:rPr>
+          <w:rFonts w:ascii="Calibri" w:eastAsia="Calibri" w:hAnsi="Calibri"/>
+          <w:b/>
           <w:i/>
           <w:color w:val="4A5568"/>
           <w:lang w:val="pt-BR"/>
         </w:rPr>
         <w:t xml:space="preserve"> </w:t>
       </w:r>
-      <w:r>
-        <w:rPr>
-          <w:rFonts w:ascii="Calibri" w:eastAsia="Calibri" w:hAnsi="Calibri"/>
-          <w:i/>
-          <w:color w:val="4A5568"/>
-          <w:lang w:val="pt-BR"/>
-        </w:rPr>
-        <w:t xml:space="preserve">O DUAXIS é voltado para pequenas e médias empresas, principalmente aquelas que utilizam mais de um sistema de gestão e </w:t>
-      </w:r>
-      <w:r>
-        <w:rPr>
-          <w:rFonts w:ascii="Calibri" w:eastAsia="Calibri" w:hAnsi="Calibri"/>
-          <w:i/>
-          <w:color w:val="4A5568"/>
-          <w:lang w:val="pt-BR"/>
-        </w:rPr>
-        <w:t>que não</w:t>
-      </w:r>
-      <w:r>
-        <w:rPr>
-          <w:rFonts w:ascii="Calibri" w:eastAsia="Calibri" w:hAnsi="Calibri"/>
-          <w:i/>
-          <w:color w:val="4A5568"/>
-          <w:lang w:val="pt-BR"/>
-        </w:rPr>
-        <w:t xml:space="preserve"> possuem uma equipe especializada em BI ou Ciência de Dados</w:t>
+      <w:proofErr w:type="spellStart"/>
+      <w:r>
+        <w:rPr>
+          <w:rFonts w:ascii="Calibri" w:eastAsia="Calibri" w:hAnsi="Calibri"/>
+          <w:b/>
+          <w:i/>
+          <w:color w:val="4A5568"/>
+          <w:lang w:val="pt-BR"/>
+        </w:rPr>
+        <w:t>Style</w:t>
+      </w:r>
+      <w:proofErr w:type="spellEnd"/>
+      <w:r>
+        <w:rPr>
+          <w:rFonts w:ascii="Calibri" w:eastAsia="Calibri" w:hAnsi="Calibri"/>
+          <w:i/>
+          <w:color w:val="4A5568"/>
+          <w:lang w:val="pt-BR"/>
+        </w:rPr>
+        <w:t xml:space="preserve">, </w:t>
+      </w:r>
+      <w:r>
+        <w:rPr>
+          <w:rFonts w:ascii="Calibri" w:eastAsia="Calibri" w:hAnsi="Calibri"/>
+          <w:i/>
+          <w:color w:val="4A5568"/>
+          <w:lang w:val="pt-BR"/>
+        </w:rPr>
+        <w:t>e simulamos 36 meses de operação,</w:t>
+      </w:r>
+      <w:r>
+        <w:rPr>
+          <w:rFonts w:ascii="Calibri" w:eastAsia="Calibri" w:hAnsi="Calibri"/>
+          <w:i/>
+          <w:color w:val="4A5568"/>
+          <w:lang w:val="pt-BR"/>
+        </w:rPr>
+        <w:t xml:space="preserve"> </w:t>
+      </w:r>
+      <w:r>
+        <w:rPr>
+          <w:rFonts w:ascii="Calibri" w:eastAsia="Calibri" w:hAnsi="Calibri"/>
+          <w:b/>
+          <w:i/>
+          <w:color w:val="4A5568"/>
+          <w:lang w:val="pt-BR"/>
+        </w:rPr>
+        <w:t>de agosto de 2023 a julho de 2026</w:t>
       </w:r>
       <w:r>
         <w:rPr>
@@ -1345,6 +2058,159 @@
       <w:pPr>
         <w:spacing w:after="0" w:line="360" w:lineRule="auto"/>
         <w:rPr>
+          <w:rFonts w:ascii="Calibri" w:eastAsia="Calibri" w:hAnsi="Calibri"/>
+          <w:i/>
+          <w:color w:val="4A5568"/>
+          <w:lang w:val="pt-BR"/>
+        </w:rPr>
+      </w:pPr>
+      <w:r>
+        <w:rPr>
+          <w:rFonts w:ascii="Calibri" w:eastAsia="Calibri" w:hAnsi="Calibri"/>
+          <w:i/>
+          <w:color w:val="4A5568"/>
+          <w:lang w:val="pt-BR"/>
+        </w:rPr>
+        <w:t>Construímos bases representando</w:t>
+      </w:r>
+      <w:r>
+        <w:rPr>
+          <w:rFonts w:ascii="Calibri" w:eastAsia="Calibri" w:hAnsi="Calibri"/>
+          <w:i/>
+          <w:color w:val="4A5568"/>
+          <w:lang w:val="pt-BR"/>
+        </w:rPr>
+        <w:t xml:space="preserve"> </w:t>
+      </w:r>
+      <w:r>
+        <w:rPr>
+          <w:rFonts w:ascii="Calibri" w:eastAsia="Calibri" w:hAnsi="Calibri"/>
+          <w:b/>
+          <w:i/>
+          <w:color w:val="4A5568"/>
+          <w:lang w:val="pt-BR"/>
+        </w:rPr>
+        <w:t>financeiro</w:t>
+      </w:r>
+      <w:r>
+        <w:rPr>
+          <w:rFonts w:ascii="Calibri" w:eastAsia="Calibri" w:hAnsi="Calibri"/>
+          <w:i/>
+          <w:color w:val="4A5568"/>
+          <w:lang w:val="pt-BR"/>
+        </w:rPr>
+        <w:t xml:space="preserve"> e </w:t>
+      </w:r>
+      <w:r>
+        <w:rPr>
+          <w:rFonts w:ascii="Calibri" w:eastAsia="Calibri" w:hAnsi="Calibri"/>
+          <w:b/>
+          <w:i/>
+          <w:color w:val="4A5568"/>
+          <w:lang w:val="pt-BR"/>
+        </w:rPr>
+        <w:t>logística</w:t>
+      </w:r>
+      <w:r>
+        <w:rPr>
+          <w:rFonts w:ascii="Calibri" w:eastAsia="Calibri" w:hAnsi="Calibri"/>
+          <w:i/>
+          <w:color w:val="4A5568"/>
+          <w:lang w:val="pt-BR"/>
+        </w:rPr>
+        <w:t xml:space="preserve">: </w:t>
+      </w:r>
+      <w:r>
+        <w:rPr>
+          <w:rFonts w:ascii="Calibri" w:eastAsia="Calibri" w:hAnsi="Calibri"/>
+          <w:i/>
+          <w:color w:val="4A5568"/>
+          <w:lang w:val="pt-BR"/>
+        </w:rPr>
+        <w:t xml:space="preserve">com dados de </w:t>
+      </w:r>
+      <w:r>
+        <w:rPr>
+          <w:rFonts w:ascii="Calibri" w:eastAsia="Calibri" w:hAnsi="Calibri"/>
+          <w:i/>
+          <w:color w:val="4A5568"/>
+          <w:lang w:val="pt-BR"/>
+        </w:rPr>
+        <w:t>vendas, despesas, caixa, contas a receber</w:t>
+      </w:r>
+      <w:r>
+        <w:rPr>
+          <w:rFonts w:ascii="Calibri" w:eastAsia="Calibri" w:hAnsi="Calibri"/>
+          <w:i/>
+          <w:color w:val="4A5568"/>
+          <w:lang w:val="pt-BR"/>
+        </w:rPr>
+        <w:t xml:space="preserve"> e a </w:t>
+      </w:r>
+      <w:r>
+        <w:rPr>
+          <w:rFonts w:ascii="Calibri" w:eastAsia="Calibri" w:hAnsi="Calibri"/>
+          <w:i/>
+          <w:color w:val="4A5568"/>
+          <w:lang w:val="pt-BR"/>
+        </w:rPr>
+        <w:t>pagar, estoque, compras</w:t>
+      </w:r>
+      <w:r>
+        <w:rPr>
+          <w:rFonts w:ascii="Calibri" w:eastAsia="Calibri" w:hAnsi="Calibri"/>
+          <w:i/>
+          <w:color w:val="4A5568"/>
+          <w:lang w:val="pt-BR"/>
+        </w:rPr>
+        <w:t xml:space="preserve"> e</w:t>
+      </w:r>
+      <w:r>
+        <w:rPr>
+          <w:rFonts w:ascii="Calibri" w:eastAsia="Calibri" w:hAnsi="Calibri"/>
+          <w:i/>
+          <w:color w:val="4A5568"/>
+          <w:lang w:val="pt-BR"/>
+        </w:rPr>
+        <w:t xml:space="preserve"> fornecedores.</w:t>
+      </w:r>
+    </w:p>
+    <w:p>
+      <w:pPr>
+        <w:spacing w:after="0" w:line="360" w:lineRule="auto"/>
+        <w:rPr>
+          <w:rFonts w:ascii="Calibri" w:eastAsia="Calibri" w:hAnsi="Calibri"/>
+          <w:i/>
+          <w:color w:val="4A5568"/>
+          <w:lang w:val="pt-BR"/>
+        </w:rPr>
+      </w:pPr>
+      <w:r>
+        <w:rPr>
+          <w:rFonts w:ascii="Calibri" w:eastAsia="Calibri" w:hAnsi="Calibri"/>
+          <w:i/>
+          <w:color w:val="4A5568"/>
+          <w:lang w:val="pt-BR"/>
+        </w:rPr>
+        <w:t>Esses dados representam diferentes fontes que, em um cenário real, poderiam estar distribuídos entre sistemas diferentes</w:t>
+      </w:r>
+      <w:r>
+        <w:rPr>
+          <w:rFonts w:ascii="Calibri" w:eastAsia="Calibri" w:hAnsi="Calibri"/>
+          <w:i/>
+          <w:color w:val="4A5568"/>
+          <w:lang w:val="pt-BR"/>
+        </w:rPr>
+        <w:t>.</w:t>
+      </w:r>
+    </w:p>
+    <w:p>
+      <w:pPr>
+        <w:spacing w:after="0" w:line="360" w:lineRule="auto"/>
+        <w:rPr>
+          <w:rFonts w:ascii="Calibri" w:eastAsia="Calibri" w:hAnsi="Calibri"/>
+          <w:i/>
+          <w:color w:val="4A5568"/>
           <w:lang w:val="pt-BR"/>
         </w:rPr>
       </w:pPr>
@@ -1356,824 +2222,7 @@
           <w:sz w:val="26"/>
           <w:lang w:val="pt-BR"/>
         </w:rPr>
-        <w:t>Solução:</w:t>
-      </w:r>
-      <w:r>
-        <w:rPr>
-          <w:rFonts w:ascii="Calibri" w:eastAsia="Calibri" w:hAnsi="Calibri"/>
-          <w:i/>
-          <w:color w:val="4A5568"/>
-          <w:lang w:val="pt-BR"/>
-        </w:rPr>
-        <w:t xml:space="preserve"> o DUAXIS </w:t>
-      </w:r>
-      <w:r>
-        <w:rPr>
-          <w:rFonts w:ascii="Calibri" w:eastAsia="Calibri" w:hAnsi="Calibri"/>
-          <w:b/>
-          <w:i/>
-          <w:color w:val="4A5568"/>
-          <w:lang w:val="pt-BR"/>
-        </w:rPr>
-        <w:t>não substitui o ERP</w:t>
-      </w:r>
-      <w:r>
-        <w:rPr>
-          <w:rFonts w:ascii="Calibri" w:eastAsia="Calibri" w:hAnsi="Calibri"/>
-          <w:b/>
-          <w:i/>
-          <w:color w:val="4A5568"/>
-          <w:lang w:val="pt-BR"/>
-        </w:rPr>
-        <w:t>, o CRM, o sistema de RH ou as planilhas</w:t>
-      </w:r>
-      <w:r>
-        <w:rPr>
-          <w:rFonts w:ascii="Calibri" w:eastAsia="Calibri" w:hAnsi="Calibri"/>
-          <w:i/>
-          <w:color w:val="4A5568"/>
-          <w:lang w:val="pt-BR"/>
-        </w:rPr>
-        <w:t xml:space="preserve">. </w:t>
-      </w:r>
-      <w:r>
-        <w:rPr>
-          <w:rFonts w:ascii="Calibri" w:eastAsia="Calibri" w:hAnsi="Calibri"/>
-          <w:i/>
-          <w:color w:val="4A5568"/>
-          <w:lang w:val="pt-BR"/>
-        </w:rPr>
-        <w:t>Ele é</w:t>
-      </w:r>
-      <w:r>
-        <w:rPr>
-          <w:rFonts w:ascii="Calibri" w:eastAsia="Calibri" w:hAnsi="Calibri"/>
-          <w:i/>
-          <w:color w:val="4A5568"/>
-          <w:lang w:val="pt-BR"/>
-        </w:rPr>
-        <w:t xml:space="preserve"> um </w:t>
-      </w:r>
-      <w:r>
-        <w:rPr>
-          <w:rFonts w:ascii="Calibri" w:eastAsia="Calibri" w:hAnsi="Calibri"/>
-          <w:b/>
-          <w:i/>
-          <w:color w:val="4A5568"/>
-          <w:lang w:val="pt-BR"/>
-        </w:rPr>
-        <w:t>copiloto corporativo</w:t>
-      </w:r>
-      <w:r>
-        <w:rPr>
-          <w:rFonts w:ascii="Calibri" w:eastAsia="Calibri" w:hAnsi="Calibri"/>
-          <w:b/>
-          <w:i/>
-          <w:color w:val="4A5568"/>
-          <w:lang w:val="pt-BR"/>
-        </w:rPr>
-        <w:t xml:space="preserve"> </w:t>
-      </w:r>
-      <w:r>
-        <w:rPr>
-          <w:rFonts w:ascii="Calibri" w:eastAsia="Calibri" w:hAnsi="Calibri"/>
-          <w:bCs/>
-          <w:i/>
-          <w:color w:val="4A5568"/>
-          <w:lang w:val="pt-BR"/>
-        </w:rPr>
-        <w:t>que atua</w:t>
-      </w:r>
-      <w:r>
-        <w:rPr>
-          <w:rFonts w:ascii="Calibri" w:eastAsia="Calibri" w:hAnsi="Calibri"/>
-          <w:i/>
-          <w:color w:val="4A5568"/>
-          <w:lang w:val="pt-BR"/>
-        </w:rPr>
-        <w:t xml:space="preserve"> </w:t>
-      </w:r>
-      <w:r>
-        <w:rPr>
-          <w:rFonts w:ascii="Calibri" w:eastAsia="Calibri" w:hAnsi="Calibri"/>
-          <w:i/>
-          <w:color w:val="4A5568"/>
-          <w:lang w:val="pt-BR"/>
-        </w:rPr>
-        <w:t xml:space="preserve">como </w:t>
-      </w:r>
-      <w:r>
-        <w:rPr>
-          <w:rFonts w:ascii="Calibri" w:eastAsia="Calibri" w:hAnsi="Calibri"/>
-          <w:i/>
-          <w:color w:val="4A5568"/>
-          <w:lang w:val="pt-BR"/>
-        </w:rPr>
-        <w:t>uma camada que lê os dados da empresa e devolve resposta com número e explicação</w:t>
-      </w:r>
-      <w:r>
-        <w:rPr>
-          <w:rFonts w:ascii="Calibri" w:eastAsia="Calibri" w:hAnsi="Calibri"/>
-          <w:i/>
-          <w:color w:val="4A5568"/>
-          <w:lang w:val="pt-BR"/>
-        </w:rPr>
-        <w:t>.</w:t>
-      </w:r>
-    </w:p>
-    <w:p>
-      <w:pPr>
-        <w:spacing w:after="0" w:line="360" w:lineRule="auto"/>
-        <w:rPr>
-          <w:lang w:val="pt-BR"/>
-        </w:rPr>
-      </w:pPr>
-      <w:r>
-        <w:rPr>
-          <w:rFonts w:ascii="Calibri" w:eastAsia="Calibri" w:hAnsi="Calibri"/>
-          <w:i/>
-          <w:color w:val="4A5568"/>
-          <w:lang w:val="pt-BR"/>
-        </w:rPr>
-        <w:t xml:space="preserve">E o gestor pode interagir com essas informações utilizando </w:t>
-      </w:r>
-      <w:r>
-        <w:rPr>
-          <w:rFonts w:ascii="Calibri" w:eastAsia="Calibri" w:hAnsi="Calibri"/>
-          <w:b/>
-          <w:bCs/>
-          <w:i/>
-          <w:color w:val="4A5568"/>
-          <w:lang w:val="pt-BR"/>
-        </w:rPr>
-        <w:t>linguagem natural</w:t>
-      </w:r>
-      <w:r>
-        <w:rPr>
-          <w:rFonts w:ascii="Calibri" w:eastAsia="Calibri" w:hAnsi="Calibri"/>
-          <w:i/>
-          <w:color w:val="4A5568"/>
-          <w:lang w:val="pt-BR"/>
-        </w:rPr>
-        <w:t>.</w:t>
-      </w:r>
-    </w:p>
-    <w:p>
-      <w:pPr>
-        <w:spacing w:after="0" w:line="360" w:lineRule="auto"/>
-        <w:rPr>
-          <w:rFonts w:ascii="Calibri" w:eastAsia="Calibri" w:hAnsi="Calibri"/>
-          <w:b/>
-          <w:bCs/>
-          <w:i/>
-          <w:color w:val="4A5568"/>
-          <w:lang w:val="pt-BR"/>
-        </w:rPr>
-      </w:pPr>
-      <w:r>
-        <w:rPr>
-          <w:rFonts w:ascii="Calibri" w:eastAsia="Calibri" w:hAnsi="Calibri"/>
-          <w:i/>
-          <w:color w:val="4A5568"/>
-          <w:lang w:val="pt-BR"/>
-        </w:rPr>
-        <w:t>Por exemplo:</w:t>
-      </w:r>
-      <w:r>
-        <w:rPr>
-          <w:rFonts w:ascii="Calibri" w:eastAsia="Calibri" w:hAnsi="Calibri"/>
-          <w:i/>
-          <w:color w:val="4A5568"/>
-          <w:lang w:val="pt-BR"/>
-        </w:rPr>
-        <w:t xml:space="preserve"> </w:t>
-      </w:r>
-      <w:r>
-        <w:rPr>
-          <w:rFonts w:ascii="Calibri" w:eastAsia="Calibri" w:hAnsi="Calibri"/>
-          <w:b/>
-          <w:bCs/>
-          <w:i/>
-          <w:color w:val="4A5568"/>
-          <w:lang w:val="pt-BR"/>
-        </w:rPr>
-        <w:t>“</w:t>
-      </w:r>
-      <w:r>
-        <w:rPr>
-          <w:rFonts w:ascii="Calibri" w:eastAsia="Calibri" w:hAnsi="Calibri"/>
-          <w:b/>
-          <w:bCs/>
-          <w:i/>
-          <w:color w:val="4A5568"/>
-          <w:lang w:val="pt-BR"/>
-        </w:rPr>
-        <w:t>Por que o lucro caiu em maio de 2026?</w:t>
-      </w:r>
-      <w:r>
-        <w:rPr>
-          <w:rFonts w:ascii="Calibri" w:eastAsia="Calibri" w:hAnsi="Calibri"/>
-          <w:b/>
-          <w:bCs/>
-          <w:i/>
-          <w:color w:val="4A5568"/>
-          <w:lang w:val="pt-BR"/>
-        </w:rPr>
-        <w:t>”</w:t>
-      </w:r>
-    </w:p>
-    <w:p>
-      <w:pPr>
-        <w:spacing w:after="0" w:line="360" w:lineRule="auto"/>
-        <w:rPr>
-          <w:rFonts w:ascii="Calibri" w:eastAsia="Calibri" w:hAnsi="Calibri"/>
-          <w:i/>
-          <w:color w:val="4A5568"/>
-          <w:lang w:val="pt-BR"/>
-        </w:rPr>
-      </w:pPr>
-      <w:r>
-        <w:rPr>
-          <w:rFonts w:ascii="Calibri" w:eastAsia="Calibri" w:hAnsi="Calibri"/>
-          <w:i/>
-          <w:color w:val="4A5568"/>
-          <w:lang w:val="pt-BR"/>
-        </w:rPr>
-        <w:t>O DUAXIS não precisa simplesmente responder que houve uma queda.</w:t>
-      </w:r>
-    </w:p>
-    <w:p>
-      <w:pPr>
-        <w:spacing w:after="0" w:line="360" w:lineRule="auto"/>
-        <w:rPr>
-          <w:rFonts w:ascii="Calibri" w:eastAsia="Calibri" w:hAnsi="Calibri"/>
-          <w:i/>
-          <w:color w:val="4A5568"/>
-          <w:lang w:val="pt-BR"/>
-        </w:rPr>
-      </w:pPr>
-      <w:r>
-        <w:rPr>
-          <w:rFonts w:ascii="Calibri" w:eastAsia="Calibri" w:hAnsi="Calibri"/>
-          <w:i/>
-          <w:color w:val="4A5568"/>
-          <w:lang w:val="pt-BR"/>
-        </w:rPr>
-        <w:t>Ele pode analisar as informações e explicar o que contribuiu para aquele resultado.</w:t>
-      </w:r>
-    </w:p>
-    <w:p>
-      <w:pPr>
-        <w:spacing w:after="0" w:line="360" w:lineRule="auto"/>
-        <w:rPr>
-          <w:rFonts w:ascii="Calibri" w:eastAsia="Calibri" w:hAnsi="Calibri"/>
-          <w:i/>
-          <w:color w:val="4A5568"/>
-          <w:lang w:val="pt-BR"/>
-        </w:rPr>
-      </w:pPr>
-      <w:r>
-        <w:rPr>
-          <w:rFonts w:ascii="Calibri" w:eastAsia="Calibri" w:hAnsi="Calibri"/>
-          <w:i/>
-          <w:color w:val="4A5568"/>
-          <w:lang w:val="pt-BR"/>
-        </w:rPr>
-        <w:t>E o gestor também pode ir além:</w:t>
-      </w:r>
-    </w:p>
-    <w:p>
-      <w:pPr>
-        <w:spacing w:after="0" w:line="360" w:lineRule="auto"/>
-        <w:rPr>
-          <w:rFonts w:ascii="Calibri" w:eastAsia="Calibri" w:hAnsi="Calibri"/>
-          <w:i/>
-          <w:color w:val="4A5568"/>
-          <w:lang w:val="pt-BR"/>
-        </w:rPr>
-      </w:pPr>
-      <w:r>
-        <w:rPr>
-          <w:rFonts w:ascii="Calibri" w:eastAsia="Calibri" w:hAnsi="Calibri"/>
-          <w:i/>
-          <w:color w:val="4A5568"/>
-          <w:lang w:val="pt-BR"/>
-        </w:rPr>
-        <w:t xml:space="preserve">Por exemplo: </w:t>
-      </w:r>
-      <w:r>
-        <w:rPr>
-          <w:rFonts w:ascii="Calibri" w:eastAsia="Calibri" w:hAnsi="Calibri"/>
-          <w:i/>
-          <w:color w:val="4A5568"/>
-          <w:lang w:val="pt-BR"/>
-        </w:rPr>
-        <w:t>E se a despesa operacional subir 10%</w:t>
-      </w:r>
-      <w:r>
-        <w:rPr>
-          <w:rFonts w:ascii="Calibri" w:eastAsia="Calibri" w:hAnsi="Calibri"/>
-          <w:i/>
-          <w:color w:val="4A5568"/>
-          <w:lang w:val="pt-BR"/>
-        </w:rPr>
-        <w:t xml:space="preserve"> em junho de 2026</w:t>
-      </w:r>
-      <w:r>
-        <w:rPr>
-          <w:rFonts w:ascii="Calibri" w:eastAsia="Calibri" w:hAnsi="Calibri"/>
-          <w:i/>
-          <w:color w:val="4A5568"/>
-          <w:lang w:val="pt-BR"/>
-        </w:rPr>
-        <w:t>?</w:t>
-      </w:r>
-    </w:p>
-    <w:p>
-      <w:pPr>
-        <w:spacing w:after="0" w:line="360" w:lineRule="auto"/>
-        <w:rPr>
-          <w:rFonts w:ascii="Calibri" w:eastAsia="Calibri" w:hAnsi="Calibri"/>
-          <w:i/>
-          <w:color w:val="4A5568"/>
-          <w:lang w:val="pt-BR"/>
-        </w:rPr>
-      </w:pPr>
-      <w:r>
-        <w:rPr>
-          <w:rFonts w:ascii="Calibri" w:eastAsia="Calibri" w:hAnsi="Calibri"/>
-          <w:i/>
-          <w:color w:val="4A5568"/>
-          <w:lang w:val="pt-BR"/>
-        </w:rPr>
-        <w:t>Nesse caso, o DUAXIS pode simular o cenário e apresentar os possíveis impactos financeiros.</w:t>
-      </w:r>
-    </w:p>
-    <w:p>
-      <w:pPr>
-        <w:spacing w:after="0" w:line="360" w:lineRule="auto"/>
-        <w:rPr>
-          <w:rFonts w:ascii="Calibri" w:eastAsia="Calibri" w:hAnsi="Calibri"/>
-          <w:i/>
-          <w:color w:val="4A5568"/>
-          <w:lang w:val="pt-BR"/>
-        </w:rPr>
-      </w:pPr>
-      <w:r>
-        <w:rPr>
-          <w:rFonts w:ascii="Calibri" w:eastAsia="Calibri" w:hAnsi="Calibri"/>
-          <w:i/>
-          <w:color w:val="4A5568"/>
-          <w:lang w:val="pt-BR"/>
-        </w:rPr>
-        <w:t>Então, a proposta não é apenas facilitar o acesso aos dados.</w:t>
-      </w:r>
-    </w:p>
-    <w:p>
-      <w:pPr>
-        <w:spacing w:after="0" w:line="360" w:lineRule="auto"/>
-        <w:rPr>
-          <w:rFonts w:ascii="Calibri" w:eastAsia="Calibri" w:hAnsi="Calibri"/>
-          <w:b/>
-          <w:bCs/>
-          <w:i/>
-          <w:color w:val="4A5568"/>
-          <w:lang w:val="pt-BR"/>
-        </w:rPr>
-      </w:pPr>
-      <w:r>
-        <w:rPr>
-          <w:rFonts w:ascii="Calibri" w:eastAsia="Calibri" w:hAnsi="Calibri"/>
-          <w:i/>
-          <w:color w:val="4A5568"/>
-          <w:lang w:val="pt-BR"/>
-        </w:rPr>
-        <w:t>É transformar dado espalhado em decisão, com número e contexto.”</w:t>
-      </w:r>
-      <w:r>
-        <w:rPr>
-          <w:rFonts w:ascii="Calibri" w:eastAsia="Calibri" w:hAnsi="Calibri"/>
-          <w:i/>
-          <w:color w:val="4A5568"/>
-          <w:lang w:val="pt-BR"/>
-        </w:rPr>
-        <w:t xml:space="preserve"> </w:t>
-      </w:r>
-    </w:p>
-    <w:p>
-      <w:pPr>
-        <w:spacing w:after="0" w:line="360" w:lineRule="auto"/>
-        <w:rPr>
-          <w:lang w:val="pt-BR"/>
-        </w:rPr>
-      </w:pPr>
-      <w:r>
-        <w:rPr>
-          <w:rFonts w:ascii="Calibri" w:eastAsia="Calibri" w:hAnsi="Calibri"/>
-          <w:i/>
-          <w:color w:val="4A5568"/>
-          <w:lang w:val="pt-BR"/>
-        </w:rPr>
-        <w:t>Transição: “</w:t>
-      </w:r>
-      <w:r>
-        <w:rPr>
-          <w:rFonts w:ascii="Calibri" w:eastAsia="Calibri" w:hAnsi="Calibri"/>
-          <w:i/>
-          <w:color w:val="4A5568"/>
-          <w:lang w:val="pt-BR"/>
-        </w:rPr>
-        <w:t>Mas para que o DUAXIS consiga fazer isso de forma confiável, precisamos entender o que existe por trás dessas respostas.</w:t>
-      </w:r>
-      <w:r>
-        <w:rPr>
-          <w:rFonts w:ascii="Calibri" w:eastAsia="Calibri" w:hAnsi="Calibri"/>
-          <w:i/>
-          <w:color w:val="4A5568"/>
-          <w:lang w:val="pt-BR"/>
-        </w:rPr>
-        <w:t>”</w:t>
-      </w:r>
-    </w:p>
-    <w:p>
-      <w:pPr>
-        <w:spacing w:before="320" w:after="0" w:line="360" w:lineRule="auto"/>
-        <w:rPr>
-          <w:lang w:val="pt-BR"/>
-        </w:rPr>
-      </w:pPr>
-      <w:r>
-        <w:rPr>
-          <w:rFonts w:ascii="Calibri" w:eastAsia="Calibri" w:hAnsi="Calibri"/>
-          <w:b/>
-          <w:color w:val="1E3A5F"/>
-          <w:sz w:val="32"/>
-          <w:lang w:val="pt-BR"/>
-        </w:rPr>
-        <w:t>Participante 3 — Dados + tecnologia</w:t>
-      </w:r>
-    </w:p>
-    <w:p>
-      <w:pPr>
-        <w:spacing w:after="0" w:line="360" w:lineRule="auto"/>
-        <w:rPr>
-          <w:lang w:val="pt-BR"/>
-        </w:rPr>
-      </w:pPr>
-      <w:r>
-        <w:rPr>
-          <w:rFonts w:ascii="Calibri" w:eastAsia="Calibri" w:hAnsi="Calibri"/>
-          <w:b/>
-          <w:color w:val="1E3A5F"/>
-          <w:lang w:val="pt-BR"/>
-        </w:rPr>
-        <w:t xml:space="preserve">Tempo: </w:t>
-      </w:r>
-      <w:r>
-        <w:rPr>
-          <w:rFonts w:ascii="Calibri" w:eastAsia="Calibri" w:hAnsi="Calibri"/>
-          <w:lang w:val="pt-BR"/>
-        </w:rPr>
-        <w:t>cerca de 1 minuto e 40 segundos</w:t>
-      </w:r>
-    </w:p>
-    <w:p>
-      <w:pPr>
-        <w:spacing w:after="0" w:line="360" w:lineRule="auto"/>
-        <w:rPr>
-          <w:lang w:val="pt-BR"/>
-        </w:rPr>
-      </w:pPr>
-      <w:r>
-        <w:rPr>
-          <w:rFonts w:ascii="Calibri" w:eastAsia="Calibri" w:hAnsi="Calibri"/>
-          <w:b/>
-          <w:color w:val="1E3A5F"/>
-          <w:lang w:val="pt-BR"/>
-        </w:rPr>
-        <w:t xml:space="preserve">Slides: </w:t>
-      </w:r>
-      <w:r>
-        <w:rPr>
-          <w:rFonts w:ascii="Calibri" w:eastAsia="Calibri" w:hAnsi="Calibri"/>
-          <w:lang w:val="pt-BR"/>
-        </w:rPr>
-        <w:t>arquitetura em uma frase + o papel de cada peça</w:t>
-      </w:r>
-    </w:p>
-    <w:p>
-      <w:pPr>
-        <w:spacing w:before="240" w:after="0" w:line="360" w:lineRule="auto"/>
-        <w:rPr>
-          <w:lang w:val="pt-BR"/>
-        </w:rPr>
-      </w:pPr>
-      <w:r>
-        <w:rPr>
-          <w:rFonts w:ascii="Calibri" w:eastAsia="Calibri" w:hAnsi="Calibri"/>
-          <w:b/>
-          <w:color w:val="1E3A5F"/>
-          <w:sz w:val="26"/>
-          <w:lang w:val="pt-BR"/>
-        </w:rPr>
-        <w:t xml:space="preserve">Dados: </w:t>
-      </w:r>
-      <w:r>
-        <w:rPr>
-          <w:rFonts w:ascii="Calibri" w:eastAsia="Calibri" w:hAnsi="Calibri"/>
-          <w:i/>
-          <w:color w:val="4A5568"/>
-          <w:lang w:val="pt-BR"/>
-        </w:rPr>
-        <w:t xml:space="preserve">Para o nosso </w:t>
-      </w:r>
-      <w:r>
-        <w:rPr>
-          <w:rFonts w:ascii="Calibri" w:eastAsia="Calibri" w:hAnsi="Calibri"/>
-          <w:i/>
-          <w:color w:val="4A5568"/>
-          <w:lang w:val="pt-BR"/>
-        </w:rPr>
-        <w:t>MVP</w:t>
-      </w:r>
-      <w:r>
-        <w:rPr>
-          <w:rFonts w:ascii="Calibri" w:eastAsia="Calibri" w:hAnsi="Calibri"/>
-          <w:i/>
-          <w:color w:val="4A5568"/>
-          <w:lang w:val="pt-BR"/>
-        </w:rPr>
-        <w:t xml:space="preserve"> criamos uma empresa fictícia de vareja de roupas,</w:t>
-      </w:r>
-      <w:r>
-        <w:rPr>
-          <w:rFonts w:ascii="Calibri" w:eastAsia="Calibri" w:hAnsi="Calibri"/>
-          <w:i/>
-          <w:color w:val="4A5568"/>
-          <w:lang w:val="pt-BR"/>
-        </w:rPr>
-        <w:t xml:space="preserve"> a </w:t>
-      </w:r>
-      <w:proofErr w:type="spellStart"/>
-      <w:r>
-        <w:rPr>
-          <w:rFonts w:ascii="Calibri" w:eastAsia="Calibri" w:hAnsi="Calibri"/>
-          <w:b/>
-          <w:i/>
-          <w:color w:val="4A5568"/>
-          <w:lang w:val="pt-BR"/>
-        </w:rPr>
-        <w:t>Urban</w:t>
-      </w:r>
-      <w:proofErr w:type="spellEnd"/>
-      <w:r>
-        <w:rPr>
-          <w:rFonts w:ascii="Calibri" w:eastAsia="Calibri" w:hAnsi="Calibri"/>
-          <w:b/>
-          <w:i/>
-          <w:color w:val="4A5568"/>
-          <w:lang w:val="pt-BR"/>
-        </w:rPr>
-        <w:t xml:space="preserve"> </w:t>
-      </w:r>
-      <w:proofErr w:type="spellStart"/>
-      <w:r>
-        <w:rPr>
-          <w:rFonts w:ascii="Calibri" w:eastAsia="Calibri" w:hAnsi="Calibri"/>
-          <w:b/>
-          <w:i/>
-          <w:color w:val="4A5568"/>
-          <w:lang w:val="pt-BR"/>
-        </w:rPr>
-        <w:t>Style</w:t>
-      </w:r>
-      <w:proofErr w:type="spellEnd"/>
-      <w:r>
-        <w:rPr>
-          <w:rFonts w:ascii="Calibri" w:eastAsia="Calibri" w:hAnsi="Calibri"/>
-          <w:i/>
-          <w:color w:val="4A5568"/>
-          <w:lang w:val="pt-BR"/>
-        </w:rPr>
-        <w:t xml:space="preserve">, </w:t>
-      </w:r>
-      <w:r>
-        <w:rPr>
-          <w:rFonts w:ascii="Calibri" w:eastAsia="Calibri" w:hAnsi="Calibri"/>
-          <w:i/>
-          <w:color w:val="4A5568"/>
-          <w:lang w:val="pt-BR"/>
-        </w:rPr>
-        <w:t>e simulamos 36 meses de operação,</w:t>
-      </w:r>
-      <w:r>
-        <w:rPr>
-          <w:rFonts w:ascii="Calibri" w:eastAsia="Calibri" w:hAnsi="Calibri"/>
-          <w:i/>
-          <w:color w:val="4A5568"/>
-          <w:lang w:val="pt-BR"/>
-        </w:rPr>
-        <w:t xml:space="preserve"> </w:t>
-      </w:r>
-      <w:r>
-        <w:rPr>
-          <w:rFonts w:ascii="Calibri" w:eastAsia="Calibri" w:hAnsi="Calibri"/>
-          <w:b/>
-          <w:i/>
-          <w:color w:val="4A5568"/>
-          <w:lang w:val="pt-BR"/>
-        </w:rPr>
-        <w:t>de agosto de 2023 a julho de 2026</w:t>
-      </w:r>
-      <w:r>
-        <w:rPr>
-          <w:rFonts w:ascii="Calibri" w:eastAsia="Calibri" w:hAnsi="Calibri"/>
-          <w:i/>
-          <w:color w:val="4A5568"/>
-          <w:lang w:val="pt-BR"/>
-        </w:rPr>
-        <w:t>.</w:t>
-      </w:r>
-    </w:p>
-    <w:p>
-      <w:pPr>
-        <w:spacing w:after="0" w:line="360" w:lineRule="auto"/>
-        <w:rPr>
-          <w:rFonts w:ascii="Calibri" w:eastAsia="Calibri" w:hAnsi="Calibri"/>
-          <w:i/>
-          <w:color w:val="4A5568"/>
-          <w:lang w:val="pt-BR"/>
-        </w:rPr>
-      </w:pPr>
-      <w:r>
-        <w:rPr>
-          <w:rFonts w:ascii="Calibri" w:eastAsia="Calibri" w:hAnsi="Calibri"/>
-          <w:i/>
-          <w:color w:val="4A5568"/>
-          <w:lang w:val="pt-BR"/>
-        </w:rPr>
-        <w:t>Construímos bases representando</w:t>
-      </w:r>
-      <w:r>
-        <w:rPr>
-          <w:rFonts w:ascii="Calibri" w:eastAsia="Calibri" w:hAnsi="Calibri"/>
-          <w:i/>
-          <w:color w:val="4A5568"/>
-          <w:lang w:val="pt-BR"/>
-        </w:rPr>
-        <w:t xml:space="preserve"> </w:t>
-      </w:r>
-      <w:r>
-        <w:rPr>
-          <w:rFonts w:ascii="Calibri" w:eastAsia="Calibri" w:hAnsi="Calibri"/>
-          <w:b/>
-          <w:i/>
-          <w:color w:val="4A5568"/>
-          <w:lang w:val="pt-BR"/>
-        </w:rPr>
-        <w:t>financeiro</w:t>
-      </w:r>
-      <w:r>
-        <w:rPr>
-          <w:rFonts w:ascii="Calibri" w:eastAsia="Calibri" w:hAnsi="Calibri"/>
-          <w:i/>
-          <w:color w:val="4A5568"/>
-          <w:lang w:val="pt-BR"/>
-        </w:rPr>
-        <w:t xml:space="preserve"> e </w:t>
-      </w:r>
-      <w:r>
-        <w:rPr>
-          <w:rFonts w:ascii="Calibri" w:eastAsia="Calibri" w:hAnsi="Calibri"/>
-          <w:b/>
-          <w:i/>
-          <w:color w:val="4A5568"/>
-          <w:lang w:val="pt-BR"/>
-        </w:rPr>
-        <w:t>logística</w:t>
-      </w:r>
-      <w:r>
-        <w:rPr>
-          <w:rFonts w:ascii="Calibri" w:eastAsia="Calibri" w:hAnsi="Calibri"/>
-          <w:i/>
-          <w:color w:val="4A5568"/>
-          <w:lang w:val="pt-BR"/>
-        </w:rPr>
-        <w:t xml:space="preserve">: </w:t>
-      </w:r>
-      <w:r>
-        <w:rPr>
-          <w:rFonts w:ascii="Calibri" w:eastAsia="Calibri" w:hAnsi="Calibri"/>
-          <w:i/>
-          <w:color w:val="4A5568"/>
-          <w:lang w:val="pt-BR"/>
-        </w:rPr>
-        <w:t xml:space="preserve">com dados de </w:t>
-      </w:r>
-      <w:r>
-        <w:rPr>
-          <w:rFonts w:ascii="Calibri" w:eastAsia="Calibri" w:hAnsi="Calibri"/>
-          <w:i/>
-          <w:color w:val="4A5568"/>
-          <w:lang w:val="pt-BR"/>
-        </w:rPr>
-        <w:t>vendas, despesas, caixa, contas a receber</w:t>
-      </w:r>
-      <w:r>
-        <w:rPr>
-          <w:rFonts w:ascii="Calibri" w:eastAsia="Calibri" w:hAnsi="Calibri"/>
-          <w:i/>
-          <w:color w:val="4A5568"/>
-          <w:lang w:val="pt-BR"/>
-        </w:rPr>
-        <w:t xml:space="preserve"> e a </w:t>
-      </w:r>
-      <w:r>
-        <w:rPr>
-          <w:rFonts w:ascii="Calibri" w:eastAsia="Calibri" w:hAnsi="Calibri"/>
-          <w:i/>
-          <w:color w:val="4A5568"/>
-          <w:lang w:val="pt-BR"/>
-        </w:rPr>
-        <w:t>pagar, estoque, compras</w:t>
-      </w:r>
-      <w:r>
-        <w:rPr>
-          <w:rFonts w:ascii="Calibri" w:eastAsia="Calibri" w:hAnsi="Calibri"/>
-          <w:i/>
-          <w:color w:val="4A5568"/>
-          <w:lang w:val="pt-BR"/>
-        </w:rPr>
-        <w:t xml:space="preserve"> e</w:t>
-      </w:r>
-      <w:r>
-        <w:rPr>
-          <w:rFonts w:ascii="Calibri" w:eastAsia="Calibri" w:hAnsi="Calibri"/>
-          <w:i/>
-          <w:color w:val="4A5568"/>
-          <w:lang w:val="pt-BR"/>
-        </w:rPr>
-        <w:t xml:space="preserve"> fornecedores.</w:t>
-      </w:r>
-    </w:p>
-    <w:p>
-      <w:pPr>
-        <w:spacing w:after="0" w:line="360" w:lineRule="auto"/>
-        <w:rPr>
-          <w:rFonts w:ascii="Calibri" w:eastAsia="Calibri" w:hAnsi="Calibri"/>
-          <w:i/>
-          <w:color w:val="4A5568"/>
-          <w:lang w:val="pt-BR"/>
-        </w:rPr>
-      </w:pPr>
-      <w:r>
-        <w:rPr>
-          <w:rFonts w:ascii="Calibri" w:eastAsia="Calibri" w:hAnsi="Calibri"/>
-          <w:i/>
-          <w:color w:val="4A5568"/>
-          <w:lang w:val="pt-BR"/>
-        </w:rPr>
-        <w:t>Esses dados representam diferentes fontes que, em um cenário real, poderiam estar distribuídos entre sistemas diferentes</w:t>
-      </w:r>
-      <w:r>
-        <w:rPr>
-          <w:rFonts w:ascii="Calibri" w:eastAsia="Calibri" w:hAnsi="Calibri"/>
-          <w:i/>
-          <w:color w:val="4A5568"/>
-          <w:lang w:val="pt-BR"/>
-        </w:rPr>
-        <w:t>.</w:t>
-      </w:r>
-    </w:p>
-    <w:p>
-      <w:pPr>
-        <w:spacing w:after="0" w:line="360" w:lineRule="auto"/>
-        <w:rPr>
-          <w:rFonts w:ascii="Calibri" w:eastAsia="Calibri" w:hAnsi="Calibri"/>
-          <w:i/>
-          <w:color w:val="4A5568"/>
-          <w:lang w:val="pt-BR"/>
-        </w:rPr>
-      </w:pPr>
-      <w:r>
-        <w:rPr>
-          <w:rFonts w:ascii="Calibri" w:eastAsia="Calibri" w:hAnsi="Calibri"/>
-          <w:b/>
-          <w:color w:val="1E3A5F"/>
-          <w:sz w:val="26"/>
-          <w:lang w:val="pt-BR"/>
-        </w:rPr>
-        <w:t>Tecnologia</w:t>
-      </w:r>
-      <w:r>
-        <w:rPr>
-          <w:rFonts w:ascii="Calibri" w:eastAsia="Calibri" w:hAnsi="Calibri"/>
-          <w:b/>
-          <w:color w:val="1E3A5F"/>
-          <w:sz w:val="26"/>
-          <w:lang w:val="pt-BR"/>
-        </w:rPr>
-        <w:t xml:space="preserve">: </w:t>
+        <w:t xml:space="preserve">Tecnologia: </w:t>
       </w:r>
       <w:r>
         <w:rPr>
@@ -2627,6 +2676,27 @@
         </w:rPr>
         <w:t>Participante 4 — Demonstração + diferencial</w:t>
       </w:r>
+      <w:r>
+        <w:rPr>
+          <w:rFonts w:ascii="Calibri" w:eastAsia="Calibri" w:hAnsi="Calibri"/>
+          <w:b/>
+          <w:color w:val="1E3A5F"/>
+          <w:sz w:val="32"/>
+          <w:lang w:val="pt-BR"/>
+        </w:rPr>
+        <w:t xml:space="preserve"> - </w:t>
+      </w:r>
+      <w:r>
+        <w:rPr>
+          <w:rFonts w:ascii="Calibri" w:eastAsia="Calibri" w:hAnsi="Calibri"/>
+          <w:b/>
+          <w:color w:val="1E3A5F"/>
+          <w:sz w:val="32"/>
+          <w:highlight w:val="green"/>
+          <w:lang w:val="pt-BR"/>
+        </w:rPr>
+        <w:t>ESTHER</w:t>
+      </w:r>
     </w:p>
     <w:p>
       <w:pPr>
@@ -2703,26 +2773,6 @@
         <w:spacing w:after="0" w:line="360" w:lineRule="auto"/>
         <w:rPr>
           <w:rFonts w:ascii="Calibri" w:eastAsia="Calibri" w:hAnsi="Calibri"/>
-          <w:bCs/>
-          <w:color w:val="1E3A5F"/>
-          <w:lang w:val="pt-BR"/>
-        </w:rPr>
-      </w:pPr>
-      <w:r>
-        <w:rPr>
-          <w:rFonts w:ascii="Calibri" w:eastAsia="Calibri" w:hAnsi="Calibri"/>
-          <w:bCs/>
-          <w:color w:val="1E3A5F"/>
-          <w:lang w:val="pt-BR"/>
-        </w:rPr>
-        <w:t>Fala em itálico. Entre colchetes = o que fazer com o mouse.</w:t>
-      </w:r>
-    </w:p>
-    <w:p>
-      <w:pPr>
-        <w:spacing w:after="0" w:line="360" w:lineRule="auto"/>
-        <w:rPr>
-          <w:rFonts w:ascii="Calibri" w:eastAsia="Calibri" w:hAnsi="Calibri"/>
           <w:b/>
           <w:bCs/>
           <w:color w:val="1E3A5F"/>
@@ -2885,7 +2935,6 @@
           <w:color w:val="1E3A5F"/>
           <w:lang w:val="pt-BR"/>
         </w:rPr>
-        <w:lastRenderedPageBreak/>
         <w:t>[clicar Fontes de Dados no menu]</w:t>
       </w:r>
     </w:p>
@@ -2908,6 +2957,7 @@
           <w:color w:val="1E3A5F"/>
           <w:lang w:val="pt-BR"/>
         </w:rPr>
+        <w:lastRenderedPageBreak/>
         <w:t xml:space="preserve">Aqui o gestor </w:t>
       </w:r>
       <w:proofErr w:type="spellStart"/>
@@ -3401,7 +3451,7 @@
           <w:color w:val="1E3A5F"/>
           <w:lang w:val="pt-BR"/>
         </w:rPr>
-        <w:t xml:space="preserve"> olhamos para frente: o modelo estima demanda para sugerir reposição. É previsão, não o faturamento de junho.</w:t>
+        <w:t xml:space="preserve"> olhamos para frente: o modelo estima demanda para sugerir reposição. É previsão, não o faturamento.</w:t>
       </w:r>
       <w:r>
         <w:rPr>
@@ -3659,7 +3709,6 @@
           <w:color w:val="4A5568"/>
           <w:lang w:val="pt-BR"/>
         </w:rPr>
-        <w:lastRenderedPageBreak/>
         <w:t>explicar acontecimentos;</w:t>
       </w:r>
     </w:p>
@@ -3685,6 +3734,7 @@
           <w:color w:val="4A5568"/>
           <w:lang w:val="pt-BR"/>
         </w:rPr>
+        <w:lastRenderedPageBreak/>
         <w:t>analisar causas;</w:t>
       </w:r>
     </w:p>
@@ -3815,6 +3865,27 @@
         </w:rPr>
         <w:t>Participante 5 — Próximos passos + fechamento</w:t>
       </w:r>
+      <w:r>
+        <w:rPr>
+          <w:rFonts w:ascii="Calibri" w:eastAsia="Calibri" w:hAnsi="Calibri"/>
+          <w:b/>
+          <w:color w:val="1E3A5F"/>
+          <w:sz w:val="32"/>
+          <w:lang w:val="pt-BR"/>
+        </w:rPr>
+        <w:t xml:space="preserve"> - </w:t>
+      </w:r>
+      <w:r>
+        <w:rPr>
+          <w:rFonts w:ascii="Calibri" w:eastAsia="Calibri" w:hAnsi="Calibri"/>
+          <w:b/>
+          <w:color w:val="1E3A5F"/>
+          <w:sz w:val="32"/>
+          <w:highlight w:val="green"/>
+          <w:lang w:val="pt-BR"/>
+        </w:rPr>
+        <w:t>GUILHERME</w:t>
+      </w:r>
     </w:p>
     <w:p>
       <w:pPr>
@@ -4063,17 +4134,7 @@
           <w:sz w:val="26"/>
           <w:lang w:val="pt-BR"/>
         </w:rPr>
-        <w:t>Fechamento</w:t>
-      </w:r>
-      <w:r>
-        <w:rPr>
-          <w:rFonts w:ascii="Calibri" w:eastAsia="Calibri" w:hAnsi="Calibri"/>
-          <w:b/>
-          <w:color w:val="1E3A5F"/>
-          <w:sz w:val="26"/>
-          <w:lang w:val="pt-BR"/>
-        </w:rPr>
-        <w:t xml:space="preserve">: </w:t>
+        <w:t xml:space="preserve">Fechamento: </w:t>
       </w:r>
       <w:r>
         <w:rPr>
@@ -4448,7 +4509,6 @@
                 <w:color w:val="4A5568"/>
                 <w:lang w:val="pt-BR"/>
               </w:rPr>
-              <w:lastRenderedPageBreak/>
               <w:t>Relatórios para interpretar</w:t>
             </w:r>
           </w:p>
@@ -4501,6 +4561,7 @@
                 <w:color w:val="4A5568"/>
                 <w:lang w:val="pt-BR"/>
               </w:rPr>
+              <w:lastRenderedPageBreak/>
               <w:t>Simulações manuais</w:t>
             </w:r>
           </w:p>

</xml_diff>